<commit_message>
Updating cover letter: in progress
</commit_message>
<xml_diff>
--- a/drafts/paRsynth_coverletter.docx
+++ b/drafts/paRsynth_coverletter.docx
@@ -2,61 +2,107 @@
 <file path=word/document.xml><?xml version="1.0" encoding="utf-8"?>
 <w:document xmlns:wpc="http://schemas.microsoft.com/office/word/2010/wordprocessingCanvas" xmlns:cx="http://schemas.microsoft.com/office/drawing/2014/chartex" xmlns:cx1="http://schemas.microsoft.com/office/drawing/2015/9/8/chartex" xmlns:cx2="http://schemas.microsoft.com/office/drawing/2015/10/21/chartex" xmlns:cx3="http://schemas.microsoft.com/office/drawing/2016/5/9/chartex" xmlns:cx4="http://schemas.microsoft.com/office/drawing/2016/5/10/chartex" xmlns:cx5="http://schemas.microsoft.com/office/drawing/2016/5/11/chartex" xmlns:cx6="http://schemas.microsoft.com/office/drawing/2016/5/12/chartex" xmlns:cx7="http://schemas.microsoft.com/office/drawing/2016/5/13/chartex" xmlns:cx8="http://schemas.microsoft.com/office/drawing/2016/5/14/chartex" xmlns:mc="http://schemas.openxmlformats.org/markup-compatibility/2006" xmlns:aink="http://schemas.microsoft.com/office/drawing/2016/ink" xmlns:am3d="http://schemas.microsoft.com/office/drawing/2017/model3d" xmlns:o="urn:schemas-microsoft-com:office:office" xmlns:oel="http://schemas.microsoft.com/office/2019/extlst" xmlns:r="http://schemas.openxmlformats.org/officeDocument/2006/relationships" xmlns:m="http://schemas.openxmlformats.org/officeDocument/2006/math" xmlns:v="urn:schemas-microsoft-com:vml" xmlns:wp14="http://schemas.microsoft.com/office/word/2010/wordprocessingDrawing" xmlns:wp="http://schemas.openxmlformats.org/drawingml/2006/wordprocessingDrawing" xmlns:w10="urn:schemas-microsoft-com:office:word" xmlns:w="http://schemas.openxmlformats.org/wordprocessingml/2006/main" xmlns:w14="http://schemas.microsoft.com/office/word/2010/wordml" xmlns:w15="http://schemas.microsoft.com/office/word/2012/wordml" xmlns:w16cex="http://schemas.microsoft.com/office/word/2018/wordml/cex" xmlns:w16cid="http://schemas.microsoft.com/office/word/2016/wordml/cid" xmlns:w16="http://schemas.microsoft.com/office/word/2018/wordml" xmlns:w16du="http://schemas.microsoft.com/office/word/2023/wordml/word16du" xmlns:w16sdtdh="http://schemas.microsoft.com/office/word/2020/wordml/sdtdatahash" xmlns:w16sdtfl="http://schemas.microsoft.com/office/word/2024/wordml/sdtformatlock" xmlns:w16se="http://schemas.microsoft.com/office/word/2015/wordml/symex" xmlns:wpg="http://schemas.microsoft.com/office/word/2010/wordprocessingGroup" xmlns:wpi="http://schemas.microsoft.com/office/word/2010/wordprocessingInk" xmlns:wne="http://schemas.microsoft.com/office/word/2006/wordml" xmlns:wps="http://schemas.microsoft.com/office/word/2010/wordprocessingShape" mc:Ignorable="w14 w15 w16se w16cid w16 w16cex w16sdtdh w16sdtfl w16du wp14">
   <w:body>
-    <w:p/>
-    <w:p>
-      <w:pPr>
-        <w:rPr>
-          <w:rFonts w:ascii="Times New Roman" w:hAnsi="Times New Roman" w:cs="Times New Roman"/>
-          <w:sz w:val="24"/>
-          <w:szCs w:val="24"/>
-        </w:rPr>
-      </w:pPr>
-      <w:r>
-        <w:rPr>
-          <w:rFonts w:ascii="Times New Roman" w:hAnsi="Times New Roman" w:cs="Times New Roman"/>
-          <w:sz w:val="24"/>
-          <w:szCs w:val="24"/>
-        </w:rPr>
-        <w:t>28 July 2025 TKTK</w:t>
-      </w:r>
-    </w:p>
-    <w:p>
-      <w:pPr>
-        <w:rPr>
-          <w:rFonts w:ascii="Times New Roman" w:hAnsi="Times New Roman" w:cs="Times New Roman"/>
-          <w:sz w:val="24"/>
-          <w:szCs w:val="24"/>
-        </w:rPr>
-      </w:pPr>
-    </w:p>
-    <w:p>
-      <w:pPr>
-        <w:rPr>
-          <w:rFonts w:ascii="Times New Roman" w:hAnsi="Times New Roman" w:cs="Times New Roman"/>
-          <w:sz w:val="24"/>
-          <w:szCs w:val="24"/>
-        </w:rPr>
-      </w:pPr>
-      <w:r>
-        <w:rPr>
-          <w:rFonts w:ascii="Times New Roman" w:hAnsi="Times New Roman" w:cs="Times New Roman"/>
-          <w:sz w:val="24"/>
-          <w:szCs w:val="24"/>
-        </w:rPr>
-        <w:t xml:space="preserve">Dear XXX, </w:t>
-      </w:r>
-    </w:p>
-    <w:p>
-      <w:pPr>
-        <w:rPr>
-          <w:rFonts w:ascii="Times New Roman" w:hAnsi="Times New Roman" w:cs="Times New Roman"/>
-          <w:sz w:val="24"/>
-          <w:szCs w:val="24"/>
-        </w:rPr>
-      </w:pPr>
-      <w:r>
-        <w:rPr>
-          <w:rFonts w:ascii="Times New Roman" w:hAnsi="Times New Roman" w:cs="Times New Roman"/>
+    <w:p>
+      <w:pPr>
+        <w:rPr>
+          <w:rFonts w:ascii="Arial" w:hAnsi="Arial"/>
+        </w:rPr>
+      </w:pPr>
+    </w:p>
+    <w:p>
+      <w:pPr>
+        <w:rPr>
+          <w:rFonts w:ascii="Arial" w:hAnsi="Arial"/>
+          <w:sz w:val="24"/>
+          <w:szCs w:val="24"/>
+        </w:rPr>
+      </w:pPr>
+      <w:r>
+        <w:rPr>
+          <w:rFonts w:ascii="Arial" w:hAnsi="Arial"/>
+          <w:sz w:val="24"/>
+          <w:szCs w:val="24"/>
+        </w:rPr>
+        <w:t>14</w:t>
+      </w:r>
+      <w:r>
+        <w:rPr>
+          <w:rFonts w:ascii="Arial" w:hAnsi="Arial"/>
+          <w:sz w:val="24"/>
+          <w:szCs w:val="24"/>
+        </w:rPr>
+        <w:t xml:space="preserve"> </w:t>
+      </w:r>
+      <w:r>
+        <w:rPr>
+          <w:rFonts w:ascii="Arial" w:hAnsi="Arial"/>
+          <w:sz w:val="24"/>
+          <w:szCs w:val="24"/>
+        </w:rPr>
+        <w:t>August</w:t>
+      </w:r>
+      <w:r>
+        <w:rPr>
+          <w:rFonts w:ascii="Arial" w:hAnsi="Arial"/>
+          <w:sz w:val="24"/>
+          <w:szCs w:val="24"/>
+        </w:rPr>
+        <w:t xml:space="preserve"> 2025</w:t>
+      </w:r>
+    </w:p>
+    <w:p>
+      <w:pPr>
+        <w:rPr>
+          <w:rFonts w:ascii="Arial" w:hAnsi="Arial"/>
+          <w:sz w:val="24"/>
+          <w:szCs w:val="24"/>
+        </w:rPr>
+      </w:pPr>
+    </w:p>
+    <w:p>
+      <w:pPr>
+        <w:rPr>
+          <w:rFonts w:ascii="Arial" w:hAnsi="Arial"/>
+          <w:sz w:val="24"/>
+          <w:szCs w:val="24"/>
+        </w:rPr>
+      </w:pPr>
+      <w:r>
+        <w:rPr>
+          <w:rFonts w:ascii="Arial" w:hAnsi="Arial"/>
+          <w:sz w:val="24"/>
+          <w:szCs w:val="24"/>
+        </w:rPr>
+        <w:t xml:space="preserve">Dear </w:t>
+      </w:r>
+      <w:r>
+        <w:rPr>
+          <w:rFonts w:ascii="Arial" w:hAnsi="Arial"/>
+          <w:sz w:val="24"/>
+          <w:szCs w:val="24"/>
+        </w:rPr>
+        <w:t>Drs. Mac Gabhann and Pitzer</w:t>
+      </w:r>
+      <w:r>
+        <w:rPr>
+          <w:rFonts w:ascii="Arial" w:hAnsi="Arial"/>
+          <w:sz w:val="24"/>
+          <w:szCs w:val="24"/>
+        </w:rPr>
+        <w:t xml:space="preserve">, </w:t>
+      </w:r>
+    </w:p>
+    <w:p>
+      <w:pPr>
+        <w:rPr>
+          <w:rFonts w:ascii="Arial" w:hAnsi="Arial"/>
+          <w:sz w:val="24"/>
+          <w:szCs w:val="24"/>
+        </w:rPr>
+      </w:pPr>
+      <w:r>
+        <w:rPr>
+          <w:rFonts w:ascii="Arial" w:hAnsi="Arial"/>
           <w:sz w:val="24"/>
           <w:szCs w:val="24"/>
         </w:rPr>
@@ -64,41 +110,39 @@
       </w:r>
       <w:r>
         <w:rPr>
-          <w:rFonts w:ascii="Times New Roman" w:hAnsi="Times New Roman" w:cs="Times New Roman"/>
-          <w:sz w:val="24"/>
-          <w:szCs w:val="24"/>
-        </w:rPr>
-        <w:t xml:space="preserve">Synthetic frequency-modulated </w:t>
-      </w:r>
-      <w:proofErr w:type="spellStart"/>
-      <w:r>
-        <w:rPr>
-          <w:rFonts w:ascii="Times New Roman" w:hAnsi="Times New Roman" w:cs="Times New Roman"/>
-          <w:sz w:val="24"/>
-          <w:szCs w:val="24"/>
-        </w:rPr>
-        <w:t>voclizations</w:t>
-      </w:r>
-      <w:proofErr w:type="spellEnd"/>
-      <w:r>
-        <w:rPr>
-          <w:rFonts w:ascii="Times New Roman" w:hAnsi="Times New Roman" w:cs="Times New Roman"/>
-          <w:sz w:val="24"/>
-          <w:szCs w:val="24"/>
-        </w:rPr>
-        <w:t xml:space="preserve"> to test identity information detection”</w:t>
-      </w:r>
-      <w:r>
-        <w:rPr>
-          <w:rFonts w:ascii="Times New Roman" w:hAnsi="Times New Roman" w:cs="Times New Roman"/>
-          <w:sz w:val="24"/>
-          <w:szCs w:val="24"/>
-        </w:rPr>
-        <w:t xml:space="preserve"> for your consideration for publication </w:t>
-      </w:r>
-      <w:r>
-        <w:rPr>
-          <w:rFonts w:ascii="Times New Roman" w:hAnsi="Times New Roman" w:cs="Times New Roman"/>
+          <w:rFonts w:ascii="Arial" w:hAnsi="Arial"/>
+          <w:sz w:val="24"/>
+          <w:szCs w:val="24"/>
+        </w:rPr>
+        <w:t>Synthetic frequency-modulated voc</w:t>
+      </w:r>
+      <w:r>
+        <w:rPr>
+          <w:rFonts w:ascii="Arial" w:hAnsi="Arial"/>
+          <w:sz w:val="24"/>
+          <w:szCs w:val="24"/>
+        </w:rPr>
+        <w:t>a</w:t>
+      </w:r>
+      <w:r>
+        <w:rPr>
+          <w:rFonts w:ascii="Arial" w:hAnsi="Arial"/>
+          <w:sz w:val="24"/>
+          <w:szCs w:val="24"/>
+        </w:rPr>
+        <w:t>lizations to test identity information detection”</w:t>
+      </w:r>
+      <w:r>
+        <w:rPr>
+          <w:rFonts w:ascii="Arial" w:hAnsi="Arial"/>
+          <w:sz w:val="24"/>
+          <w:szCs w:val="24"/>
+        </w:rPr>
+        <w:t xml:space="preserve"> for your consideration </w:t>
+      </w:r>
+      <w:r>
+        <w:rPr>
+          <w:rFonts w:ascii="Arial" w:hAnsi="Arial"/>
           <w:sz w:val="24"/>
           <w:szCs w:val="24"/>
         </w:rPr>
@@ -106,7 +150,7 @@
       </w:r>
       <w:r>
         <w:rPr>
-          <w:rFonts w:ascii="Times New Roman" w:hAnsi="Times New Roman" w:cs="Times New Roman"/>
+          <w:rFonts w:ascii="Arial" w:hAnsi="Arial"/>
           <w:sz w:val="24"/>
           <w:szCs w:val="24"/>
         </w:rPr>
@@ -114,7 +158,7 @@
       </w:r>
       <w:r>
         <w:rPr>
-          <w:rFonts w:ascii="Times New Roman" w:hAnsi="Times New Roman" w:cs="Times New Roman"/>
+          <w:rFonts w:ascii="Arial" w:hAnsi="Arial"/>
           <w:sz w:val="24"/>
           <w:szCs w:val="24"/>
         </w:rPr>
@@ -124,50 +168,699 @@
     <w:p>
       <w:pPr>
         <w:rPr>
-          <w:rFonts w:ascii="Times New Roman" w:hAnsi="Times New Roman" w:cs="Times New Roman"/>
-          <w:sz w:val="24"/>
-          <w:szCs w:val="24"/>
-        </w:rPr>
-      </w:pPr>
-      <w:r>
-        <w:rPr>
-          <w:rFonts w:ascii="Times New Roman" w:hAnsi="Times New Roman" w:cs="Times New Roman"/>
-          <w:sz w:val="24"/>
-          <w:szCs w:val="24"/>
-        </w:rPr>
+          <w:rFonts w:ascii="Arial" w:hAnsi="Arial"/>
+          <w:sz w:val="24"/>
+          <w:szCs w:val="24"/>
+        </w:rPr>
+      </w:pPr>
+      <w:r>
+        <w:rPr>
+          <w:rFonts w:ascii="Arial" w:hAnsi="Arial"/>
+          <w:sz w:val="24"/>
+          <w:szCs w:val="24"/>
+        </w:rPr>
+        <w:t xml:space="preserve">Animals can </w:t>
+      </w:r>
+      <w:r>
+        <w:rPr>
+          <w:rFonts w:ascii="Arial" w:hAnsi="Arial"/>
+          <w:sz w:val="24"/>
+          <w:szCs w:val="24"/>
+        </w:rPr>
+        <w:t xml:space="preserve">communicate </w:t>
+      </w:r>
+      <w:r>
+        <w:rPr>
+          <w:rFonts w:ascii="Arial" w:hAnsi="Arial"/>
+          <w:sz w:val="24"/>
+          <w:szCs w:val="24"/>
+        </w:rPr>
+        <w:t xml:space="preserve">information about their social identities through </w:t>
+      </w:r>
+      <w:r>
+        <w:rPr>
+          <w:rFonts w:ascii="Arial" w:hAnsi="Arial"/>
+          <w:sz w:val="24"/>
+          <w:szCs w:val="24"/>
+        </w:rPr>
+        <w:t>vocal signals</w:t>
+      </w:r>
+      <w:r>
+        <w:rPr>
+          <w:rFonts w:ascii="Arial" w:hAnsi="Arial"/>
+          <w:sz w:val="24"/>
+          <w:szCs w:val="24"/>
+        </w:rPr>
+        <w:t>. Indeed, animals that navigate multiple levels of social organization appear to encode multi-level identity information in their vocalizations</w:t>
+      </w:r>
+      <w:r>
+        <w:rPr>
+          <w:rFonts w:ascii="Arial" w:hAnsi="Arial"/>
+          <w:sz w:val="24"/>
+          <w:szCs w:val="24"/>
+        </w:rPr>
+        <w:t>. D</w:t>
+      </w:r>
+      <w:r>
+        <w:rPr>
+          <w:rFonts w:ascii="Arial" w:hAnsi="Arial"/>
+          <w:sz w:val="24"/>
+          <w:szCs w:val="24"/>
+        </w:rPr>
+        <w:t xml:space="preserve">etecting such complex information encoding could yield new insights into how social and vocal communication systems </w:t>
+      </w:r>
+      <w:r>
+        <w:rPr>
+          <w:rFonts w:ascii="Arial" w:hAnsi="Arial"/>
+          <w:sz w:val="24"/>
+          <w:szCs w:val="24"/>
+        </w:rPr>
+        <w:t xml:space="preserve">first </w:t>
+      </w:r>
+      <w:r>
+        <w:rPr>
+          <w:rFonts w:ascii="Arial" w:hAnsi="Arial"/>
+          <w:sz w:val="24"/>
+          <w:szCs w:val="24"/>
+        </w:rPr>
+        <w:t xml:space="preserve">originated and continue to </w:t>
+      </w:r>
+      <w:r>
+        <w:rPr>
+          <w:rFonts w:ascii="Arial" w:hAnsi="Arial"/>
+          <w:sz w:val="24"/>
+          <w:szCs w:val="24"/>
+        </w:rPr>
+        <w:t>change over varying evolutionary timescales</w:t>
+      </w:r>
+      <w:r>
+        <w:rPr>
+          <w:rFonts w:ascii="Arial" w:hAnsi="Arial"/>
+          <w:sz w:val="24"/>
+          <w:szCs w:val="24"/>
+        </w:rPr>
+        <w:t>.</w:t>
+      </w:r>
+    </w:p>
+    <w:p>
+      <w:pPr>
+        <w:rPr>
+          <w:rFonts w:ascii="Arial" w:hAnsi="Arial"/>
+          <w:sz w:val="24"/>
+          <w:szCs w:val="24"/>
+        </w:rPr>
+      </w:pPr>
+      <w:r>
+        <w:rPr>
+          <w:rFonts w:ascii="Arial" w:hAnsi="Arial"/>
+          <w:sz w:val="24"/>
+          <w:szCs w:val="24"/>
+        </w:rPr>
+        <w:t xml:space="preserve">However, </w:t>
+      </w:r>
+      <w:r>
+        <w:rPr>
+          <w:rFonts w:ascii="Arial" w:hAnsi="Arial"/>
+          <w:sz w:val="24"/>
+          <w:szCs w:val="24"/>
+        </w:rPr>
+        <w:t>detecting</w:t>
+      </w:r>
+      <w:r>
+        <w:rPr>
+          <w:rFonts w:ascii="Arial" w:hAnsi="Arial"/>
+          <w:sz w:val="24"/>
+          <w:szCs w:val="24"/>
+        </w:rPr>
+        <w:t xml:space="preserve"> complex</w:t>
+      </w:r>
+      <w:r>
+        <w:rPr>
+          <w:rFonts w:ascii="Arial" w:hAnsi="Arial"/>
+          <w:sz w:val="24"/>
+          <w:szCs w:val="24"/>
+        </w:rPr>
+        <w:t xml:space="preserve"> </w:t>
+      </w:r>
+      <w:r>
+        <w:rPr>
+          <w:rFonts w:ascii="Arial" w:hAnsi="Arial"/>
+          <w:sz w:val="24"/>
+          <w:szCs w:val="24"/>
+        </w:rPr>
+        <w:t>information encoding</w:t>
+      </w:r>
+      <w:r>
+        <w:rPr>
+          <w:rFonts w:ascii="Arial" w:hAnsi="Arial"/>
+          <w:sz w:val="24"/>
+          <w:szCs w:val="24"/>
+        </w:rPr>
+        <w:t xml:space="preserve"> </w:t>
+      </w:r>
+      <w:r>
+        <w:rPr>
+          <w:rFonts w:ascii="Arial" w:hAnsi="Arial"/>
+          <w:sz w:val="24"/>
+          <w:szCs w:val="24"/>
+        </w:rPr>
+        <w:t>about social identity remains extremely challenging. When relying on empirical datasets, we do not know the true types and amounts of identity information encode</w:t>
+      </w:r>
+      <w:r>
+        <w:rPr>
+          <w:rFonts w:ascii="Arial" w:hAnsi="Arial"/>
+          <w:sz w:val="24"/>
+          <w:szCs w:val="24"/>
+        </w:rPr>
+        <w:t>d</w:t>
+      </w:r>
+      <w:r>
+        <w:rPr>
+          <w:rFonts w:ascii="Arial" w:hAnsi="Arial"/>
+          <w:sz w:val="24"/>
+          <w:szCs w:val="24"/>
+        </w:rPr>
+        <w:t xml:space="preserve"> in their vocalizations, which makes it difficult to assess </w:t>
+      </w:r>
+      <w:r>
+        <w:rPr>
+          <w:rFonts w:ascii="Arial" w:hAnsi="Arial"/>
+          <w:sz w:val="24"/>
+          <w:szCs w:val="24"/>
+        </w:rPr>
+        <w:t xml:space="preserve">the </w:t>
+      </w:r>
+      <w:r>
+        <w:rPr>
+          <w:rFonts w:ascii="Arial" w:hAnsi="Arial"/>
+          <w:sz w:val="24"/>
+          <w:szCs w:val="24"/>
+        </w:rPr>
+        <w:t>information detection</w:t>
+      </w:r>
+      <w:r>
+        <w:rPr>
+          <w:rFonts w:ascii="Arial" w:hAnsi="Arial"/>
+          <w:sz w:val="24"/>
+          <w:szCs w:val="24"/>
+        </w:rPr>
+        <w:t xml:space="preserve"> performance of </w:t>
+      </w:r>
+      <w:r>
+        <w:rPr>
+          <w:rFonts w:ascii="Arial" w:hAnsi="Arial"/>
+          <w:sz w:val="24"/>
+          <w:szCs w:val="24"/>
+        </w:rPr>
+        <w:t xml:space="preserve">quantitative tools </w:t>
+      </w:r>
+      <w:r>
+        <w:rPr>
+          <w:rFonts w:ascii="Arial" w:hAnsi="Arial"/>
+          <w:sz w:val="24"/>
+          <w:szCs w:val="24"/>
+        </w:rPr>
+        <w:t xml:space="preserve">in </w:t>
+      </w:r>
+      <w:r>
+        <w:rPr>
+          <w:rFonts w:ascii="Arial" w:hAnsi="Arial"/>
+          <w:sz w:val="24"/>
+          <w:szCs w:val="24"/>
+        </w:rPr>
+        <w:t>bioacoustics</w:t>
+      </w:r>
+      <w:r>
+        <w:rPr>
+          <w:rFonts w:ascii="Arial" w:hAnsi="Arial"/>
+          <w:sz w:val="24"/>
+          <w:szCs w:val="24"/>
+        </w:rPr>
+        <w:t>.</w:t>
+      </w:r>
+    </w:p>
+    <w:p>
+      <w:pPr>
+        <w:rPr>
+          <w:rFonts w:ascii="Arial" w:hAnsi="Arial"/>
+          <w:sz w:val="24"/>
+          <w:szCs w:val="24"/>
+        </w:rPr>
+      </w:pPr>
+      <w:r>
+        <w:rPr>
+          <w:rFonts w:ascii="Arial" w:hAnsi="Arial"/>
+          <w:sz w:val="24"/>
+          <w:szCs w:val="24"/>
+        </w:rPr>
+        <w:t xml:space="preserve">Here we present a new tool that directly address this challenge. </w:t>
+      </w:r>
+      <w:r>
+        <w:rPr>
+          <w:rFonts w:ascii="Arial" w:hAnsi="Arial"/>
+          <w:sz w:val="24"/>
+          <w:szCs w:val="24"/>
+        </w:rPr>
+        <w:t>We</w:t>
+      </w:r>
+      <w:r>
+        <w:rPr>
+          <w:rFonts w:ascii="Arial" w:hAnsi="Arial"/>
+          <w:sz w:val="24"/>
+          <w:szCs w:val="24"/>
+        </w:rPr>
+        <w:t xml:space="preserve"> developed </w:t>
+      </w:r>
+      <w:r>
+        <w:rPr>
+          <w:rFonts w:ascii="Arial" w:hAnsi="Arial"/>
+          <w:sz w:val="24"/>
+          <w:szCs w:val="24"/>
+        </w:rPr>
+        <w:t>a pipeline</w:t>
+      </w:r>
+      <w:r>
+        <w:rPr>
+          <w:rFonts w:ascii="Arial" w:hAnsi="Arial"/>
+          <w:sz w:val="24"/>
+          <w:szCs w:val="24"/>
+        </w:rPr>
+        <w:t xml:space="preserve"> that facilitates </w:t>
+      </w:r>
+      <w:r>
+        <w:rPr>
+          <w:rFonts w:ascii="Arial" w:hAnsi="Arial"/>
+          <w:sz w:val="24"/>
+          <w:szCs w:val="24"/>
+        </w:rPr>
+        <w:t>ge</w:t>
+      </w:r>
+      <w:r>
+        <w:rPr>
+          <w:rFonts w:ascii="Arial" w:hAnsi="Arial"/>
+          <w:sz w:val="24"/>
+          <w:szCs w:val="24"/>
+        </w:rPr>
+        <w:t>n</w:t>
+      </w:r>
+      <w:r>
+        <w:rPr>
+          <w:rFonts w:ascii="Arial" w:hAnsi="Arial"/>
+          <w:sz w:val="24"/>
+          <w:szCs w:val="24"/>
+        </w:rPr>
+        <w:t xml:space="preserve">erating synthetic </w:t>
+      </w:r>
+      <w:r>
+        <w:rPr>
+          <w:rFonts w:ascii="Arial" w:hAnsi="Arial"/>
+          <w:sz w:val="24"/>
+          <w:szCs w:val="24"/>
+        </w:rPr>
+        <w:t xml:space="preserve">vocalizations with </w:t>
+      </w:r>
+      <w:r>
+        <w:rPr>
+          <w:rFonts w:ascii="Arial" w:hAnsi="Arial"/>
+          <w:sz w:val="24"/>
+          <w:szCs w:val="24"/>
+        </w:rPr>
+        <w:t xml:space="preserve">identity information </w:t>
+      </w:r>
+      <w:r>
+        <w:rPr>
+          <w:rFonts w:ascii="Arial" w:hAnsi="Arial"/>
+          <w:sz w:val="24"/>
+          <w:szCs w:val="24"/>
+        </w:rPr>
+        <w:t xml:space="preserve">that can be encoded </w:t>
+      </w:r>
+      <w:r>
+        <w:rPr>
+          <w:rFonts w:ascii="Arial" w:hAnsi="Arial"/>
+          <w:sz w:val="24"/>
+          <w:szCs w:val="24"/>
+        </w:rPr>
+        <w:t>across two social levels</w:t>
+      </w:r>
+      <w:r>
+        <w:rPr>
+          <w:rFonts w:ascii="Arial" w:hAnsi="Arial"/>
+          <w:sz w:val="24"/>
+          <w:szCs w:val="24"/>
+        </w:rPr>
+        <w:t xml:space="preserve"> (group and individual).</w:t>
+      </w:r>
+      <w:r>
+        <w:rPr>
+          <w:rFonts w:ascii="Arial" w:hAnsi="Arial"/>
+          <w:sz w:val="24"/>
+          <w:szCs w:val="24"/>
+        </w:rPr>
+        <w:t xml:space="preserve"> Identity information is encoded in the shape of vocalizations, or frequency modulation patterns, which are known to be </w:t>
+      </w:r>
+      <w:r>
+        <w:rPr>
+          <w:rFonts w:ascii="Arial" w:hAnsi="Arial"/>
+          <w:sz w:val="24"/>
+          <w:szCs w:val="24"/>
+        </w:rPr>
+        <w:t>used for social recognition</w:t>
+      </w:r>
+      <w:r>
+        <w:rPr>
+          <w:rFonts w:ascii="Arial" w:hAnsi="Arial"/>
+          <w:sz w:val="24"/>
+          <w:szCs w:val="24"/>
+        </w:rPr>
+        <w:t xml:space="preserve"> by animals in the wild.</w:t>
+      </w:r>
+      <w:r>
+        <w:rPr>
+          <w:rFonts w:ascii="Arial" w:hAnsi="Arial"/>
+          <w:sz w:val="24"/>
+          <w:szCs w:val="24"/>
+        </w:rPr>
+        <w:t xml:space="preserve"> </w:t>
+      </w:r>
+      <w:r>
+        <w:rPr>
+          <w:rFonts w:ascii="Arial" w:hAnsi="Arial"/>
+          <w:sz w:val="24"/>
+          <w:szCs w:val="24"/>
+        </w:rPr>
+        <w:t xml:space="preserve">Our pipeline </w:t>
+      </w:r>
+    </w:p>
+    <w:p>
+      <w:pPr>
+        <w:rPr>
+          <w:rFonts w:ascii="Arial" w:hAnsi="Arial"/>
+          <w:sz w:val="24"/>
+          <w:szCs w:val="24"/>
+        </w:rPr>
+      </w:pPr>
+      <w:r>
+        <w:rPr>
+          <w:rFonts w:ascii="Arial" w:hAnsi="Arial"/>
+          <w:sz w:val="24"/>
+          <w:szCs w:val="24"/>
+        </w:rPr>
+        <w:t>W</w:t>
+      </w:r>
+      <w:r>
+        <w:rPr>
+          <w:rFonts w:ascii="Arial" w:hAnsi="Arial"/>
+          <w:sz w:val="24"/>
+          <w:szCs w:val="24"/>
+        </w:rPr>
+        <w:t xml:space="preserve">e </w:t>
+      </w:r>
+      <w:r>
+        <w:rPr>
+          <w:rFonts w:ascii="Arial" w:hAnsi="Arial"/>
+          <w:sz w:val="24"/>
+          <w:szCs w:val="24"/>
+        </w:rPr>
+        <w:t>then</w:t>
+      </w:r>
+      <w:r>
+        <w:rPr>
+          <w:rFonts w:ascii="Arial" w:hAnsi="Arial"/>
+          <w:sz w:val="24"/>
+          <w:szCs w:val="24"/>
+        </w:rPr>
+        <w:t xml:space="preserve"> </w:t>
+      </w:r>
+      <w:r>
+        <w:rPr>
+          <w:rFonts w:ascii="Arial" w:hAnsi="Arial"/>
+          <w:sz w:val="24"/>
+          <w:szCs w:val="24"/>
+        </w:rPr>
+        <w:t>performed simulation experiments</w:t>
+      </w:r>
+      <w:r>
+        <w:rPr>
+          <w:rFonts w:ascii="Arial" w:hAnsi="Arial"/>
+          <w:sz w:val="24"/>
+          <w:szCs w:val="24"/>
+        </w:rPr>
+        <w:t xml:space="preserve"> </w:t>
+      </w:r>
+      <w:r>
+        <w:rPr>
+          <w:rFonts w:ascii="Arial" w:hAnsi="Arial"/>
+          <w:sz w:val="24"/>
+          <w:szCs w:val="24"/>
+        </w:rPr>
+        <w:t xml:space="preserve">to </w:t>
+      </w:r>
+      <w:r>
+        <w:rPr>
+          <w:rFonts w:ascii="Arial" w:hAnsi="Arial"/>
+          <w:sz w:val="24"/>
+          <w:szCs w:val="24"/>
+        </w:rPr>
+        <w:t>test how well a traditional bioacoustics tool (spectrographic cross-correlation) could be used to detect identity information in the resulting datasets of synthetic vocalizations</w:t>
+      </w:r>
+      <w:r>
+        <w:rPr>
+          <w:rFonts w:ascii="Arial" w:hAnsi="Arial"/>
+          <w:sz w:val="24"/>
+          <w:szCs w:val="24"/>
+        </w:rPr>
+        <w:t xml:space="preserve">. In these experiments, we </w:t>
+      </w:r>
+      <w:r>
+        <w:rPr>
+          <w:rFonts w:ascii="Arial" w:hAnsi="Arial"/>
+          <w:sz w:val="24"/>
+          <w:szCs w:val="24"/>
+        </w:rPr>
+        <w:t xml:space="preserve">manipulated the complexity of information encoding, as well as the complexity of the signaling environment, </w:t>
+      </w:r>
+      <w:r>
+        <w:rPr>
+          <w:rFonts w:ascii="Arial" w:hAnsi="Arial"/>
+          <w:sz w:val="24"/>
+          <w:szCs w:val="24"/>
+        </w:rPr>
+        <w:t>as both factors are expected to influence the distinctiveness of identity information in empirical datasets.</w:t>
+      </w:r>
+    </w:p>
+    <w:p>
+      <w:pPr>
+        <w:rPr>
+          <w:rFonts w:ascii="Arial" w:hAnsi="Arial"/>
+          <w:sz w:val="24"/>
+          <w:szCs w:val="24"/>
+        </w:rPr>
+      </w:pPr>
+      <w:r>
+        <w:rPr>
+          <w:rFonts w:ascii="Arial" w:hAnsi="Arial"/>
+          <w:sz w:val="24"/>
+          <w:szCs w:val="24"/>
+        </w:rPr>
+        <w:t xml:space="preserve">The new pipeline we developed </w:t>
+      </w:r>
+      <w:r>
+        <w:rPr>
+          <w:rFonts w:ascii="Arial" w:hAnsi="Arial"/>
+          <w:sz w:val="24"/>
+          <w:szCs w:val="24"/>
+        </w:rPr>
+        <w:t>is available as an R package on GitHub for widespread use</w:t>
+      </w:r>
+      <w:r>
+        <w:rPr>
+          <w:rFonts w:ascii="Arial" w:hAnsi="Arial"/>
+          <w:sz w:val="24"/>
+          <w:szCs w:val="24"/>
+        </w:rPr>
+        <w:t xml:space="preserve"> (</w:t>
+      </w:r>
+      <w:r>
+        <w:rPr>
+          <w:rFonts w:ascii="Arial" w:hAnsi="Arial"/>
+          <w:sz w:val="24"/>
+          <w:szCs w:val="24"/>
+        </w:rPr>
+        <w:fldChar w:fldCharType="begin"/>
+      </w:r>
+      <w:ins w:id="0" w:author="Smith Vidaurre, Grace" w:date="2025-08-14T10:59:00Z" w16du:dateUtc="2025-08-14T14:59:00Z">
+        <w:r>
+          <w:rPr>
+            <w:rFonts w:ascii="Arial" w:hAnsi="Arial"/>
+            <w:sz w:val="24"/>
+            <w:szCs w:val="24"/>
+          </w:rPr>
+          <w:instrText>HYPERLINK "</w:instrText>
+        </w:r>
+      </w:ins>
+      <w:r>
+        <w:rPr>
+          <w:rFonts w:ascii="Arial" w:hAnsi="Arial"/>
+          <w:sz w:val="24"/>
+          <w:szCs w:val="24"/>
+        </w:rPr>
+        <w:instrText>https://github.com/gsvidaurre/paRsynth</w:instrText>
+      </w:r>
+      <w:ins w:id="1" w:author="Smith Vidaurre, Grace" w:date="2025-08-14T10:59:00Z" w16du:dateUtc="2025-08-14T14:59:00Z">
+        <w:r>
+          <w:rPr>
+            <w:rFonts w:ascii="Arial" w:hAnsi="Arial"/>
+            <w:sz w:val="24"/>
+            <w:szCs w:val="24"/>
+          </w:rPr>
+          <w:instrText>"</w:instrText>
+        </w:r>
+      </w:ins>
+      <w:r>
+        <w:rPr>
+          <w:rFonts w:ascii="Arial" w:hAnsi="Arial"/>
+          <w:sz w:val="24"/>
+          <w:szCs w:val="24"/>
+        </w:rPr>
+        <w:fldChar w:fldCharType="separate"/>
+      </w:r>
+      <w:r>
+        <w:rPr>
+          <w:rStyle w:val="Hyperlink"/>
+          <w:rFonts w:ascii="Arial" w:hAnsi="Arial"/>
+          <w:sz w:val="24"/>
+          <w:szCs w:val="24"/>
+        </w:rPr>
+        <w:t>https://github.com/gsvidaurre/paRsynth</w:t>
+      </w:r>
+      <w:r>
+        <w:rPr>
+          <w:rFonts w:ascii="Arial" w:hAnsi="Arial"/>
+          <w:sz w:val="24"/>
+          <w:szCs w:val="24"/>
+        </w:rPr>
+        <w:fldChar w:fldCharType="end"/>
+      </w:r>
+      <w:r>
+        <w:rPr>
+          <w:rFonts w:ascii="Arial" w:hAnsi="Arial"/>
+          <w:sz w:val="24"/>
+          <w:szCs w:val="24"/>
+        </w:rPr>
+        <w:t>)</w:t>
+      </w:r>
+      <w:r>
+        <w:rPr>
+          <w:rFonts w:ascii="Arial" w:hAnsi="Arial"/>
+          <w:sz w:val="24"/>
+          <w:szCs w:val="24"/>
+        </w:rPr>
+        <w:t>.</w:t>
+      </w:r>
+      <w:r>
+        <w:rPr>
+          <w:rFonts w:ascii="Arial" w:hAnsi="Arial"/>
+          <w:sz w:val="24"/>
+          <w:szCs w:val="24"/>
+        </w:rPr>
+        <w:t xml:space="preserve"> From our simulation experiments, </w:t>
+      </w:r>
+      <w:r>
+        <w:rPr>
+          <w:rFonts w:ascii="Arial" w:hAnsi="Arial"/>
+          <w:sz w:val="24"/>
+          <w:szCs w:val="24"/>
+        </w:rPr>
+        <w:t xml:space="preserve">we determined that </w:t>
+      </w:r>
+      <w:r>
+        <w:rPr>
+          <w:rFonts w:ascii="Arial" w:hAnsi="Arial"/>
+          <w:sz w:val="24"/>
+          <w:szCs w:val="24"/>
+        </w:rPr>
+        <w:t>spectrographic cross-correlation</w:t>
+      </w:r>
+      <w:r>
+        <w:rPr>
+          <w:rFonts w:ascii="Arial" w:hAnsi="Arial"/>
+          <w:sz w:val="24"/>
+          <w:szCs w:val="24"/>
+        </w:rPr>
+        <w:t xml:space="preserve"> </w:t>
+      </w:r>
+      <w:r>
+        <w:rPr>
+          <w:rFonts w:ascii="Arial" w:hAnsi="Arial"/>
+          <w:sz w:val="24"/>
+          <w:szCs w:val="24"/>
+        </w:rPr>
+        <w:t xml:space="preserve">can </w:t>
+      </w:r>
+      <w:r>
+        <w:rPr>
+          <w:rFonts w:ascii="Arial" w:hAnsi="Arial"/>
+          <w:sz w:val="24"/>
+          <w:szCs w:val="24"/>
+        </w:rPr>
+        <w:t xml:space="preserve">be used </w:t>
+      </w:r>
+      <w:r>
+        <w:rPr>
+          <w:rFonts w:ascii="Arial" w:hAnsi="Arial"/>
+          <w:sz w:val="24"/>
+          <w:szCs w:val="24"/>
+        </w:rPr>
+        <w:t>accurately detect information from our signals both pre and post sonification. Through effect size compairsons, we quantitatively demonstrated that we can accuractely detect the social level with the most information originally encoded.</w:t>
+      </w:r>
+    </w:p>
+    <w:p>
+      <w:pPr>
+        <w:rPr>
+          <w:rFonts w:ascii="Arial" w:hAnsi="Arial"/>
+          <w:sz w:val="24"/>
+          <w:szCs w:val="24"/>
+        </w:rPr>
+      </w:pPr>
+    </w:p>
+    <w:p>
+      <w:pPr>
+        <w:rPr>
+          <w:rFonts w:ascii="Arial" w:hAnsi="Arial"/>
+          <w:sz w:val="24"/>
+          <w:szCs w:val="24"/>
+        </w:rPr>
+      </w:pPr>
+    </w:p>
+    <w:p>
+      <w:pPr>
+        <w:rPr>
+          <w:rFonts w:ascii="Arial" w:hAnsi="Arial"/>
+          <w:sz w:val="24"/>
+          <w:szCs w:val="24"/>
+        </w:rPr>
+      </w:pPr>
+      <w:r>
+        <w:rPr>
+          <w:rFonts w:ascii="Arial" w:hAnsi="Arial"/>
+          <w:sz w:val="24"/>
+          <w:szCs w:val="24"/>
+        </w:rPr>
+        <w:lastRenderedPageBreak/>
         <w:t xml:space="preserve">In this manuscript, </w:t>
       </w:r>
       <w:r>
         <w:rPr>
-          <w:rFonts w:ascii="Times New Roman" w:hAnsi="Times New Roman" w:cs="Times New Roman"/>
-          <w:sz w:val="24"/>
-          <w:szCs w:val="24"/>
-        </w:rPr>
-        <w:t xml:space="preserve">we focus multi-level identity information encoding in vocalization through frequency modulation patterns. Specifically, we investigate how the use of synthetic vocalization datasets may aid the field in advances in multi-level information detection over a range of conditions. Most research in this area relies on information detection in empirical datasets, and while this research helps to test hypotheses in the field, we currently do not know </w:t>
-      </w:r>
-      <w:proofErr w:type="spellStart"/>
-      <w:proofErr w:type="gramStart"/>
-      <w:r>
-        <w:rPr>
-          <w:rFonts w:ascii="Times New Roman" w:hAnsi="Times New Roman" w:cs="Times New Roman"/>
-          <w:sz w:val="24"/>
-          <w:szCs w:val="24"/>
-        </w:rPr>
-        <w:t>hoe</w:t>
-      </w:r>
-      <w:proofErr w:type="spellEnd"/>
-      <w:proofErr w:type="gramEnd"/>
-      <w:r>
-        <w:rPr>
-          <w:rFonts w:ascii="Times New Roman" w:hAnsi="Times New Roman" w:cs="Times New Roman"/>
-          <w:sz w:val="24"/>
-          <w:szCs w:val="24"/>
-        </w:rPr>
-        <w:t xml:space="preserve"> well bioacoustics tools detect multilevel information in signals, </w:t>
-      </w:r>
-      <w:r>
-        <w:rPr>
-          <w:rFonts w:ascii="Times New Roman" w:hAnsi="Times New Roman" w:cs="Times New Roman"/>
+          <w:rFonts w:ascii="Arial" w:hAnsi="Arial"/>
+          <w:sz w:val="24"/>
+          <w:szCs w:val="24"/>
+        </w:rPr>
+        <w:t xml:space="preserve">we focus multi-level identity information encoding in vocalization through frequency modulation patterns. Specifically, we investigate how the use of synthetic vocalization datasets may aid the field in advances in multi-level information detection over a range of conditions. Most research in this area relies on information detection in empirical datasets, and while this research helps to test hypotheses in the field, we currently do not know hoe well bioacoustics tools detect multilevel information in signals, </w:t>
+      </w:r>
+      <w:r>
+        <w:rPr>
+          <w:rFonts w:ascii="Arial" w:hAnsi="Arial"/>
           <w:sz w:val="24"/>
           <w:szCs w:val="24"/>
         </w:rPr>
@@ -177,247 +870,49 @@
     <w:p>
       <w:pPr>
         <w:rPr>
-          <w:rFonts w:ascii="Times New Roman" w:hAnsi="Times New Roman" w:cs="Times New Roman"/>
-          <w:sz w:val="24"/>
-          <w:szCs w:val="24"/>
-        </w:rPr>
-      </w:pPr>
-      <w:commentRangeStart w:id="0"/>
-      <w:r>
-        <w:rPr>
-          <w:rFonts w:ascii="Times New Roman" w:hAnsi="Times New Roman" w:cs="Times New Roman"/>
-          <w:sz w:val="24"/>
-          <w:szCs w:val="24"/>
-        </w:rPr>
-        <w:t xml:space="preserve">Our </w:t>
-      </w:r>
-      <w:commentRangeEnd w:id="0"/>
-      <w:r>
-        <w:rPr>
-          <w:rStyle w:val="CommentReference"/>
-          <w:rFonts w:ascii="Times New Roman" w:hAnsi="Times New Roman" w:cs="Times New Roman"/>
-          <w:sz w:val="24"/>
-          <w:szCs w:val="24"/>
-        </w:rPr>
-        <w:commentReference w:id="0"/>
-      </w:r>
-      <w:proofErr w:type="spellStart"/>
-      <w:r>
-        <w:rPr>
-          <w:rFonts w:ascii="Times New Roman" w:hAnsi="Times New Roman" w:cs="Times New Roman"/>
-          <w:sz w:val="24"/>
-          <w:szCs w:val="24"/>
-        </w:rPr>
-        <w:t>manuacript</w:t>
-      </w:r>
-      <w:proofErr w:type="spellEnd"/>
-      <w:r>
-        <w:rPr>
-          <w:rFonts w:ascii="Times New Roman" w:hAnsi="Times New Roman" w:cs="Times New Roman"/>
-          <w:sz w:val="24"/>
-          <w:szCs w:val="24"/>
-        </w:rPr>
-        <w:t xml:space="preserve"> addressed two main aims. First, we developed a pipeline for </w:t>
-      </w:r>
-      <w:proofErr w:type="spellStart"/>
-      <w:r>
-        <w:rPr>
-          <w:rFonts w:ascii="Times New Roman" w:hAnsi="Times New Roman" w:cs="Times New Roman"/>
-          <w:sz w:val="24"/>
-          <w:szCs w:val="24"/>
-        </w:rPr>
-        <w:t>geerating</w:t>
-      </w:r>
-      <w:proofErr w:type="spellEnd"/>
-      <w:r>
-        <w:rPr>
-          <w:rFonts w:ascii="Times New Roman" w:hAnsi="Times New Roman" w:cs="Times New Roman"/>
-          <w:sz w:val="24"/>
-          <w:szCs w:val="24"/>
-        </w:rPr>
-        <w:t xml:space="preserve"> synthetic signals </w:t>
-      </w:r>
-      <w:proofErr w:type="gramStart"/>
-      <w:r>
-        <w:rPr>
-          <w:rFonts w:ascii="Times New Roman" w:hAnsi="Times New Roman" w:cs="Times New Roman"/>
-          <w:sz w:val="24"/>
-          <w:szCs w:val="24"/>
-        </w:rPr>
-        <w:t>contains</w:t>
-      </w:r>
-      <w:proofErr w:type="gramEnd"/>
-      <w:r>
-        <w:rPr>
-          <w:rFonts w:ascii="Times New Roman" w:hAnsi="Times New Roman" w:cs="Times New Roman"/>
-          <w:sz w:val="24"/>
-          <w:szCs w:val="24"/>
-        </w:rPr>
-        <w:t xml:space="preserve"> identity information across two social levels. This pipeline is available for use on GitHub (</w:t>
-      </w:r>
-      <w:proofErr w:type="spellStart"/>
-      <w:r>
-        <w:rPr>
-          <w:rFonts w:ascii="Times New Roman" w:hAnsi="Times New Roman" w:cs="Times New Roman"/>
-          <w:sz w:val="24"/>
-          <w:szCs w:val="24"/>
-        </w:rPr>
-        <w:t>PaRsynth</w:t>
-      </w:r>
-      <w:proofErr w:type="spellEnd"/>
-      <w:r>
-        <w:rPr>
-          <w:rFonts w:ascii="Times New Roman" w:hAnsi="Times New Roman" w:cs="Times New Roman"/>
-          <w:sz w:val="24"/>
-          <w:szCs w:val="24"/>
-        </w:rPr>
-        <w:t xml:space="preserve">, </w:t>
-      </w:r>
-      <w:proofErr w:type="gramStart"/>
-      <w:r>
-        <w:rPr>
-          <w:rFonts w:ascii="Times New Roman" w:hAnsi="Times New Roman" w:cs="Times New Roman"/>
-          <w:sz w:val="24"/>
-          <w:szCs w:val="24"/>
-        </w:rPr>
-        <w:t>TKTK  LINK</w:t>
-      </w:r>
-      <w:proofErr w:type="gramEnd"/>
-      <w:r>
-        <w:rPr>
-          <w:rFonts w:ascii="Times New Roman" w:hAnsi="Times New Roman" w:cs="Times New Roman"/>
-          <w:sz w:val="24"/>
-          <w:szCs w:val="24"/>
-        </w:rPr>
-        <w:t xml:space="preserve">). We generate two synthetic </w:t>
-      </w:r>
-      <w:proofErr w:type="spellStart"/>
-      <w:r>
-        <w:rPr>
-          <w:rFonts w:ascii="Times New Roman" w:hAnsi="Times New Roman" w:cs="Times New Roman"/>
-          <w:sz w:val="24"/>
-          <w:szCs w:val="24"/>
-        </w:rPr>
-        <w:t>datsets</w:t>
-      </w:r>
-      <w:proofErr w:type="spellEnd"/>
-      <w:r>
-        <w:rPr>
-          <w:rFonts w:ascii="Times New Roman" w:hAnsi="Times New Roman" w:cs="Times New Roman"/>
-          <w:sz w:val="24"/>
-          <w:szCs w:val="24"/>
-        </w:rPr>
-        <w:t xml:space="preserve"> using this pipeline to describe how the R package works. </w:t>
-      </w:r>
-      <w:proofErr w:type="spellStart"/>
-      <w:r>
-        <w:rPr>
-          <w:rFonts w:ascii="Times New Roman" w:hAnsi="Times New Roman" w:cs="Times New Roman"/>
-          <w:sz w:val="24"/>
-          <w:szCs w:val="24"/>
-        </w:rPr>
-        <w:t>Seocnd</w:t>
-      </w:r>
-      <w:proofErr w:type="spellEnd"/>
-      <w:r>
-        <w:rPr>
-          <w:rFonts w:ascii="Times New Roman" w:hAnsi="Times New Roman" w:cs="Times New Roman"/>
-          <w:sz w:val="24"/>
-          <w:szCs w:val="24"/>
-        </w:rPr>
-        <w:t xml:space="preserve">, using our newly developed pipeline, we performed a series of simulation experiments that vary information encoding and signal generation conditions to </w:t>
-      </w:r>
-      <w:r>
-        <w:rPr>
-          <w:rFonts w:ascii="Times New Roman" w:hAnsi="Times New Roman" w:cs="Times New Roman"/>
-          <w:sz w:val="24"/>
-          <w:szCs w:val="24"/>
-        </w:rPr>
-        <w:t xml:space="preserve">assess how well current bioacoustics tools can detect multilevel information encoded in signals. </w:t>
-      </w:r>
-    </w:p>
-    <w:p>
-      <w:pPr>
-        <w:rPr>
-          <w:rFonts w:ascii="Times New Roman" w:hAnsi="Times New Roman" w:cs="Times New Roman"/>
-          <w:sz w:val="24"/>
-          <w:szCs w:val="24"/>
-        </w:rPr>
-      </w:pPr>
-      <w:r>
-        <w:rPr>
-          <w:rFonts w:ascii="Times New Roman" w:hAnsi="Times New Roman" w:cs="Times New Roman"/>
-          <w:sz w:val="24"/>
-          <w:szCs w:val="24"/>
-        </w:rPr>
-        <w:t xml:space="preserve">We demonstrated that our pipeline </w:t>
-      </w:r>
-      <w:proofErr w:type="spellStart"/>
-      <w:r>
-        <w:rPr>
-          <w:rFonts w:ascii="Times New Roman" w:hAnsi="Times New Roman" w:cs="Times New Roman"/>
-          <w:sz w:val="24"/>
-          <w:szCs w:val="24"/>
-        </w:rPr>
-        <w:t>suscessfully</w:t>
-      </w:r>
-      <w:proofErr w:type="spellEnd"/>
-      <w:r>
-        <w:rPr>
-          <w:rFonts w:ascii="Times New Roman" w:hAnsi="Times New Roman" w:cs="Times New Roman"/>
-          <w:sz w:val="24"/>
-          <w:szCs w:val="24"/>
-        </w:rPr>
-        <w:t xml:space="preserve"> generates synthetic datasets with known amounts of multilevel information encoded in them. Through our simulation experiments we determined that current tools can accurately detect information from our signals both pre and post sonification. Through effect size </w:t>
-      </w:r>
-      <w:proofErr w:type="spellStart"/>
-      <w:r>
-        <w:rPr>
-          <w:rFonts w:ascii="Times New Roman" w:hAnsi="Times New Roman" w:cs="Times New Roman"/>
-          <w:sz w:val="24"/>
-          <w:szCs w:val="24"/>
-        </w:rPr>
-        <w:t>compairsons</w:t>
-      </w:r>
-      <w:proofErr w:type="spellEnd"/>
-      <w:r>
-        <w:rPr>
-          <w:rFonts w:ascii="Times New Roman" w:hAnsi="Times New Roman" w:cs="Times New Roman"/>
-          <w:sz w:val="24"/>
-          <w:szCs w:val="24"/>
-        </w:rPr>
-        <w:t xml:space="preserve">, we quantitatively demonstrated that we can </w:t>
-      </w:r>
-      <w:proofErr w:type="spellStart"/>
-      <w:r>
-        <w:rPr>
-          <w:rFonts w:ascii="Times New Roman" w:hAnsi="Times New Roman" w:cs="Times New Roman"/>
-          <w:sz w:val="24"/>
-          <w:szCs w:val="24"/>
-        </w:rPr>
-        <w:t>accuractely</w:t>
-      </w:r>
-      <w:proofErr w:type="spellEnd"/>
-      <w:r>
-        <w:rPr>
-          <w:rFonts w:ascii="Times New Roman" w:hAnsi="Times New Roman" w:cs="Times New Roman"/>
-          <w:sz w:val="24"/>
-          <w:szCs w:val="24"/>
-        </w:rPr>
-        <w:t xml:space="preserve"> detect the social level with the most information originally encoded.</w:t>
-      </w:r>
-    </w:p>
-    <w:p>
-      <w:pPr>
-        <w:rPr>
-          <w:rFonts w:ascii="Times New Roman" w:hAnsi="Times New Roman" w:cs="Times New Roman"/>
-          <w:sz w:val="24"/>
-          <w:szCs w:val="24"/>
-        </w:rPr>
-      </w:pPr>
-      <w:r>
-        <w:rPr>
-          <w:rFonts w:ascii="Times New Roman" w:hAnsi="Times New Roman" w:cs="Times New Roman"/>
+          <w:rFonts w:ascii="Arial" w:hAnsi="Arial"/>
+          <w:sz w:val="24"/>
+          <w:szCs w:val="24"/>
+        </w:rPr>
+      </w:pPr>
+    </w:p>
+    <w:p>
+      <w:pPr>
+        <w:rPr>
+          <w:rFonts w:ascii="Arial" w:hAnsi="Arial"/>
+          <w:sz w:val="24"/>
+          <w:szCs w:val="24"/>
+        </w:rPr>
+      </w:pPr>
+      <w:r>
+        <w:rPr>
+          <w:rFonts w:ascii="Arial" w:hAnsi="Arial"/>
+          <w:sz w:val="24"/>
+          <w:szCs w:val="24"/>
+        </w:rPr>
+        <w:t>als contains identity information across two social levels. This pipeline is available for use on GitHub (PaRsynth, TKTK  LINK). We generate two synthetic datsets using this pipeline to describe how the R package works.</w:t>
+      </w:r>
+    </w:p>
+    <w:p>
+      <w:pPr>
+        <w:rPr>
+          <w:rFonts w:ascii="Arial" w:hAnsi="Arial"/>
+          <w:sz w:val="24"/>
+          <w:szCs w:val="24"/>
+        </w:rPr>
+      </w:pPr>
+    </w:p>
+    <w:p>
+      <w:pPr>
+        <w:rPr>
+          <w:rFonts w:ascii="Arial" w:hAnsi="Arial"/>
+          <w:sz w:val="24"/>
+          <w:szCs w:val="24"/>
+        </w:rPr>
+      </w:pPr>
+      <w:r>
+        <w:rPr>
+          <w:rFonts w:ascii="Arial" w:hAnsi="Arial"/>
           <w:sz w:val="24"/>
           <w:szCs w:val="24"/>
         </w:rPr>
@@ -425,183 +920,202 @@
       </w:r>
       <w:r>
         <w:rPr>
-          <w:rFonts w:ascii="Times New Roman" w:hAnsi="Times New Roman" w:cs="Times New Roman"/>
-          <w:sz w:val="24"/>
-          <w:szCs w:val="24"/>
-        </w:rPr>
-        <w:t xml:space="preserve">generation is </w:t>
-      </w:r>
-      <w:r>
-        <w:rPr>
-          <w:rFonts w:ascii="Times New Roman" w:hAnsi="Times New Roman" w:cs="Times New Roman"/>
-          <w:sz w:val="24"/>
-          <w:szCs w:val="24"/>
-        </w:rPr>
-        <w:t xml:space="preserve">publicly available for use, and currently allows for customization of how much, and what kinds, of information are encoded in signals. Further, users </w:t>
-      </w:r>
-      <w:proofErr w:type="spellStart"/>
-      <w:r>
-        <w:rPr>
-          <w:rFonts w:ascii="Times New Roman" w:hAnsi="Times New Roman" w:cs="Times New Roman"/>
-          <w:sz w:val="24"/>
-          <w:szCs w:val="24"/>
-        </w:rPr>
-        <w:t>con</w:t>
-      </w:r>
-      <w:proofErr w:type="spellEnd"/>
-      <w:r>
-        <w:rPr>
-          <w:rFonts w:ascii="Times New Roman" w:hAnsi="Times New Roman" w:cs="Times New Roman"/>
-          <w:sz w:val="24"/>
-          <w:szCs w:val="24"/>
-        </w:rPr>
-        <w:t xml:space="preserve"> control the social environment </w:t>
-      </w:r>
-      <w:proofErr w:type="spellStart"/>
-      <w:r>
-        <w:rPr>
-          <w:rFonts w:ascii="Times New Roman" w:hAnsi="Times New Roman" w:cs="Times New Roman"/>
-          <w:sz w:val="24"/>
-          <w:szCs w:val="24"/>
-        </w:rPr>
-        <w:t>sgnals</w:t>
-      </w:r>
-      <w:proofErr w:type="spellEnd"/>
-      <w:r>
-        <w:rPr>
-          <w:rFonts w:ascii="Times New Roman" w:hAnsi="Times New Roman" w:cs="Times New Roman"/>
-          <w:sz w:val="24"/>
-          <w:szCs w:val="24"/>
-        </w:rPr>
-        <w:t xml:space="preserve"> are generated in, allows for simulates tests of </w:t>
-      </w:r>
-      <w:proofErr w:type="spellStart"/>
-      <w:r>
-        <w:rPr>
-          <w:rFonts w:ascii="Times New Roman" w:hAnsi="Times New Roman" w:cs="Times New Roman"/>
-          <w:sz w:val="24"/>
-          <w:szCs w:val="24"/>
-        </w:rPr>
-        <w:t>hypoitheses</w:t>
-      </w:r>
-      <w:proofErr w:type="spellEnd"/>
-      <w:r>
-        <w:rPr>
-          <w:rFonts w:ascii="Times New Roman" w:hAnsi="Times New Roman" w:cs="Times New Roman"/>
-          <w:sz w:val="24"/>
-          <w:szCs w:val="24"/>
-        </w:rPr>
-        <w:t xml:space="preserve"> that link social condition of vocal information encoding. Finally, our manuscript provided evidence that traditional bioacoustics tools can accurately detect multilevel information </w:t>
-      </w:r>
-      <w:proofErr w:type="spellStart"/>
-      <w:r>
-        <w:rPr>
-          <w:rFonts w:ascii="Times New Roman" w:hAnsi="Times New Roman" w:cs="Times New Roman"/>
-          <w:sz w:val="24"/>
-          <w:szCs w:val="24"/>
-        </w:rPr>
-        <w:t>enoded</w:t>
-      </w:r>
-      <w:proofErr w:type="spellEnd"/>
-      <w:r>
-        <w:rPr>
-          <w:rFonts w:ascii="Times New Roman" w:hAnsi="Times New Roman" w:cs="Times New Roman"/>
-          <w:sz w:val="24"/>
-          <w:szCs w:val="24"/>
-        </w:rPr>
-        <w:t xml:space="preserve"> in frequency modulation patterns of vocalizations. Together, </w:t>
-      </w:r>
-      <w:proofErr w:type="spellStart"/>
-      <w:r>
-        <w:rPr>
-          <w:rFonts w:ascii="Times New Roman" w:hAnsi="Times New Roman" w:cs="Times New Roman"/>
-          <w:sz w:val="24"/>
-          <w:szCs w:val="24"/>
-        </w:rPr>
-        <w:t>ths</w:t>
-      </w:r>
-      <w:proofErr w:type="spellEnd"/>
-      <w:r>
-        <w:rPr>
-          <w:rFonts w:ascii="Times New Roman" w:hAnsi="Times New Roman" w:cs="Times New Roman"/>
-          <w:sz w:val="24"/>
-          <w:szCs w:val="24"/>
-        </w:rPr>
-        <w:t xml:space="preserve"> manuscript will be of broad interest to those studying communicative complexity, information encoding, identity signaling, and vocal learning. </w:t>
-      </w:r>
-    </w:p>
-    <w:p>
-      <w:pPr>
-        <w:rPr>
-          <w:rFonts w:ascii="Times New Roman" w:hAnsi="Times New Roman" w:cs="Times New Roman"/>
-          <w:sz w:val="24"/>
-          <w:szCs w:val="24"/>
-        </w:rPr>
-      </w:pPr>
-    </w:p>
-    <w:p>
-      <w:pPr>
-        <w:rPr>
-          <w:rFonts w:ascii="Times New Roman" w:hAnsi="Times New Roman" w:cs="Times New Roman"/>
-          <w:sz w:val="24"/>
-          <w:szCs w:val="24"/>
-        </w:rPr>
-      </w:pPr>
-      <w:r>
-        <w:rPr>
-          <w:rFonts w:ascii="Times New Roman" w:hAnsi="Times New Roman" w:cs="Times New Roman"/>
-          <w:sz w:val="24"/>
-          <w:szCs w:val="24"/>
-        </w:rPr>
-        <w:lastRenderedPageBreak/>
-        <w:t xml:space="preserve">Sincerely, </w:t>
-      </w:r>
-    </w:p>
-    <w:p>
-      <w:pPr>
-        <w:rPr>
-          <w:rFonts w:ascii="Times New Roman" w:hAnsi="Times New Roman" w:cs="Times New Roman"/>
-          <w:sz w:val="24"/>
-          <w:szCs w:val="24"/>
-        </w:rPr>
-      </w:pPr>
-      <w:r>
-        <w:rPr>
-          <w:rFonts w:ascii="Times New Roman" w:hAnsi="Times New Roman" w:cs="Times New Roman"/>
-          <w:sz w:val="24"/>
-          <w:szCs w:val="24"/>
-        </w:rPr>
-        <w:t>Brittany Coppinger, PhD</w:t>
-      </w:r>
-    </w:p>
-    <w:p>
-      <w:pPr>
-        <w:rPr>
-          <w:rFonts w:ascii="Times New Roman" w:hAnsi="Times New Roman" w:cs="Times New Roman"/>
-          <w:sz w:val="24"/>
-          <w:szCs w:val="24"/>
-        </w:rPr>
-      </w:pPr>
-      <w:r>
-        <w:rPr>
-          <w:rFonts w:ascii="Times New Roman" w:hAnsi="Times New Roman" w:cs="Times New Roman"/>
-          <w:sz w:val="24"/>
-          <w:szCs w:val="24"/>
-        </w:rPr>
-        <w:t>Postdoctoral Researcher</w:t>
-      </w:r>
-    </w:p>
-    <w:p>
-      <w:pPr>
-        <w:rPr>
-          <w:rFonts w:ascii="Times New Roman" w:hAnsi="Times New Roman" w:cs="Times New Roman"/>
-          <w:sz w:val="24"/>
-          <w:szCs w:val="24"/>
-        </w:rPr>
-      </w:pPr>
-      <w:r>
-        <w:rPr>
-          <w:rFonts w:ascii="Times New Roman" w:hAnsi="Times New Roman" w:cs="Times New Roman"/>
+          <w:rFonts w:ascii="Arial" w:hAnsi="Arial"/>
+          <w:sz w:val="24"/>
+          <w:szCs w:val="24"/>
+        </w:rPr>
+        <w:t xml:space="preserve">generation is publicly available for use, and currently allows for customization of how much, and what kinds, of information are encoded in signals. Further, users con control the social environment sgnals are generated in, allows for simulates tests of hypoitheses that link social condition of vocal information encoding. Finally, our manuscript provided evidence that traditional bioacoustics tools can accurately detect multilevel information enoded in frequency modulation patterns of vocalizations. Together, ths manuscript will be of broad interest to those studying communicative complexity, information encoding, identity signaling, and vocal learning. </w:t>
+      </w:r>
+    </w:p>
+    <w:p>
+      <w:pPr>
+        <w:rPr>
+          <w:rFonts w:ascii="Arial" w:hAnsi="Arial"/>
+          <w:sz w:val="24"/>
+          <w:szCs w:val="24"/>
+        </w:rPr>
+      </w:pPr>
+    </w:p>
+    <w:p>
+      <w:pPr>
+        <w:spacing w:after="0"/>
+        <w:rPr>
+          <w:rFonts w:ascii="Arial" w:hAnsi="Arial"/>
+          <w:sz w:val="24"/>
+          <w:szCs w:val="24"/>
+        </w:rPr>
+      </w:pPr>
+      <w:r>
+        <w:rPr>
+          <w:rFonts w:ascii="Arial" w:hAnsi="Arial"/>
+          <w:sz w:val="24"/>
+          <w:szCs w:val="24"/>
+        </w:rPr>
+        <w:t>Sincerely,</w:t>
+      </w:r>
+    </w:p>
+    <w:p>
+      <w:pPr>
+        <w:spacing w:after="0"/>
+        <w:rPr>
+          <w:rFonts w:ascii="Arial" w:hAnsi="Arial"/>
+          <w:sz w:val="24"/>
+          <w:szCs w:val="24"/>
+        </w:rPr>
+      </w:pPr>
+    </w:p>
+    <w:p>
+      <w:pPr>
+        <w:spacing w:after="0"/>
+        <w:rPr>
+          <w:rFonts w:ascii="Arial" w:hAnsi="Arial"/>
+          <w:sz w:val="24"/>
+          <w:szCs w:val="24"/>
+        </w:rPr>
+      </w:pPr>
+    </w:p>
+    <w:p>
+      <w:pPr>
+        <w:spacing w:after="0"/>
+        <w:rPr>
+          <w:rFonts w:ascii="Arial" w:hAnsi="Arial"/>
+          <w:sz w:val="24"/>
+          <w:szCs w:val="24"/>
+        </w:rPr>
+      </w:pPr>
+    </w:p>
+    <w:p>
+      <w:pPr>
+        <w:spacing w:after="0"/>
+        <w:rPr>
+          <w:rFonts w:ascii="Arial" w:hAnsi="Arial"/>
+          <w:sz w:val="24"/>
+          <w:szCs w:val="24"/>
+        </w:rPr>
+      </w:pPr>
+    </w:p>
+    <w:p>
+      <w:pPr>
+        <w:spacing w:after="0"/>
+        <w:rPr>
+          <w:rFonts w:ascii="Arial" w:hAnsi="Arial"/>
+          <w:sz w:val="24"/>
+          <w:szCs w:val="24"/>
+        </w:rPr>
+      </w:pPr>
+    </w:p>
+    <w:p>
+      <w:pPr>
+        <w:spacing w:after="0"/>
+        <w:rPr>
+          <w:rFonts w:ascii="Arial" w:hAnsi="Arial"/>
+          <w:sz w:val="24"/>
+          <w:szCs w:val="24"/>
+        </w:rPr>
+      </w:pPr>
+      <w:r>
+        <w:rPr>
+          <w:rFonts w:ascii="Arial" w:hAnsi="Arial"/>
+          <w:sz w:val="24"/>
+          <w:szCs w:val="24"/>
+        </w:rPr>
+        <w:t>Grace Smith-Vidaurre</w:t>
+      </w:r>
+    </w:p>
+    <w:p>
+      <w:pPr>
+        <w:spacing w:after="0"/>
+        <w:rPr>
+          <w:rFonts w:ascii="Arial" w:hAnsi="Arial"/>
+          <w:sz w:val="24"/>
+          <w:szCs w:val="24"/>
+        </w:rPr>
+      </w:pPr>
+    </w:p>
+    <w:p>
+      <w:pPr>
+        <w:spacing w:after="0"/>
+        <w:rPr>
+          <w:rFonts w:ascii="Arial" w:hAnsi="Arial"/>
+          <w:sz w:val="24"/>
+          <w:szCs w:val="24"/>
+        </w:rPr>
+      </w:pPr>
+      <w:r>
+        <w:rPr>
+          <w:rFonts w:ascii="Arial" w:hAnsi="Arial"/>
+          <w:sz w:val="24"/>
+          <w:szCs w:val="24"/>
+        </w:rPr>
+        <w:t>1855 Assistant Professor</w:t>
+      </w:r>
+    </w:p>
+    <w:p>
+      <w:pPr>
+        <w:spacing w:after="0"/>
+        <w:rPr>
+          <w:rFonts w:ascii="Arial" w:hAnsi="Arial"/>
+          <w:sz w:val="24"/>
+          <w:szCs w:val="24"/>
+        </w:rPr>
+      </w:pPr>
+      <w:r>
+        <w:rPr>
+          <w:rFonts w:ascii="Arial" w:hAnsi="Arial"/>
+          <w:sz w:val="24"/>
+          <w:szCs w:val="24"/>
+        </w:rPr>
+        <w:t>Department of Integrative Biology</w:t>
+      </w:r>
+    </w:p>
+    <w:p>
+      <w:pPr>
+        <w:spacing w:after="0"/>
+        <w:rPr>
+          <w:rFonts w:ascii="Arial" w:hAnsi="Arial"/>
+          <w:sz w:val="24"/>
+          <w:szCs w:val="24"/>
+        </w:rPr>
+      </w:pPr>
+      <w:r>
+        <w:rPr>
+          <w:rFonts w:ascii="Arial" w:hAnsi="Arial"/>
+          <w:sz w:val="24"/>
+          <w:szCs w:val="24"/>
+        </w:rPr>
+        <w:t>Department of Computational Mathematics, Science, and Engineering</w:t>
+      </w:r>
+    </w:p>
+    <w:p>
+      <w:pPr>
+        <w:spacing w:after="0"/>
+        <w:rPr>
+          <w:rFonts w:ascii="Arial" w:hAnsi="Arial"/>
+          <w:sz w:val="24"/>
+          <w:szCs w:val="24"/>
+        </w:rPr>
+      </w:pPr>
+      <w:r>
+        <w:rPr>
+          <w:rFonts w:ascii="Arial" w:hAnsi="Arial"/>
+          <w:sz w:val="24"/>
+          <w:szCs w:val="24"/>
+        </w:rPr>
+        <w:t>Ecology, Evolution, and Behavior Program</w:t>
+      </w:r>
+    </w:p>
+    <w:p>
+      <w:pPr>
+        <w:spacing w:after="0"/>
+        <w:rPr>
+          <w:rFonts w:ascii="Arial" w:hAnsi="Arial"/>
+          <w:sz w:val="24"/>
+          <w:szCs w:val="24"/>
+        </w:rPr>
+      </w:pPr>
+      <w:r>
+        <w:rPr>
+          <w:rFonts w:ascii="Arial" w:hAnsi="Arial"/>
           <w:sz w:val="24"/>
           <w:szCs w:val="24"/>
         </w:rPr>
@@ -610,32 +1124,128 @@
     </w:p>
     <w:p>
       <w:pPr>
-        <w:rPr>
-          <w:rFonts w:ascii="Times New Roman" w:hAnsi="Times New Roman" w:cs="Times New Roman"/>
-          <w:sz w:val="24"/>
-          <w:szCs w:val="24"/>
-        </w:rPr>
-      </w:pPr>
-    </w:p>
-    <w:p>
-      <w:pPr>
-        <w:rPr>
-          <w:rFonts w:ascii="Times New Roman" w:hAnsi="Times New Roman" w:cs="Times New Roman"/>
-          <w:sz w:val="24"/>
-          <w:szCs w:val="24"/>
-        </w:rPr>
-      </w:pPr>
-      <w:r>
-        <w:rPr>
-          <w:rFonts w:ascii="Times New Roman" w:hAnsi="Times New Roman" w:cs="Times New Roman"/>
+        <w:spacing w:after="0"/>
+        <w:rPr>
+          <w:rFonts w:ascii="Arial" w:hAnsi="Arial"/>
+          <w:sz w:val="24"/>
+          <w:szCs w:val="24"/>
+        </w:rPr>
+      </w:pPr>
+    </w:p>
+    <w:p>
+      <w:pPr>
+        <w:spacing w:after="0"/>
+        <w:rPr>
+          <w:rFonts w:ascii="Arial" w:hAnsi="Arial"/>
+          <w:sz w:val="24"/>
+          <w:szCs w:val="24"/>
+        </w:rPr>
+      </w:pPr>
+    </w:p>
+    <w:p>
+      <w:pPr>
+        <w:spacing w:after="0"/>
+        <w:rPr>
+          <w:rFonts w:ascii="Arial" w:hAnsi="Arial"/>
+          <w:sz w:val="24"/>
+          <w:szCs w:val="24"/>
+        </w:rPr>
+      </w:pPr>
+    </w:p>
+    <w:p>
+      <w:pPr>
+        <w:spacing w:after="0"/>
+        <w:rPr>
+          <w:rFonts w:ascii="Arial" w:hAnsi="Arial"/>
+          <w:sz w:val="24"/>
+          <w:szCs w:val="24"/>
+        </w:rPr>
+      </w:pPr>
+    </w:p>
+    <w:p>
+      <w:pPr>
+        <w:spacing w:after="0"/>
+        <w:rPr>
+          <w:rFonts w:ascii="Arial" w:hAnsi="Arial"/>
+          <w:sz w:val="24"/>
+          <w:szCs w:val="24"/>
+        </w:rPr>
+      </w:pPr>
+      <w:r>
+        <w:rPr>
+          <w:rFonts w:ascii="Arial" w:hAnsi="Arial"/>
           <w:sz w:val="24"/>
           <w:szCs w:val="24"/>
         </w:rPr>
         <w:t>Potential Reviewers</w:t>
       </w:r>
     </w:p>
+    <w:p>
+      <w:pPr>
+        <w:spacing w:after="0"/>
+        <w:rPr>
+          <w:rFonts w:ascii="Arial" w:hAnsi="Arial"/>
+          <w:sz w:val="24"/>
+          <w:szCs w:val="24"/>
+        </w:rPr>
+      </w:pPr>
+    </w:p>
+    <w:p>
+      <w:pPr>
+        <w:spacing w:after="0"/>
+        <w:rPr>
+          <w:rFonts w:ascii="Arial" w:hAnsi="Arial"/>
+          <w:sz w:val="24"/>
+          <w:szCs w:val="24"/>
+        </w:rPr>
+      </w:pPr>
+      <w:r>
+        <w:rPr>
+          <w:rFonts w:ascii="Arial" w:hAnsi="Arial"/>
+          <w:sz w:val="24"/>
+          <w:szCs w:val="24"/>
+        </w:rPr>
+        <w:t>Nicole Creanza</w:t>
+      </w:r>
+    </w:p>
+    <w:p>
+      <w:pPr>
+        <w:spacing w:after="0"/>
+        <w:rPr>
+          <w:rFonts w:ascii="Arial" w:hAnsi="Arial"/>
+          <w:sz w:val="24"/>
+          <w:szCs w:val="24"/>
+        </w:rPr>
+      </w:pPr>
+      <w:r>
+        <w:rPr>
+          <w:rFonts w:ascii="Arial" w:hAnsi="Arial"/>
+          <w:sz w:val="24"/>
+          <w:szCs w:val="24"/>
+        </w:rPr>
+        <w:t>Audrey ? Anikin</w:t>
+      </w:r>
+    </w:p>
+    <w:p>
+      <w:pPr>
+        <w:spacing w:after="0"/>
+        <w:rPr>
+          <w:rFonts w:ascii="Arial" w:hAnsi="Arial"/>
+          <w:sz w:val="24"/>
+          <w:szCs w:val="24"/>
+        </w:rPr>
+      </w:pPr>
+      <w:r>
+        <w:rPr>
+          <w:rFonts w:ascii="Arial" w:hAnsi="Arial"/>
+          <w:sz w:val="24"/>
+          <w:szCs w:val="24"/>
+        </w:rPr>
+        <w:t>TKTK</w:t>
+      </w:r>
+    </w:p>
     <w:sectPr>
-      <w:headerReference w:type="first" r:id="rId12"/>
+      <w:headerReference w:type="first" r:id="rId8"/>
       <w:pgSz w:w="12240" w:h="15840" w:code="1"/>
       <w:pgMar w:top="1800" w:right="1800" w:bottom="1440" w:left="2635" w:header="720" w:footer="720" w:gutter="0"/>
       <w:cols w:space="720"/>
@@ -644,45 +1254,6 @@
     </w:sectPr>
   </w:body>
 </w:document>
-</file>
-
-<file path=word/comments.xml><?xml version="1.0" encoding="utf-8"?>
-<w:comments xmlns:wpc="http://schemas.microsoft.com/office/word/2010/wordprocessingCanvas" xmlns:cx="http://schemas.microsoft.com/office/drawing/2014/chartex" xmlns:cx1="http://schemas.microsoft.com/office/drawing/2015/9/8/chartex" xmlns:cx2="http://schemas.microsoft.com/office/drawing/2015/10/21/chartex" xmlns:cx3="http://schemas.microsoft.com/office/drawing/2016/5/9/chartex" xmlns:cx4="http://schemas.microsoft.com/office/drawing/2016/5/10/chartex" xmlns:cx5="http://schemas.microsoft.com/office/drawing/2016/5/11/chartex" xmlns:cx6="http://schemas.microsoft.com/office/drawing/2016/5/12/chartex" xmlns:cx7="http://schemas.microsoft.com/office/drawing/2016/5/13/chartex" xmlns:cx8="http://schemas.microsoft.com/office/drawing/2016/5/14/chartex" xmlns:mc="http://schemas.openxmlformats.org/markup-compatibility/2006" xmlns:aink="http://schemas.microsoft.com/office/drawing/2016/ink" xmlns:am3d="http://schemas.microsoft.com/office/drawing/2017/model3d" xmlns:o="urn:schemas-microsoft-com:office:office" xmlns:oel="http://schemas.microsoft.com/office/2019/extlst" xmlns:r="http://schemas.openxmlformats.org/officeDocument/2006/relationships" xmlns:m="http://schemas.openxmlformats.org/officeDocument/2006/math" xmlns:v="urn:schemas-microsoft-com:vml" xmlns:wp14="http://schemas.microsoft.com/office/word/2010/wordprocessingDrawing" xmlns:wp="http://schemas.openxmlformats.org/drawingml/2006/wordprocessingDrawing" xmlns:w10="urn:schemas-microsoft-com:office:word" xmlns:w="http://schemas.openxmlformats.org/wordprocessingml/2006/main" xmlns:w14="http://schemas.microsoft.com/office/word/2010/wordml" xmlns:w15="http://schemas.microsoft.com/office/word/2012/wordml" xmlns:w16cex="http://schemas.microsoft.com/office/word/2018/wordml/cex" xmlns:w16cid="http://schemas.microsoft.com/office/word/2016/wordml/cid" xmlns:w16="http://schemas.microsoft.com/office/word/2018/wordml" xmlns:w16du="http://schemas.microsoft.com/office/word/2023/wordml/word16du" xmlns:w16sdtdh="http://schemas.microsoft.com/office/word/2020/wordml/sdtdatahash" xmlns:w16sdtfl="http://schemas.microsoft.com/office/word/2024/wordml/sdtformatlock" xmlns:w16se="http://schemas.microsoft.com/office/word/2015/wordml/symex" xmlns:wpg="http://schemas.microsoft.com/office/word/2010/wordprocessingGroup" xmlns:wpi="http://schemas.microsoft.com/office/word/2010/wordprocessingInk" xmlns:wne="http://schemas.microsoft.com/office/word/2006/wordml" xmlns:wps="http://schemas.microsoft.com/office/word/2010/wordprocessingShape" mc:Ignorable="w14 w15 w16se w16cid w16 w16cex w16sdtdh w16sdtfl w16du wp14">
-  <w:comment w:id="0" w:author="Coppinger, Brittany" w:date="2025-07-28T13:59:00Z" w:initials="BC">
-    <w:p>
-      <w:pPr>
-        <w:pStyle w:val="CommentText"/>
-      </w:pPr>
-      <w:r>
-        <w:rPr>
-          <w:rStyle w:val="CommentReference"/>
-        </w:rPr>
-        <w:annotationRef/>
-      </w:r>
-      <w:r>
-        <w:t>Should I provide more detail here (how the package works, what conditions we manipulated?) or keep it super brief like this?</w:t>
-      </w:r>
-    </w:p>
-  </w:comment>
-</w:comments>
-</file>
-
-<file path=word/commentsExtended.xml><?xml version="1.0" encoding="utf-8"?>
-<w15:commentsEx xmlns:wpc="http://schemas.microsoft.com/office/word/2010/wordprocessingCanvas" xmlns:cx="http://schemas.microsoft.com/office/drawing/2014/chartex" xmlns:cx1="http://schemas.microsoft.com/office/drawing/2015/9/8/chartex" xmlns:cx2="http://schemas.microsoft.com/office/drawing/2015/10/21/chartex" xmlns:cx3="http://schemas.microsoft.com/office/drawing/2016/5/9/chartex" xmlns:cx4="http://schemas.microsoft.com/office/drawing/2016/5/10/chartex" xmlns:cx5="http://schemas.microsoft.com/office/drawing/2016/5/11/chartex" xmlns:cx6="http://schemas.microsoft.com/office/drawing/2016/5/12/chartex" xmlns:cx7="http://schemas.microsoft.com/office/drawing/2016/5/13/chartex" xmlns:cx8="http://schemas.microsoft.com/office/drawing/2016/5/14/chartex" xmlns:mc="http://schemas.openxmlformats.org/markup-compatibility/2006" xmlns:aink="http://schemas.microsoft.com/office/drawing/2016/ink" xmlns:am3d="http://schemas.microsoft.com/office/drawing/2017/model3d" xmlns:o="urn:schemas-microsoft-com:office:office" xmlns:oel="http://schemas.microsoft.com/office/2019/extlst" xmlns:r="http://schemas.openxmlformats.org/officeDocument/2006/relationships" xmlns:m="http://schemas.openxmlformats.org/officeDocument/2006/math" xmlns:v="urn:schemas-microsoft-com:vml" xmlns:wp14="http://schemas.microsoft.com/office/word/2010/wordprocessingDrawing" xmlns:wp="http://schemas.openxmlformats.org/drawingml/2006/wordprocessingDrawing" xmlns:w10="urn:schemas-microsoft-com:office:word" xmlns:w="http://schemas.openxmlformats.org/wordprocessingml/2006/main" xmlns:w14="http://schemas.microsoft.com/office/word/2010/wordml" xmlns:w15="http://schemas.microsoft.com/office/word/2012/wordml" xmlns:w16cex="http://schemas.microsoft.com/office/word/2018/wordml/cex" xmlns:w16cid="http://schemas.microsoft.com/office/word/2016/wordml/cid" xmlns:w16="http://schemas.microsoft.com/office/word/2018/wordml" xmlns:w16du="http://schemas.microsoft.com/office/word/2023/wordml/word16du" xmlns:w16sdtdh="http://schemas.microsoft.com/office/word/2020/wordml/sdtdatahash" xmlns:w16sdtfl="http://schemas.microsoft.com/office/word/2024/wordml/sdtformatlock" xmlns:w16se="http://schemas.microsoft.com/office/word/2015/wordml/symex" xmlns:wpg="http://schemas.microsoft.com/office/word/2010/wordprocessingGroup" xmlns:wpi="http://schemas.microsoft.com/office/word/2010/wordprocessingInk" xmlns:wne="http://schemas.microsoft.com/office/word/2006/wordml" xmlns:wps="http://schemas.microsoft.com/office/word/2010/wordprocessingShape" mc:Ignorable="w14 w15 w16se w16cid w16 w16cex w16sdtdh w16sdtfl w16du wp14">
-  <w15:commentEx w15:paraId="11BC6516" w15:done="0"/>
-</w15:commentsEx>
-</file>
-
-<file path=word/commentsExtensible.xml><?xml version="1.0" encoding="utf-8"?>
-<w16cex:commentsExtensible xmlns:wpc="http://schemas.microsoft.com/office/word/2010/wordprocessingCanvas" xmlns:cx="http://schemas.microsoft.com/office/drawing/2014/chartex" xmlns:cx1="http://schemas.microsoft.com/office/drawing/2015/9/8/chartex" xmlns:cx2="http://schemas.microsoft.com/office/drawing/2015/10/21/chartex" xmlns:cx3="http://schemas.microsoft.com/office/drawing/2016/5/9/chartex" xmlns:cx4="http://schemas.microsoft.com/office/drawing/2016/5/10/chartex" xmlns:cx5="http://schemas.microsoft.com/office/drawing/2016/5/11/chartex" xmlns:cx6="http://schemas.microsoft.com/office/drawing/2016/5/12/chartex" xmlns:cx7="http://schemas.microsoft.com/office/drawing/2016/5/13/chartex" xmlns:cx8="http://schemas.microsoft.com/office/drawing/2016/5/14/chartex" xmlns:cr="http://schemas.microsoft.com/office/comments/2020/reactions" xmlns:mc="http://schemas.openxmlformats.org/markup-compatibility/2006" xmlns:aink="http://schemas.microsoft.com/office/drawing/2016/ink" xmlns:am3d="http://schemas.microsoft.com/office/drawing/2017/model3d" xmlns:o="urn:schemas-microsoft-com:office:office" xmlns:oel="http://schemas.microsoft.com/office/2019/extlst" xmlns:r="http://schemas.openxmlformats.org/officeDocument/2006/relationships" xmlns:m="http://schemas.openxmlformats.org/officeDocument/2006/math" xmlns:v="urn:schemas-microsoft-com:vml" xmlns:wp14="http://schemas.microsoft.com/office/word/2010/wordprocessingDrawing" xmlns:wp="http://schemas.openxmlformats.org/drawingml/2006/wordprocessingDrawing" xmlns:w10="urn:schemas-microsoft-com:office:word" xmlns:w="http://schemas.openxmlformats.org/wordprocessingml/2006/main" xmlns:w14="http://schemas.microsoft.com/office/word/2010/wordml" xmlns:w15="http://schemas.microsoft.com/office/word/2012/wordml" xmlns:w16cex="http://schemas.microsoft.com/office/word/2018/wordml/cex" xmlns:w16cid="http://schemas.microsoft.com/office/word/2016/wordml/cid" xmlns:w16="http://schemas.microsoft.com/office/word/2018/wordml" xmlns:w16du="http://schemas.microsoft.com/office/word/2023/wordml/word16du" xmlns:w16sdtdh="http://schemas.microsoft.com/office/word/2020/wordml/sdtdatahash" xmlns:w16sdtfl="http://schemas.microsoft.com/office/word/2024/wordml/sdtformatlock" xmlns:w16se="http://schemas.microsoft.com/office/word/2015/wordml/symex" xmlns:wpg="http://schemas.microsoft.com/office/word/2010/wordprocessingGroup" xmlns:wpi="http://schemas.microsoft.com/office/word/2010/wordprocessingInk" xmlns:wne="http://schemas.microsoft.com/office/word/2006/wordml" xmlns:wps="http://schemas.microsoft.com/office/word/2010/wordprocessingShape" mc:Ignorable="w14 w15 w16se w16cid w16 w16cex w16sdtdh w16sdtfl cr w16du wp14">
-  <w16cex:commentExtensible w16cex:durableId="1A419D92" w16cex:dateUtc="2025-07-28T17:59:00Z"/>
-</w16cex:commentsExtensible>
-</file>
-
-<file path=word/commentsIds.xml><?xml version="1.0" encoding="utf-8"?>
-<w16cid:commentsIds xmlns:wpc="http://schemas.microsoft.com/office/word/2010/wordprocessingCanvas" xmlns:cx="http://schemas.microsoft.com/office/drawing/2014/chartex" xmlns:cx1="http://schemas.microsoft.com/office/drawing/2015/9/8/chartex" xmlns:cx2="http://schemas.microsoft.com/office/drawing/2015/10/21/chartex" xmlns:cx3="http://schemas.microsoft.com/office/drawing/2016/5/9/chartex" xmlns:cx4="http://schemas.microsoft.com/office/drawing/2016/5/10/chartex" xmlns:cx5="http://schemas.microsoft.com/office/drawing/2016/5/11/chartex" xmlns:cx6="http://schemas.microsoft.com/office/drawing/2016/5/12/chartex" xmlns:cx7="http://schemas.microsoft.com/office/drawing/2016/5/13/chartex" xmlns:cx8="http://schemas.microsoft.com/office/drawing/2016/5/14/chartex" xmlns:mc="http://schemas.openxmlformats.org/markup-compatibility/2006" xmlns:aink="http://schemas.microsoft.com/office/drawing/2016/ink" xmlns:am3d="http://schemas.microsoft.com/office/drawing/2017/model3d" xmlns:o="urn:schemas-microsoft-com:office:office" xmlns:oel="http://schemas.microsoft.com/office/2019/extlst" xmlns:r="http://schemas.openxmlformats.org/officeDocument/2006/relationships" xmlns:m="http://schemas.openxmlformats.org/officeDocument/2006/math" xmlns:v="urn:schemas-microsoft-com:vml" xmlns:wp14="http://schemas.microsoft.com/office/word/2010/wordprocessingDrawing" xmlns:wp="http://schemas.openxmlformats.org/drawingml/2006/wordprocessingDrawing" xmlns:w10="urn:schemas-microsoft-com:office:word" xmlns:w="http://schemas.openxmlformats.org/wordprocessingml/2006/main" xmlns:w14="http://schemas.microsoft.com/office/word/2010/wordml" xmlns:w15="http://schemas.microsoft.com/office/word/2012/wordml" xmlns:w16cex="http://schemas.microsoft.com/office/word/2018/wordml/cex" xmlns:w16cid="http://schemas.microsoft.com/office/word/2016/wordml/cid" xmlns:w16="http://schemas.microsoft.com/office/word/2018/wordml" xmlns:w16du="http://schemas.microsoft.com/office/word/2023/wordml/word16du" xmlns:w16sdtdh="http://schemas.microsoft.com/office/word/2020/wordml/sdtdatahash" xmlns:w16sdtfl="http://schemas.microsoft.com/office/word/2024/wordml/sdtformatlock" xmlns:w16se="http://schemas.microsoft.com/office/word/2015/wordml/symex" xmlns:wpg="http://schemas.microsoft.com/office/word/2010/wordprocessingGroup" xmlns:wpi="http://schemas.microsoft.com/office/word/2010/wordprocessingInk" xmlns:wne="http://schemas.microsoft.com/office/word/2006/wordml" xmlns:wps="http://schemas.microsoft.com/office/word/2010/wordprocessingShape" mc:Ignorable="w14 w15 w16se w16cid w16 w16cex w16sdtdh w16sdtfl w16du wp14">
-  <w16cid:commentId w16cid:paraId="11BC6516" w16cid:durableId="1A419D92"/>
-</w16cid:commentsIds>
 </file>
 
 <file path=word/endnotes.xml><?xml version="1.0" encoding="utf-8"?>
@@ -1014,7 +1585,45 @@
                               <w:sz w:val="20"/>
                               <w:szCs w:val="20"/>
                             </w:rPr>
-                            <w:t>Dr. Brittany Coppinger</w:t>
+                            <w:t xml:space="preserve">Dr. </w:t>
+                          </w:r>
+                          <w:r>
+                            <w:rPr>
+                              <w:rFonts w:ascii="Arial" w:hAnsi="Arial"/>
+                              <w:color w:val="000000"/>
+                              <w:spacing w:val="1"/>
+                              <w:sz w:val="20"/>
+                              <w:szCs w:val="20"/>
+                            </w:rPr>
+                            <w:t xml:space="preserve">Grace </w:t>
+                          </w:r>
+                        </w:p>
+                        <w:p>
+                          <w:pPr>
+                            <w:autoSpaceDE w:val="0"/>
+                            <w:autoSpaceDN w:val="0"/>
+                            <w:adjustRightInd w:val="0"/>
+                            <w:spacing w:after="0"/>
+                            <w:contextualSpacing/>
+                            <w:jc w:val="right"/>
+                            <w:textAlignment w:val="center"/>
+                            <w:rPr>
+                              <w:rFonts w:ascii="Arial" w:hAnsi="Arial"/>
+                              <w:color w:val="000000"/>
+                              <w:spacing w:val="1"/>
+                              <w:sz w:val="20"/>
+                              <w:szCs w:val="20"/>
+                            </w:rPr>
+                          </w:pPr>
+                          <w:r>
+                            <w:rPr>
+                              <w:rFonts w:ascii="Arial" w:hAnsi="Arial"/>
+                              <w:color w:val="000000"/>
+                              <w:spacing w:val="1"/>
+                              <w:sz w:val="20"/>
+                              <w:szCs w:val="20"/>
+                            </w:rPr>
+                            <w:t>Smith-Vidaurre</w:t>
                           </w:r>
                         </w:p>
                         <w:p>
@@ -1096,19 +1705,8 @@
                               <w:sz w:val="14"/>
                               <w:szCs w:val="14"/>
                             </w:rPr>
-                            <w:t xml:space="preserve">Natural Science </w:t>
+                            <w:t>Natural Science Bldg</w:t>
                           </w:r>
-                          <w:proofErr w:type="spellStart"/>
-                          <w:r>
-                            <w:rPr>
-                              <w:rFonts w:ascii="Arial" w:hAnsi="Arial"/>
-                              <w:color w:val="000000"/>
-                              <w:sz w:val="14"/>
-                              <w:szCs w:val="14"/>
-                            </w:rPr>
-                            <w:t>Bldg</w:t>
-                          </w:r>
-                          <w:proofErr w:type="spellEnd"/>
                         </w:p>
                         <w:p>
                           <w:pPr>
@@ -1231,7 +1829,17 @@
                               <w:sz w:val="14"/>
                               <w:szCs w:val="14"/>
                             </w:rPr>
-                            <w:t>copping7@msu.edu</w:t>
+                            <w:t>smithvid</w:t>
+                          </w:r>
+                          <w:r>
+                            <w:rPr>
+                              <w:rFonts w:ascii="Arial" w:hAnsi="Arial"/>
+                              <w:color w:val="000000"/>
+                              <w:spacing w:val="-4"/>
+                              <w:sz w:val="14"/>
+                              <w:szCs w:val="14"/>
+                            </w:rPr>
+                            <w:t>@msu.edu</w:t>
                           </w:r>
                         </w:p>
                       </w:txbxContent>
@@ -1257,7 +1865,7 @@
               <v:stroke joinstyle="miter"/>
               <v:path gradientshapeok="t" o:connecttype="rect"/>
             </v:shapetype>
-            <v:shape id="Text Box 1" o:spid="_x0000_s1026" type="#_x0000_t202" style="position:absolute;margin-left:17.3pt;margin-top:462.25pt;width:90pt;height:237.35pt;z-index:251657728;visibility:visible;mso-wrap-style:square;mso-width-percent:0;mso-height-percent:0;mso-wrap-distance-left:9pt;mso-wrap-distance-top:0;mso-wrap-distance-right:9pt;mso-wrap-distance-bottom:0;mso-position-horizontal:absolute;mso-position-horizontal-relative:page;mso-position-vertical:absolute;mso-position-vertical-relative:page;mso-width-percent:0;mso-height-percent:0;mso-width-relative:page;mso-height-relative:page;v-text-anchor:top" o:gfxdata="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" o:allowoverlap="f" filled="f" stroked="f">
+            <v:shape id="Text Box 1" o:spid="_x0000_s1026" type="#_x0000_t202" style="position:absolute;margin-left:17.3pt;margin-top:462.25pt;width:90pt;height:237.35pt;z-index:251657728;visibility:visible;mso-wrap-style:square;mso-width-percent:0;mso-height-percent:0;mso-wrap-distance-left:9pt;mso-wrap-distance-top:0;mso-wrap-distance-right:9pt;mso-wrap-distance-bottom:0;mso-position-horizontal:absolute;mso-position-horizontal-relative:page;mso-position-vertical:absolute;mso-position-vertical-relative:page;mso-width-percent:0;mso-height-percent:0;mso-width-relative:page;mso-height-relative:page;v-text-anchor:top" o:gfxdata="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" o:allowoverlap="f" filled="f" stroked="f">
               <v:textbox inset="0,0,0,0">
                 <w:txbxContent>
                   <w:p>
@@ -1344,7 +1952,45 @@
                         <w:sz w:val="20"/>
                         <w:szCs w:val="20"/>
                       </w:rPr>
-                      <w:t>Dr. Brittany Coppinger</w:t>
+                      <w:t xml:space="preserve">Dr. </w:t>
+                    </w:r>
+                    <w:r>
+                      <w:rPr>
+                        <w:rFonts w:ascii="Arial" w:hAnsi="Arial"/>
+                        <w:color w:val="000000"/>
+                        <w:spacing w:val="1"/>
+                        <w:sz w:val="20"/>
+                        <w:szCs w:val="20"/>
+                      </w:rPr>
+                      <w:t xml:space="preserve">Grace </w:t>
+                    </w:r>
+                  </w:p>
+                  <w:p>
+                    <w:pPr>
+                      <w:autoSpaceDE w:val="0"/>
+                      <w:autoSpaceDN w:val="0"/>
+                      <w:adjustRightInd w:val="0"/>
+                      <w:spacing w:after="0"/>
+                      <w:contextualSpacing/>
+                      <w:jc w:val="right"/>
+                      <w:textAlignment w:val="center"/>
+                      <w:rPr>
+                        <w:rFonts w:ascii="Arial" w:hAnsi="Arial"/>
+                        <w:color w:val="000000"/>
+                        <w:spacing w:val="1"/>
+                        <w:sz w:val="20"/>
+                        <w:szCs w:val="20"/>
+                      </w:rPr>
+                    </w:pPr>
+                    <w:r>
+                      <w:rPr>
+                        <w:rFonts w:ascii="Arial" w:hAnsi="Arial"/>
+                        <w:color w:val="000000"/>
+                        <w:spacing w:val="1"/>
+                        <w:sz w:val="20"/>
+                        <w:szCs w:val="20"/>
+                      </w:rPr>
+                      <w:t>Smith-Vidaurre</w:t>
                     </w:r>
                   </w:p>
                   <w:p>
@@ -1426,19 +2072,8 @@
                         <w:sz w:val="14"/>
                         <w:szCs w:val="14"/>
                       </w:rPr>
-                      <w:t xml:space="preserve">Natural Science </w:t>
+                      <w:t>Natural Science Bldg</w:t>
                     </w:r>
-                    <w:proofErr w:type="spellStart"/>
-                    <w:r>
-                      <w:rPr>
-                        <w:rFonts w:ascii="Arial" w:hAnsi="Arial"/>
-                        <w:color w:val="000000"/>
-                        <w:sz w:val="14"/>
-                        <w:szCs w:val="14"/>
-                      </w:rPr>
-                      <w:t>Bldg</w:t>
-                    </w:r>
-                    <w:proofErr w:type="spellEnd"/>
                   </w:p>
                   <w:p>
                     <w:pPr>
@@ -1561,7 +2196,17 @@
                         <w:sz w:val="14"/>
                         <w:szCs w:val="14"/>
                       </w:rPr>
-                      <w:t>copping7@msu.edu</w:t>
+                      <w:t>smithvid</w:t>
+                    </w:r>
+                    <w:r>
+                      <w:rPr>
+                        <w:rFonts w:ascii="Arial" w:hAnsi="Arial"/>
+                        <w:color w:val="000000"/>
+                        <w:spacing w:val="-4"/>
+                        <w:sz w:val="14"/>
+                        <w:szCs w:val="14"/>
+                      </w:rPr>
+                      <w:t>@msu.edu</w:t>
                     </w:r>
                   </w:p>
                 </w:txbxContent>
@@ -2000,8 +2645,8 @@
 
 <file path=word/people.xml><?xml version="1.0" encoding="utf-8"?>
 <w15:people xmlns:wpc="http://schemas.microsoft.com/office/word/2010/wordprocessingCanvas" xmlns:cx="http://schemas.microsoft.com/office/drawing/2014/chartex" xmlns:cx1="http://schemas.microsoft.com/office/drawing/2015/9/8/chartex" xmlns:cx2="http://schemas.microsoft.com/office/drawing/2015/10/21/chartex" xmlns:cx3="http://schemas.microsoft.com/office/drawing/2016/5/9/chartex" xmlns:cx4="http://schemas.microsoft.com/office/drawing/2016/5/10/chartex" xmlns:cx5="http://schemas.microsoft.com/office/drawing/2016/5/11/chartex" xmlns:cx6="http://schemas.microsoft.com/office/drawing/2016/5/12/chartex" xmlns:cx7="http://schemas.microsoft.com/office/drawing/2016/5/13/chartex" xmlns:cx8="http://schemas.microsoft.com/office/drawing/2016/5/14/chartex" xmlns:mc="http://schemas.openxmlformats.org/markup-compatibility/2006" xmlns:aink="http://schemas.microsoft.com/office/drawing/2016/ink" xmlns:am3d="http://schemas.microsoft.com/office/drawing/2017/model3d" xmlns:o="urn:schemas-microsoft-com:office:office" xmlns:oel="http://schemas.microsoft.com/office/2019/extlst" xmlns:r="http://schemas.openxmlformats.org/officeDocument/2006/relationships" xmlns:m="http://schemas.openxmlformats.org/officeDocument/2006/math" xmlns:v="urn:schemas-microsoft-com:vml" xmlns:wp14="http://schemas.microsoft.com/office/word/2010/wordprocessingDrawing" xmlns:wp="http://schemas.openxmlformats.org/drawingml/2006/wordprocessingDrawing" xmlns:w10="urn:schemas-microsoft-com:office:word" xmlns:w="http://schemas.openxmlformats.org/wordprocessingml/2006/main" xmlns:w14="http://schemas.microsoft.com/office/word/2010/wordml" xmlns:w15="http://schemas.microsoft.com/office/word/2012/wordml" xmlns:w16cex="http://schemas.microsoft.com/office/word/2018/wordml/cex" xmlns:w16cid="http://schemas.microsoft.com/office/word/2016/wordml/cid" xmlns:w16="http://schemas.microsoft.com/office/word/2018/wordml" xmlns:w16du="http://schemas.microsoft.com/office/word/2023/wordml/word16du" xmlns:w16sdtdh="http://schemas.microsoft.com/office/word/2020/wordml/sdtdatahash" xmlns:w16sdtfl="http://schemas.microsoft.com/office/word/2024/wordml/sdtformatlock" xmlns:w16se="http://schemas.microsoft.com/office/word/2015/wordml/symex" xmlns:wpg="http://schemas.microsoft.com/office/word/2010/wordprocessingGroup" xmlns:wpi="http://schemas.microsoft.com/office/word/2010/wordprocessingInk" xmlns:wne="http://schemas.microsoft.com/office/word/2006/wordml" xmlns:wps="http://schemas.microsoft.com/office/word/2010/wordprocessingShape" mc:Ignorable="w14 w15 w16se w16cid w16 w16cex w16sdtdh w16sdtfl w16du wp14">
-  <w15:person w15:author="Coppinger, Brittany">
-    <w15:presenceInfo w15:providerId="AD" w15:userId="S::copping7@msu.edu::91362ca3-4f6d-449f-8348-5f9a1531276e"/>
+  <w15:person w15:author="Smith Vidaurre, Grace">
+    <w15:presenceInfo w15:providerId="AD" w15:userId="S::smithvid@msu.edu::b45b673c-2200-4042-a7e9-6ccf4d81cce7"/>
   </w15:person>
 </w15:people>
 </file>
@@ -2617,6 +3262,29 @@
       <w:bCs/>
     </w:rPr>
   </w:style>
+  <w:style w:type="character" w:styleId="Hyperlink">
+    <w:name w:val="Hyperlink"/>
+    <w:basedOn w:val="DefaultParagraphFont"/>
+    <w:uiPriority w:val="99"/>
+    <w:unhideWhenUsed/>
+    <w:rsid w:val="0064028B"/>
+    <w:rPr>
+      <w:color w:val="467886" w:themeColor="hyperlink"/>
+      <w:u w:val="single"/>
+    </w:rPr>
+  </w:style>
+  <w:style w:type="character" w:styleId="UnresolvedMention">
+    <w:name w:val="Unresolved Mention"/>
+    <w:basedOn w:val="DefaultParagraphFont"/>
+    <w:uiPriority w:val="99"/>
+    <w:semiHidden/>
+    <w:unhideWhenUsed/>
+    <w:rsid w:val="0064028B"/>
+    <w:rPr>
+      <w:color w:val="605E5C"/>
+      <w:shd w:val="clear" w:color="auto" w:fill="E1DFDD"/>
+    </w:rPr>
+  </w:style>
 </w:styles>
 </file>
 

</xml_diff>

<commit_message>
Draft of cover letter for BAC to review
</commit_message>
<xml_diff>
--- a/drafts/paRsynth_coverletter.docx
+++ b/drafts/paRsynth_coverletter.docx
@@ -23,7 +23,15 @@
           <w:sz w:val="24"/>
           <w:szCs w:val="24"/>
         </w:rPr>
-        <w:t>20</w:t>
+        <w:t>2</w:t>
+      </w:r>
+      <w:r>
+        <w:rPr>
+          <w:rFonts w:ascii="Arial" w:hAnsi="Arial"/>
+          <w:sz w:val="24"/>
+          <w:szCs w:val="24"/>
+        </w:rPr>
+        <w:t>1</w:t>
       </w:r>
       <w:r>
         <w:rPr>
@@ -666,7 +674,25 @@
           <w:sz w:val="24"/>
           <w:szCs w:val="24"/>
         </w:rPr>
-        <w:t xml:space="preserve">by sonifying character strings to produce </w:t>
+        <w:t xml:space="preserve">by </w:t>
+      </w:r>
+      <w:proofErr w:type="spellStart"/>
+      <w:r>
+        <w:rPr>
+          <w:rFonts w:ascii="Arial" w:hAnsi="Arial"/>
+          <w:sz w:val="24"/>
+          <w:szCs w:val="24"/>
+        </w:rPr>
+        <w:t>sonifying</w:t>
+      </w:r>
+      <w:proofErr w:type="spellEnd"/>
+      <w:r>
+        <w:rPr>
+          <w:rFonts w:ascii="Arial" w:hAnsi="Arial"/>
+          <w:sz w:val="24"/>
+          <w:szCs w:val="24"/>
+        </w:rPr>
+        <w:t xml:space="preserve"> character strings to produce </w:t>
       </w:r>
       <w:r>
         <w:rPr>
@@ -722,71 +748,31 @@
           <w:sz w:val="24"/>
           <w:szCs w:val="24"/>
         </w:rPr>
-        <w:t xml:space="preserve">. These acoustic structures </w:t>
-      </w:r>
-      <w:r>
-        <w:rPr>
-          <w:rFonts w:ascii="Arial" w:hAnsi="Arial"/>
-          <w:sz w:val="24"/>
-          <w:szCs w:val="24"/>
-        </w:rPr>
-        <w:t xml:space="preserve">are known to be </w:t>
-      </w:r>
-      <w:r>
-        <w:rPr>
-          <w:rFonts w:ascii="Arial" w:hAnsi="Arial"/>
-          <w:sz w:val="24"/>
-          <w:szCs w:val="24"/>
-        </w:rPr>
-        <w:t xml:space="preserve">used for </w:t>
-      </w:r>
-      <w:r>
-        <w:rPr>
-          <w:rFonts w:ascii="Arial" w:hAnsi="Arial"/>
-          <w:sz w:val="24"/>
-          <w:szCs w:val="24"/>
-        </w:rPr>
-        <w:t>encoding both group and individual identity information</w:t>
-      </w:r>
-      <w:r>
-        <w:rPr>
-          <w:rFonts w:ascii="Arial" w:hAnsi="Arial"/>
-          <w:sz w:val="24"/>
-          <w:szCs w:val="24"/>
-        </w:rPr>
-        <w:t xml:space="preserve"> by signalers</w:t>
-      </w:r>
-      <w:r>
-        <w:rPr>
-          <w:rFonts w:ascii="Arial" w:hAnsi="Arial"/>
-          <w:sz w:val="24"/>
-          <w:szCs w:val="24"/>
-        </w:rPr>
-        <w:t xml:space="preserve">, and are also used for </w:t>
-      </w:r>
-      <w:r>
-        <w:rPr>
-          <w:rFonts w:ascii="Arial" w:hAnsi="Arial"/>
-          <w:sz w:val="24"/>
-          <w:szCs w:val="24"/>
-        </w:rPr>
-        <w:t>social recognition</w:t>
-      </w:r>
-      <w:r>
-        <w:rPr>
-          <w:rFonts w:ascii="Arial" w:hAnsi="Arial"/>
-          <w:sz w:val="24"/>
-          <w:szCs w:val="24"/>
-        </w:rPr>
-        <w:t xml:space="preserve"> by </w:t>
-      </w:r>
-      <w:r>
-        <w:rPr>
-          <w:rFonts w:ascii="Arial" w:hAnsi="Arial"/>
-          <w:sz w:val="24"/>
-          <w:szCs w:val="24"/>
-        </w:rPr>
-        <w:t>receivers,</w:t>
+        <w:t xml:space="preserve">. </w:t>
+      </w:r>
+      <w:r>
+        <w:rPr>
+          <w:rFonts w:ascii="Arial" w:hAnsi="Arial"/>
+          <w:sz w:val="24"/>
+          <w:szCs w:val="24"/>
+        </w:rPr>
+        <w:t>Animals use t</w:t>
+      </w:r>
+      <w:r>
+        <w:rPr>
+          <w:rFonts w:ascii="Arial" w:hAnsi="Arial"/>
+          <w:sz w:val="24"/>
+          <w:szCs w:val="24"/>
+        </w:rPr>
+        <w:t xml:space="preserve">hese acoustic structures </w:t>
+      </w:r>
+      <w:r>
+        <w:rPr>
+          <w:rFonts w:ascii="Arial" w:hAnsi="Arial"/>
+          <w:sz w:val="24"/>
+          <w:szCs w:val="24"/>
+        </w:rPr>
+        <w:t>to</w:t>
       </w:r>
       <w:r>
         <w:rPr>
@@ -802,55 +788,31 @@
           <w:sz w:val="24"/>
           <w:szCs w:val="24"/>
         </w:rPr>
-        <w:t xml:space="preserve">by </w:t>
-      </w:r>
-      <w:r>
-        <w:rPr>
-          <w:rFonts w:ascii="Arial" w:hAnsi="Arial"/>
-          <w:sz w:val="24"/>
-          <w:szCs w:val="24"/>
-        </w:rPr>
-        <w:t xml:space="preserve">different </w:t>
-      </w:r>
-      <w:r>
-        <w:rPr>
-          <w:rFonts w:ascii="Arial" w:hAnsi="Arial"/>
-          <w:sz w:val="24"/>
-          <w:szCs w:val="24"/>
-        </w:rPr>
-        <w:t>mammal</w:t>
-      </w:r>
-      <w:r>
-        <w:rPr>
-          <w:rFonts w:ascii="Arial" w:hAnsi="Arial"/>
-          <w:sz w:val="24"/>
-          <w:szCs w:val="24"/>
-        </w:rPr>
-        <w:t>ian</w:t>
-      </w:r>
-      <w:r>
-        <w:rPr>
-          <w:rFonts w:ascii="Arial" w:hAnsi="Arial"/>
-          <w:sz w:val="24"/>
-          <w:szCs w:val="24"/>
-        </w:rPr>
-        <w:t xml:space="preserve"> and </w:t>
-      </w:r>
-      <w:r>
-        <w:rPr>
-          <w:rFonts w:ascii="Arial" w:hAnsi="Arial"/>
-          <w:sz w:val="24"/>
-          <w:szCs w:val="24"/>
-        </w:rPr>
-        <w:t>avian species</w:t>
-      </w:r>
-      <w:r>
-        <w:rPr>
-          <w:rFonts w:ascii="Arial" w:hAnsi="Arial"/>
-          <w:sz w:val="24"/>
-          <w:szCs w:val="24"/>
-        </w:rPr>
-        <w:t xml:space="preserve"> in the wild</w:t>
+        <w:t>encod</w:t>
+      </w:r>
+      <w:r>
+        <w:rPr>
+          <w:rFonts w:ascii="Arial" w:hAnsi="Arial"/>
+          <w:sz w:val="24"/>
+          <w:szCs w:val="24"/>
+        </w:rPr>
+        <w:t>e</w:t>
+      </w:r>
+      <w:r>
+        <w:rPr>
+          <w:rFonts w:ascii="Arial" w:hAnsi="Arial"/>
+          <w:sz w:val="24"/>
+          <w:szCs w:val="24"/>
+        </w:rPr>
+        <w:t xml:space="preserve"> both group and individual identity information, </w:t>
+      </w:r>
+      <w:r>
+        <w:rPr>
+          <w:rFonts w:ascii="Arial" w:hAnsi="Arial"/>
+          <w:sz w:val="24"/>
+          <w:szCs w:val="24"/>
+        </w:rPr>
+        <w:t>as well as to recognize social affiliates</w:t>
       </w:r>
       <w:r>
         <w:rPr>
@@ -948,23 +910,7 @@
           <w:sz w:val="24"/>
           <w:szCs w:val="24"/>
         </w:rPr>
-        <w:t xml:space="preserve">, </w:t>
-      </w:r>
-      <w:r>
-        <w:rPr>
-          <w:rFonts w:ascii="Arial" w:hAnsi="Arial"/>
-          <w:sz w:val="24"/>
-          <w:szCs w:val="24"/>
-        </w:rPr>
-        <w:t>spectrographic cross-correlation</w:t>
-      </w:r>
-      <w:r>
-        <w:rPr>
-          <w:rFonts w:ascii="Arial" w:hAnsi="Arial"/>
-          <w:sz w:val="24"/>
-          <w:szCs w:val="24"/>
-        </w:rPr>
-        <w:t>,</w:t>
+        <w:t>, spectrographic cross-correlation,</w:t>
       </w:r>
       <w:r>
         <w:rPr>
@@ -1062,23 +1008,7 @@
           <w:sz w:val="24"/>
           <w:szCs w:val="24"/>
         </w:rPr>
-        <w:t xml:space="preserve"> that </w:t>
-      </w:r>
-      <w:r>
-        <w:rPr>
-          <w:rFonts w:ascii="Arial" w:hAnsi="Arial"/>
-          <w:sz w:val="24"/>
-          <w:szCs w:val="24"/>
-        </w:rPr>
-        <w:t>spectrographic cross-correlation</w:t>
-      </w:r>
-      <w:r>
-        <w:rPr>
-          <w:rFonts w:ascii="Arial" w:hAnsi="Arial"/>
-          <w:sz w:val="24"/>
-          <w:szCs w:val="24"/>
-        </w:rPr>
-        <w:t xml:space="preserve"> can be used to</w:t>
+        <w:t xml:space="preserve"> that spectrographic cross-correlation can be used to</w:t>
       </w:r>
       <w:r>
         <w:rPr>
@@ -1118,7 +1048,39 @@
           <w:sz w:val="24"/>
           <w:szCs w:val="24"/>
         </w:rPr>
-        <w:t xml:space="preserve"> complex information encoding </w:t>
+        <w:t xml:space="preserve"> complex information encoding conditions and dense signaling environments.</w:t>
+      </w:r>
+      <w:r>
+        <w:rPr>
+          <w:rFonts w:ascii="Arial" w:hAnsi="Arial"/>
+          <w:sz w:val="24"/>
+          <w:szCs w:val="24"/>
+        </w:rPr>
+        <w:t xml:space="preserve"> </w:t>
+      </w:r>
+      <w:r>
+        <w:rPr>
+          <w:rFonts w:ascii="Arial" w:hAnsi="Arial"/>
+          <w:sz w:val="24"/>
+          <w:szCs w:val="24"/>
+        </w:rPr>
+        <w:t xml:space="preserve">This </w:t>
+      </w:r>
+      <w:r>
+        <w:rPr>
+          <w:rFonts w:ascii="Arial" w:hAnsi="Arial"/>
+          <w:sz w:val="24"/>
+          <w:szCs w:val="24"/>
+        </w:rPr>
+        <w:t>work</w:t>
+      </w:r>
+      <w:r>
+        <w:rPr>
+          <w:rFonts w:ascii="Arial" w:hAnsi="Arial"/>
+          <w:sz w:val="24"/>
+          <w:szCs w:val="24"/>
+        </w:rPr>
+        <w:t xml:space="preserve"> will be of broad </w:t>
       </w:r>
       <w:r>
         <w:rPr>
@@ -1127,7 +1089,23 @@
           <w:szCs w:val="24"/>
         </w:rPr>
         <w:lastRenderedPageBreak/>
-        <w:t>conditions and dense signaling environments.</w:t>
+        <w:t xml:space="preserve">interest to </w:t>
+      </w:r>
+      <w:r>
+        <w:rPr>
+          <w:rFonts w:ascii="Arial" w:hAnsi="Arial"/>
+          <w:sz w:val="24"/>
+          <w:szCs w:val="24"/>
+        </w:rPr>
+        <w:t xml:space="preserve">researchers who </w:t>
+      </w:r>
+      <w:r>
+        <w:rPr>
+          <w:rFonts w:ascii="Arial" w:hAnsi="Arial"/>
+          <w:sz w:val="24"/>
+          <w:szCs w:val="24"/>
+        </w:rPr>
+        <w:t>apply computational approaches to</w:t>
       </w:r>
       <w:r>
         <w:rPr>
@@ -1143,54 +1121,6 @@
           <w:sz w:val="24"/>
           <w:szCs w:val="24"/>
         </w:rPr>
-        <w:t xml:space="preserve">This </w:t>
-      </w:r>
-      <w:r>
-        <w:rPr>
-          <w:rFonts w:ascii="Arial" w:hAnsi="Arial"/>
-          <w:sz w:val="24"/>
-          <w:szCs w:val="24"/>
-        </w:rPr>
-        <w:t>work</w:t>
-      </w:r>
-      <w:r>
-        <w:rPr>
-          <w:rFonts w:ascii="Arial" w:hAnsi="Arial"/>
-          <w:sz w:val="24"/>
-          <w:szCs w:val="24"/>
-        </w:rPr>
-        <w:t xml:space="preserve"> will be of broad interest to </w:t>
-      </w:r>
-      <w:r>
-        <w:rPr>
-          <w:rFonts w:ascii="Arial" w:hAnsi="Arial"/>
-          <w:sz w:val="24"/>
-          <w:szCs w:val="24"/>
-        </w:rPr>
-        <w:t xml:space="preserve">researchers who </w:t>
-      </w:r>
-      <w:r>
-        <w:rPr>
-          <w:rFonts w:ascii="Arial" w:hAnsi="Arial"/>
-          <w:sz w:val="24"/>
-          <w:szCs w:val="24"/>
-        </w:rPr>
-        <w:t>apply computational approaches to</w:t>
-      </w:r>
-      <w:r>
-        <w:rPr>
-          <w:rFonts w:ascii="Arial" w:hAnsi="Arial"/>
-          <w:sz w:val="24"/>
-          <w:szCs w:val="24"/>
-        </w:rPr>
-        <w:t xml:space="preserve"> </w:t>
-      </w:r>
-      <w:r>
-        <w:rPr>
-          <w:rFonts w:ascii="Arial" w:hAnsi="Arial"/>
-          <w:sz w:val="24"/>
-          <w:szCs w:val="24"/>
-        </w:rPr>
         <w:t xml:space="preserve">bioacoustics datasets to address wide-ranging questions </w:t>
       </w:r>
       <w:r>
@@ -1207,15 +1137,7 @@
           <w:sz w:val="24"/>
           <w:szCs w:val="24"/>
         </w:rPr>
-        <w:t xml:space="preserve"> </w:t>
-      </w:r>
-      <w:r>
-        <w:rPr>
-          <w:rFonts w:ascii="Arial" w:hAnsi="Arial"/>
-          <w:sz w:val="24"/>
-          <w:szCs w:val="24"/>
-        </w:rPr>
-        <w:t>animal behavior and communication in ecology, evolution, and neuroscience</w:t>
+        <w:t xml:space="preserve"> animal behavior and communication in ecology, evolution, and neuroscience</w:t>
       </w:r>
       <w:r>
         <w:rPr>
@@ -1252,26 +1174,6 @@
         </w:rPr>
         <w:t>Sincerely,</w:t>
       </w:r>
-    </w:p>
-    <w:p>
-      <w:pPr>
-        <w:spacing w:after="0"/>
-        <w:rPr>
-          <w:rFonts w:ascii="Arial" w:hAnsi="Arial"/>
-          <w:sz w:val="24"/>
-          <w:szCs w:val="24"/>
-        </w:rPr>
-      </w:pPr>
-    </w:p>
-    <w:p>
-      <w:pPr>
-        <w:spacing w:after="0"/>
-        <w:rPr>
-          <w:rFonts w:ascii="Arial" w:hAnsi="Arial"/>
-          <w:sz w:val="24"/>
-          <w:szCs w:val="24"/>
-        </w:rPr>
-      </w:pPr>
     </w:p>
     <w:p>
       <w:pPr>
@@ -1345,6 +1247,14 @@
           <w:szCs w:val="24"/>
         </w:rPr>
       </w:pPr>
+      <w:r>
+        <w:rPr>
+          <w:rFonts w:ascii="Arial" w:hAnsi="Arial"/>
+          <w:sz w:val="24"/>
+          <w:szCs w:val="24"/>
+        </w:rPr>
+        <w:t>Grace Smith-Vidaurre</w:t>
+      </w:r>
     </w:p>
     <w:p>
       <w:pPr>
@@ -1355,14 +1265,6 @@
           <w:szCs w:val="24"/>
         </w:rPr>
       </w:pPr>
-      <w:r>
-        <w:rPr>
-          <w:rFonts w:ascii="Arial" w:hAnsi="Arial"/>
-          <w:sz w:val="24"/>
-          <w:szCs w:val="24"/>
-        </w:rPr>
-        <w:t>Grace Smith-Vidaurre</w:t>
-      </w:r>
     </w:p>
     <w:p>
       <w:pPr>
@@ -1373,6 +1275,14 @@
           <w:szCs w:val="24"/>
         </w:rPr>
       </w:pPr>
+      <w:r>
+        <w:rPr>
+          <w:rFonts w:ascii="Arial" w:hAnsi="Arial"/>
+          <w:sz w:val="24"/>
+          <w:szCs w:val="24"/>
+        </w:rPr>
+        <w:t>1855 Assistant Professor</w:t>
+      </w:r>
     </w:p>
     <w:p>
       <w:pPr>
@@ -1389,7 +1299,7 @@
           <w:sz w:val="24"/>
           <w:szCs w:val="24"/>
         </w:rPr>
-        <w:t>1855 Assistant Professor</w:t>
+        <w:t>Department of Integrative Biology</w:t>
       </w:r>
     </w:p>
     <w:p>
@@ -1407,7 +1317,7 @@
           <w:sz w:val="24"/>
           <w:szCs w:val="24"/>
         </w:rPr>
-        <w:t>Department of Integrative Biology</w:t>
+        <w:t>Department of Computational Mathematics, Science, and Engineering</w:t>
       </w:r>
     </w:p>
     <w:p>
@@ -1425,7 +1335,7 @@
           <w:sz w:val="24"/>
           <w:szCs w:val="24"/>
         </w:rPr>
-        <w:t>Department of Computational Mathematics, Science, and Engineering</w:t>
+        <w:t>Ecology, Evolution, and Behavior Program</w:t>
       </w:r>
     </w:p>
     <w:p>
@@ -1443,7 +1353,7 @@
           <w:sz w:val="24"/>
           <w:szCs w:val="24"/>
         </w:rPr>
-        <w:t>Ecology, Evolution, and Behavior Program</w:t>
+        <w:t>Michigan State University</w:t>
       </w:r>
     </w:p>
     <w:p>
@@ -1455,14 +1365,6 @@
           <w:szCs w:val="24"/>
         </w:rPr>
       </w:pPr>
-      <w:r>
-        <w:rPr>
-          <w:rFonts w:ascii="Arial" w:hAnsi="Arial"/>
-          <w:sz w:val="24"/>
-          <w:szCs w:val="24"/>
-        </w:rPr>
-        <w:t>Michigan State University</w:t>
-      </w:r>
     </w:p>
     <w:p>
       <w:pPr>
@@ -1491,63 +1393,17 @@
           <w:rFonts w:ascii="Arial" w:hAnsi="Arial"/>
           <w:sz w:val="24"/>
           <w:szCs w:val="24"/>
-        </w:rPr>
-      </w:pPr>
-    </w:p>
-    <w:p>
-      <w:pPr>
-        <w:spacing w:after="0"/>
-        <w:rPr>
-          <w:rFonts w:ascii="Arial" w:hAnsi="Arial"/>
-          <w:sz w:val="24"/>
-          <w:szCs w:val="24"/>
-        </w:rPr>
-      </w:pPr>
-    </w:p>
-    <w:p>
-      <w:pPr>
-        <w:spacing w:after="0"/>
-        <w:rPr>
-          <w:rFonts w:ascii="Arial" w:hAnsi="Arial"/>
-          <w:sz w:val="24"/>
-          <w:szCs w:val="24"/>
-        </w:rPr>
-      </w:pPr>
-      <w:r>
-        <w:rPr>
-          <w:rFonts w:ascii="Arial" w:hAnsi="Arial"/>
-          <w:sz w:val="24"/>
-          <w:szCs w:val="24"/>
+          <w:u w:val="single"/>
+        </w:rPr>
+      </w:pPr>
+      <w:r>
+        <w:rPr>
+          <w:rFonts w:ascii="Arial" w:hAnsi="Arial"/>
+          <w:sz w:val="24"/>
+          <w:szCs w:val="24"/>
+          <w:u w:val="single"/>
         </w:rPr>
         <w:t>Potential Reviewers</w:t>
-      </w:r>
-    </w:p>
-    <w:p>
-      <w:pPr>
-        <w:spacing w:after="0"/>
-        <w:rPr>
-          <w:rFonts w:ascii="Arial" w:hAnsi="Arial"/>
-          <w:sz w:val="24"/>
-          <w:szCs w:val="24"/>
-        </w:rPr>
-      </w:pPr>
-    </w:p>
-    <w:p>
-      <w:pPr>
-        <w:spacing w:after="0"/>
-        <w:rPr>
-          <w:rFonts w:ascii="Arial" w:hAnsi="Arial"/>
-          <w:sz w:val="24"/>
-          <w:szCs w:val="24"/>
-        </w:rPr>
-      </w:pPr>
-      <w:r>
-        <w:rPr>
-          <w:rFonts w:ascii="Arial" w:hAnsi="Arial"/>
-          <w:sz w:val="24"/>
-          <w:szCs w:val="24"/>
-        </w:rPr>
-        <w:t>Nicole Creanza</w:t>
       </w:r>
     </w:p>
     <w:p>
@@ -1579,8 +1435,9 @@
           <w:sz w:val="24"/>
           <w:szCs w:val="24"/>
         </w:rPr>
-        <w:t>A</w:t>
-      </w:r>
+        <w:t xml:space="preserve">Nicole </w:t>
+      </w:r>
+      <w:proofErr w:type="spellStart"/>
       <w:r>
         <w:rPr>
           <w:rFonts w:ascii="Arial" w:hAnsi="Arial"/>
@@ -1589,9 +1446,106 @@
           <w:sz w:val="24"/>
           <w:szCs w:val="24"/>
         </w:rPr>
-        <w:t>n</w:t>
-      </w:r>
-      <w:r>
+        <w:t>Creanza</w:t>
+      </w:r>
+      <w:proofErr w:type="spellEnd"/>
+    </w:p>
+    <w:p>
+      <w:pPr>
+        <w:spacing w:after="0"/>
+        <w:rPr>
+          <w:rFonts w:ascii="Arial" w:hAnsi="Arial"/>
+          <w:sz w:val="24"/>
+          <w:szCs w:val="24"/>
+        </w:rPr>
+      </w:pPr>
+      <w:r>
+        <w:rPr>
+          <w:rFonts w:ascii="Arial" w:hAnsi="Arial"/>
+          <w:sz w:val="24"/>
+          <w:szCs w:val="24"/>
+        </w:rPr>
+        <w:t>Assistant Professor</w:t>
+      </w:r>
+    </w:p>
+    <w:p>
+      <w:pPr>
+        <w:spacing w:after="0"/>
+        <w:rPr>
+          <w:rFonts w:ascii="Arial" w:hAnsi="Arial"/>
+          <w:sz w:val="24"/>
+          <w:szCs w:val="24"/>
+        </w:rPr>
+      </w:pPr>
+      <w:hyperlink r:id="rId9" w:history="1">
+        <w:r>
+          <w:rPr>
+            <w:rStyle w:val="Hyperlink"/>
+            <w:rFonts w:ascii="Arial" w:hAnsi="Arial"/>
+            <w:sz w:val="24"/>
+            <w:szCs w:val="24"/>
+          </w:rPr>
+          <w:t>nicole.creanza@vanderbilt.edu</w:t>
+        </w:r>
+      </w:hyperlink>
+    </w:p>
+    <w:p>
+      <w:pPr>
+        <w:spacing w:after="0"/>
+        <w:rPr>
+          <w:rFonts w:ascii="Arial" w:hAnsi="Arial"/>
+          <w:sz w:val="24"/>
+          <w:szCs w:val="24"/>
+        </w:rPr>
+      </w:pPr>
+      <w:r>
+        <w:rPr>
+          <w:rFonts w:ascii="Arial" w:hAnsi="Arial"/>
+          <w:sz w:val="24"/>
+          <w:szCs w:val="24"/>
+        </w:rPr>
+        <w:t>Biological Sciences Department</w:t>
+      </w:r>
+    </w:p>
+    <w:p>
+      <w:pPr>
+        <w:spacing w:after="0"/>
+        <w:rPr>
+          <w:rFonts w:ascii="Arial" w:hAnsi="Arial"/>
+          <w:sz w:val="24"/>
+          <w:szCs w:val="24"/>
+        </w:rPr>
+      </w:pPr>
+      <w:r>
+        <w:rPr>
+          <w:rFonts w:ascii="Arial" w:hAnsi="Arial"/>
+          <w:sz w:val="24"/>
+          <w:szCs w:val="24"/>
+        </w:rPr>
+        <w:t xml:space="preserve">Vanderbilt University, </w:t>
+      </w:r>
+      <w:r>
+        <w:rPr>
+          <w:rFonts w:ascii="Arial" w:hAnsi="Arial"/>
+          <w:sz w:val="24"/>
+          <w:szCs w:val="24"/>
+        </w:rPr>
+        <w:t>Nashville, Tennessee, USA</w:t>
+      </w:r>
+    </w:p>
+    <w:p>
+      <w:pPr>
+        <w:spacing w:after="0"/>
+        <w:rPr>
+          <w:rFonts w:ascii="Arial" w:hAnsi="Arial"/>
+          <w:sz w:val="24"/>
+          <w:szCs w:val="24"/>
+        </w:rPr>
+      </w:pPr>
+    </w:p>
+    <w:p>
+      <w:pPr>
+        <w:spacing w:after="0"/>
         <w:rPr>
           <w:rFonts w:ascii="Arial" w:hAnsi="Arial"/>
           <w:b/>
@@ -1599,6 +1553,35 @@
           <w:sz w:val="24"/>
           <w:szCs w:val="24"/>
         </w:rPr>
+      </w:pPr>
+      <w:r>
+        <w:rPr>
+          <w:rFonts w:ascii="Arial" w:hAnsi="Arial"/>
+          <w:b/>
+          <w:bCs/>
+          <w:sz w:val="24"/>
+          <w:szCs w:val="24"/>
+        </w:rPr>
+        <w:t>A</w:t>
+      </w:r>
+      <w:r>
+        <w:rPr>
+          <w:rFonts w:ascii="Arial" w:hAnsi="Arial"/>
+          <w:b/>
+          <w:bCs/>
+          <w:sz w:val="24"/>
+          <w:szCs w:val="24"/>
+        </w:rPr>
+        <w:t>n</w:t>
+      </w:r>
+      <w:r>
+        <w:rPr>
+          <w:rFonts w:ascii="Arial" w:hAnsi="Arial"/>
+          <w:b/>
+          <w:bCs/>
+          <w:sz w:val="24"/>
+          <w:szCs w:val="24"/>
+        </w:rPr>
         <w:t>drey Anikin</w:t>
       </w:r>
     </w:p>
@@ -1631,7 +1614,7 @@
           <w:shd w:val="clear" w:color="auto" w:fill="FFFFFF"/>
         </w:rPr>
       </w:pPr>
-      <w:hyperlink r:id="rId9" w:history="1">
+      <w:hyperlink r:id="rId10" w:history="1">
         <w:r>
           <w:rPr>
             <w:rStyle w:val="Hyperlink"/>
@@ -1640,27 +1623,7 @@
             <w:szCs w:val="24"/>
             <w:shd w:val="clear" w:color="auto" w:fill="FFFFFF"/>
           </w:rPr>
-          <w:t>andrey.anikin</w:t>
-        </w:r>
-        <w:r>
-          <w:rPr>
-            <w:rStyle w:val="Hyperlink"/>
-            <w:rFonts w:ascii="Arial" w:hAnsi="Arial"/>
-            <w:sz w:val="24"/>
-            <w:szCs w:val="24"/>
-            <w:shd w:val="clear" w:color="auto" w:fill="FFFFFF"/>
-          </w:rPr>
-          <w:t>@</w:t>
-        </w:r>
-        <w:r>
-          <w:rPr>
-            <w:rStyle w:val="Hyperlink"/>
-            <w:rFonts w:ascii="Arial" w:hAnsi="Arial"/>
-            <w:sz w:val="24"/>
-            <w:szCs w:val="24"/>
-            <w:shd w:val="clear" w:color="auto" w:fill="FFFFFF"/>
-          </w:rPr>
-          <w:t>cogsci.se</w:t>
+          <w:t>andrey.anikin@cogsci.se</w:t>
         </w:r>
       </w:hyperlink>
     </w:p>
@@ -1683,7 +1646,7 @@
           <w:szCs w:val="24"/>
           <w:shd w:val="clear" w:color="auto" w:fill="FFFFFF"/>
         </w:rPr>
-        <w:t>Lund University</w:t>
+        <w:t xml:space="preserve">Lund University </w:t>
       </w:r>
       <w:r>
         <w:rPr>
@@ -1693,6 +1656,58 @@
           <w:szCs w:val="24"/>
           <w:shd w:val="clear" w:color="auto" w:fill="FFFFFF"/>
         </w:rPr>
+        <w:t>Cognitive Science</w:t>
+      </w:r>
+    </w:p>
+    <w:p>
+      <w:pPr>
+        <w:spacing w:after="0"/>
+        <w:rPr>
+          <w:rFonts w:ascii="Arial" w:hAnsi="Arial"/>
+          <w:color w:val="000000"/>
+          <w:sz w:val="24"/>
+          <w:szCs w:val="24"/>
+          <w:shd w:val="clear" w:color="auto" w:fill="FFFFFF"/>
+        </w:rPr>
+      </w:pPr>
+      <w:r>
+        <w:rPr>
+          <w:rFonts w:ascii="Arial" w:hAnsi="Arial"/>
+          <w:color w:val="000000"/>
+          <w:sz w:val="24"/>
+          <w:szCs w:val="24"/>
+          <w:shd w:val="clear" w:color="auto" w:fill="FFFFFF"/>
+        </w:rPr>
+        <w:t>Department of Philoso</w:t>
+      </w:r>
+      <w:r>
+        <w:rPr>
+          <w:rFonts w:ascii="Arial" w:hAnsi="Arial"/>
+          <w:color w:val="000000"/>
+          <w:sz w:val="24"/>
+          <w:szCs w:val="24"/>
+          <w:shd w:val="clear" w:color="auto" w:fill="FFFFFF"/>
+        </w:rPr>
+        <w:t>p</w:t>
+      </w:r>
+      <w:r>
+        <w:rPr>
+          <w:rFonts w:ascii="Arial" w:hAnsi="Arial"/>
+          <w:color w:val="000000"/>
+          <w:sz w:val="24"/>
+          <w:szCs w:val="24"/>
+          <w:shd w:val="clear" w:color="auto" w:fill="FFFFFF"/>
+        </w:rPr>
+        <w:t>hy,</w:t>
+      </w:r>
+      <w:r>
+        <w:rPr>
+          <w:rFonts w:ascii="Arial" w:hAnsi="Arial"/>
+          <w:color w:val="000000"/>
+          <w:sz w:val="24"/>
+          <w:szCs w:val="24"/>
+          <w:shd w:val="clear" w:color="auto" w:fill="FFFFFF"/>
+        </w:rPr>
         <w:t xml:space="preserve"> </w:t>
       </w:r>
       <w:r>
@@ -1703,7 +1718,17 @@
           <w:szCs w:val="24"/>
           <w:shd w:val="clear" w:color="auto" w:fill="FFFFFF"/>
         </w:rPr>
-        <w:t>Cognitive Science</w:t>
+        <w:t xml:space="preserve">Lund, </w:t>
+      </w:r>
+      <w:r>
+        <w:rPr>
+          <w:rFonts w:ascii="Arial" w:hAnsi="Arial"/>
+          <w:color w:val="000000"/>
+          <w:sz w:val="24"/>
+          <w:szCs w:val="24"/>
+          <w:shd w:val="clear" w:color="auto" w:fill="FFFFFF"/>
+        </w:rPr>
+        <w:t>Sweden</w:t>
       </w:r>
     </w:p>
     <w:p>
@@ -1711,72 +1736,10 @@
         <w:spacing w:after="0"/>
         <w:rPr>
           <w:rFonts w:ascii="Arial" w:hAnsi="Arial"/>
-          <w:color w:val="000000"/>
-          <w:sz w:val="24"/>
-          <w:szCs w:val="24"/>
-          <w:shd w:val="clear" w:color="auto" w:fill="FFFFFF"/>
-        </w:rPr>
-      </w:pPr>
-      <w:r>
-        <w:rPr>
-          <w:rFonts w:ascii="Arial" w:hAnsi="Arial"/>
-          <w:color w:val="000000"/>
-          <w:sz w:val="24"/>
-          <w:szCs w:val="24"/>
-          <w:shd w:val="clear" w:color="auto" w:fill="FFFFFF"/>
-        </w:rPr>
-        <w:t>Department of Philoso</w:t>
-      </w:r>
-      <w:r>
-        <w:rPr>
-          <w:rFonts w:ascii="Arial" w:hAnsi="Arial"/>
-          <w:color w:val="000000"/>
-          <w:sz w:val="24"/>
-          <w:szCs w:val="24"/>
-          <w:shd w:val="clear" w:color="auto" w:fill="FFFFFF"/>
-        </w:rPr>
-        <w:t>p</w:t>
-      </w:r>
-      <w:r>
-        <w:rPr>
-          <w:rFonts w:ascii="Arial" w:hAnsi="Arial"/>
-          <w:color w:val="000000"/>
-          <w:sz w:val="24"/>
-          <w:szCs w:val="24"/>
-          <w:shd w:val="clear" w:color="auto" w:fill="FFFFFF"/>
-        </w:rPr>
-        <w:t>hy,</w:t>
-      </w:r>
-      <w:r>
-        <w:rPr>
-          <w:rFonts w:ascii="Arial" w:hAnsi="Arial"/>
-          <w:color w:val="000000"/>
-          <w:sz w:val="24"/>
-          <w:szCs w:val="24"/>
-          <w:shd w:val="clear" w:color="auto" w:fill="FFFFFF"/>
-        </w:rPr>
-        <w:t xml:space="preserve"> </w:t>
-      </w:r>
-      <w:r>
-        <w:rPr>
-          <w:rFonts w:ascii="Arial" w:hAnsi="Arial"/>
-          <w:color w:val="000000"/>
-          <w:sz w:val="24"/>
-          <w:szCs w:val="24"/>
-          <w:shd w:val="clear" w:color="auto" w:fill="FFFFFF"/>
-        </w:rPr>
-        <w:t xml:space="preserve">Lund, </w:t>
-      </w:r>
-      <w:r>
-        <w:rPr>
-          <w:rFonts w:ascii="Arial" w:hAnsi="Arial"/>
-          <w:color w:val="000000"/>
-          <w:sz w:val="24"/>
-          <w:szCs w:val="24"/>
-          <w:shd w:val="clear" w:color="auto" w:fill="FFFFFF"/>
-        </w:rPr>
-        <w:t>Sweden</w:t>
-      </w:r>
+          <w:sz w:val="24"/>
+          <w:szCs w:val="24"/>
+        </w:rPr>
+      </w:pPr>
     </w:p>
     <w:p>
       <w:pPr>
@@ -1787,6 +1750,14 @@
           <w:szCs w:val="24"/>
         </w:rPr>
       </w:pPr>
+      <w:r>
+        <w:rPr>
+          <w:rFonts w:ascii="Arial" w:hAnsi="Arial"/>
+          <w:sz w:val="24"/>
+          <w:szCs w:val="24"/>
+        </w:rPr>
+        <w:t>Mason Youngblood</w:t>
+      </w:r>
     </w:p>
     <w:p>
       <w:pPr>
@@ -1803,7 +1774,7 @@
           <w:sz w:val="24"/>
           <w:szCs w:val="24"/>
         </w:rPr>
-        <w:t>Mason Youngblood</w:t>
+        <w:t>Postdoctoral Fellow</w:t>
       </w:r>
     </w:p>
     <w:p>
@@ -1821,7 +1792,7 @@
           <w:sz w:val="24"/>
           <w:szCs w:val="24"/>
         </w:rPr>
-        <w:t>Postdoctoral Fellow</w:t>
+        <w:t>Institute for Advanced Computational Science</w:t>
       </w:r>
     </w:p>
     <w:p>
@@ -1833,7 +1804,41 @@
           <w:szCs w:val="24"/>
         </w:rPr>
       </w:pPr>
-      <w:hyperlink r:id="rId10" w:history="1">
+      <w:r>
+        <w:rPr>
+          <w:rFonts w:ascii="Arial" w:hAnsi="Arial"/>
+          <w:sz w:val="24"/>
+          <w:szCs w:val="24"/>
+        </w:rPr>
+        <w:t xml:space="preserve">Stony Brook University, </w:t>
+      </w:r>
+      <w:r>
+        <w:rPr>
+          <w:rFonts w:ascii="Arial" w:hAnsi="Arial"/>
+          <w:sz w:val="24"/>
+          <w:szCs w:val="24"/>
+        </w:rPr>
+        <w:t xml:space="preserve">Stony Brook, </w:t>
+      </w:r>
+      <w:r>
+        <w:rPr>
+          <w:rFonts w:ascii="Arial" w:hAnsi="Arial"/>
+          <w:sz w:val="24"/>
+          <w:szCs w:val="24"/>
+        </w:rPr>
+        <w:t>New York, USA</w:t>
+      </w:r>
+    </w:p>
+    <w:p>
+      <w:pPr>
+        <w:spacing w:after="0"/>
+        <w:rPr>
+          <w:rFonts w:ascii="Arial" w:hAnsi="Arial"/>
+          <w:sz w:val="24"/>
+          <w:szCs w:val="24"/>
+        </w:rPr>
+      </w:pPr>
+      <w:hyperlink r:id="rId11" w:history="1">
         <w:r>
           <w:rPr>
             <w:rStyle w:val="Hyperlink"/>
@@ -1888,7 +1893,7 @@
       </w:r>
     </w:p>
     <w:sectPr>
-      <w:headerReference w:type="first" r:id="rId11"/>
+      <w:headerReference w:type="first" r:id="rId12"/>
       <w:pgSz w:w="12240" w:h="15840" w:code="1"/>
       <w:pgMar w:top="1800" w:right="1800" w:bottom="1800" w:left="2635" w:header="720" w:footer="720" w:gutter="0"/>
       <w:cols w:space="720"/>
@@ -2348,8 +2353,19 @@
                               <w:sz w:val="14"/>
                               <w:szCs w:val="14"/>
                             </w:rPr>
-                            <w:t>Natural Science Bldg</w:t>
+                            <w:t xml:space="preserve">Natural Science </w:t>
                           </w:r>
+                          <w:proofErr w:type="spellStart"/>
+                          <w:r>
+                            <w:rPr>
+                              <w:rFonts w:ascii="Arial" w:hAnsi="Arial"/>
+                              <w:color w:val="000000"/>
+                              <w:sz w:val="14"/>
+                              <w:szCs w:val="14"/>
+                            </w:rPr>
+                            <w:t>Bldg</w:t>
+                          </w:r>
+                          <w:proofErr w:type="spellEnd"/>
                         </w:p>
                         <w:p>
                           <w:pPr>

</xml_diff>

<commit_message>
Finalized cover letter draft
</commit_message>
<xml_diff>
--- a/drafts/paRsynth_coverletter.docx
+++ b/drafts/paRsynth_coverletter.docx
@@ -31,7 +31,7 @@
           <w:sz w:val="24"/>
           <w:szCs w:val="24"/>
         </w:rPr>
-        <w:t>1</w:t>
+        <w:t>5</w:t>
       </w:r>
       <w:r>
         <w:rPr>
@@ -89,7 +89,41 @@
           <w:sz w:val="24"/>
           <w:szCs w:val="24"/>
         </w:rPr>
-        <w:t>Drs. Mac Gabhann and Pitzer</w:t>
+        <w:t xml:space="preserve">Dr. Mac </w:t>
+      </w:r>
+      <w:proofErr w:type="spellStart"/>
+      <w:r>
+        <w:rPr>
+          <w:rFonts w:ascii="Arial" w:hAnsi="Arial"/>
+          <w:sz w:val="24"/>
+          <w:szCs w:val="24"/>
+        </w:rPr>
+        <w:t>Gabhann</w:t>
+      </w:r>
+      <w:proofErr w:type="spellEnd"/>
+      <w:r>
+        <w:rPr>
+          <w:rFonts w:ascii="Arial" w:hAnsi="Arial"/>
+          <w:sz w:val="24"/>
+          <w:szCs w:val="24"/>
+        </w:rPr>
+        <w:t xml:space="preserve"> and </w:t>
+      </w:r>
+      <w:r>
+        <w:rPr>
+          <w:rFonts w:ascii="Arial" w:hAnsi="Arial"/>
+          <w:sz w:val="24"/>
+          <w:szCs w:val="24"/>
+        </w:rPr>
+        <w:t xml:space="preserve">Dr. </w:t>
+      </w:r>
+      <w:r>
+        <w:rPr>
+          <w:rFonts w:ascii="Arial" w:hAnsi="Arial"/>
+          <w:sz w:val="24"/>
+          <w:szCs w:val="24"/>
+        </w:rPr>
+        <w:t>Pitzer</w:t>
       </w:r>
       <w:r>
         <w:rPr>
@@ -112,6 +146,7 @@
     <w:p>
       <w:pPr>
         <w:spacing w:after="200"/>
+        <w:jc w:val="both"/>
         <w:rPr>
           <w:rFonts w:ascii="Arial" w:hAnsi="Arial"/>
           <w:sz w:val="24"/>
@@ -156,7 +191,23 @@
           <w:sz w:val="24"/>
           <w:szCs w:val="24"/>
         </w:rPr>
-        <w:t xml:space="preserve"> for your consideration </w:t>
+        <w:t xml:space="preserve"> for consideration</w:t>
+      </w:r>
+      <w:r>
+        <w:rPr>
+          <w:rFonts w:ascii="Arial" w:hAnsi="Arial"/>
+          <w:sz w:val="24"/>
+          <w:szCs w:val="24"/>
+        </w:rPr>
+        <w:t xml:space="preserve"> as a research article</w:t>
+      </w:r>
+      <w:r>
+        <w:rPr>
+          <w:rFonts w:ascii="Arial" w:hAnsi="Arial"/>
+          <w:sz w:val="24"/>
+          <w:szCs w:val="24"/>
+        </w:rPr>
+        <w:t xml:space="preserve"> </w:t>
       </w:r>
       <w:r>
         <w:rPr>
@@ -186,6 +237,7 @@
     <w:p>
       <w:pPr>
         <w:spacing w:after="200"/>
+        <w:jc w:val="both"/>
         <w:rPr>
           <w:rFonts w:ascii="Arial" w:hAnsi="Arial"/>
           <w:sz w:val="24"/>
@@ -292,6 +344,7 @@
     <w:p>
       <w:pPr>
         <w:spacing w:after="200"/>
+        <w:jc w:val="both"/>
         <w:rPr>
           <w:rFonts w:ascii="Arial" w:hAnsi="Arial"/>
           <w:sz w:val="24"/>
@@ -400,7 +453,23 @@
           <w:sz w:val="24"/>
           <w:szCs w:val="24"/>
         </w:rPr>
-        <w:t xml:space="preserve"> in their vocalizations</w:t>
+        <w:t xml:space="preserve"> in </w:t>
+      </w:r>
+      <w:r>
+        <w:rPr>
+          <w:rFonts w:ascii="Arial" w:hAnsi="Arial"/>
+          <w:sz w:val="24"/>
+          <w:szCs w:val="24"/>
+        </w:rPr>
+        <w:t>animals’</w:t>
+      </w:r>
+      <w:r>
+        <w:rPr>
+          <w:rFonts w:ascii="Arial" w:hAnsi="Arial"/>
+          <w:sz w:val="24"/>
+          <w:szCs w:val="24"/>
+        </w:rPr>
+        <w:t xml:space="preserve"> vocalizations</w:t>
       </w:r>
       <w:r>
         <w:rPr>
@@ -464,7 +533,15 @@
           <w:sz w:val="24"/>
           <w:szCs w:val="24"/>
         </w:rPr>
-        <w:t xml:space="preserve">bioacoustics </w:t>
+        <w:t>computational</w:t>
+      </w:r>
+      <w:r>
+        <w:rPr>
+          <w:rFonts w:ascii="Arial" w:hAnsi="Arial"/>
+          <w:sz w:val="24"/>
+          <w:szCs w:val="24"/>
+        </w:rPr>
+        <w:t xml:space="preserve"> </w:t>
       </w:r>
       <w:r>
         <w:rPr>
@@ -552,7 +629,7 @@
           <w:sz w:val="24"/>
           <w:szCs w:val="24"/>
         </w:rPr>
-        <w:t>s communicate to one another through</w:t>
+        <w:t>s communicate through</w:t>
       </w:r>
       <w:r>
         <w:rPr>
@@ -582,6 +659,7 @@
     <w:p>
       <w:pPr>
         <w:spacing w:after="200"/>
+        <w:jc w:val="both"/>
         <w:rPr>
           <w:rFonts w:ascii="Arial" w:hAnsi="Arial"/>
           <w:sz w:val="24"/>
@@ -602,7 +680,23 @@
           <w:sz w:val="24"/>
           <w:szCs w:val="24"/>
         </w:rPr>
-        <w:t xml:space="preserve">e present a new tool </w:t>
+        <w:t xml:space="preserve">e present a new </w:t>
+      </w:r>
+      <w:r>
+        <w:rPr>
+          <w:rFonts w:ascii="Arial" w:hAnsi="Arial"/>
+          <w:sz w:val="24"/>
+          <w:szCs w:val="24"/>
+        </w:rPr>
+        <w:t>pipeline</w:t>
+      </w:r>
+      <w:r>
+        <w:rPr>
+          <w:rFonts w:ascii="Arial" w:hAnsi="Arial"/>
+          <w:sz w:val="24"/>
+          <w:szCs w:val="24"/>
+        </w:rPr>
+        <w:t xml:space="preserve"> </w:t>
       </w:r>
       <w:r>
         <w:rPr>
@@ -850,6 +944,7 @@
     <w:p>
       <w:pPr>
         <w:spacing w:after="200"/>
+        <w:jc w:val="both"/>
         <w:rPr>
           <w:rFonts w:ascii="Arial" w:hAnsi="Arial"/>
           <w:sz w:val="24"/>
@@ -902,23 +997,87 @@
           <w:sz w:val="24"/>
           <w:szCs w:val="24"/>
         </w:rPr>
-        <w:t>to test how well a traditional bioacoustics tool</w:t>
-      </w:r>
-      <w:r>
-        <w:rPr>
-          <w:rFonts w:ascii="Arial" w:hAnsi="Arial"/>
-          <w:sz w:val="24"/>
-          <w:szCs w:val="24"/>
-        </w:rPr>
-        <w:t>, spectrographic cross-correlation,</w:t>
-      </w:r>
-      <w:r>
-        <w:rPr>
-          <w:rFonts w:ascii="Arial" w:hAnsi="Arial"/>
-          <w:sz w:val="24"/>
-          <w:szCs w:val="24"/>
-        </w:rPr>
-        <w:t xml:space="preserve"> could be used to detect identity information in synthetic vocalizations</w:t>
+        <w:t>to test how well</w:t>
+      </w:r>
+      <w:r>
+        <w:rPr>
+          <w:rFonts w:ascii="Arial" w:hAnsi="Arial"/>
+          <w:sz w:val="24"/>
+          <w:szCs w:val="24"/>
+        </w:rPr>
+        <w:t xml:space="preserve"> </w:t>
+      </w:r>
+      <w:r>
+        <w:rPr>
+          <w:rFonts w:ascii="Arial" w:hAnsi="Arial"/>
+          <w:sz w:val="24"/>
+          <w:szCs w:val="24"/>
+        </w:rPr>
+        <w:t>spectrographic cross-correlation</w:t>
+      </w:r>
+      <w:r>
+        <w:rPr>
+          <w:rFonts w:ascii="Arial" w:hAnsi="Arial"/>
+          <w:sz w:val="24"/>
+          <w:szCs w:val="24"/>
+        </w:rPr>
+        <w:t xml:space="preserve">, </w:t>
+      </w:r>
+      <w:r>
+        <w:rPr>
+          <w:rFonts w:ascii="Arial" w:hAnsi="Arial"/>
+          <w:sz w:val="24"/>
+          <w:szCs w:val="24"/>
+        </w:rPr>
+        <w:t>a</w:t>
+      </w:r>
+      <w:r>
+        <w:rPr>
+          <w:rFonts w:ascii="Arial" w:hAnsi="Arial"/>
+          <w:sz w:val="24"/>
+          <w:szCs w:val="24"/>
+        </w:rPr>
+        <w:t xml:space="preserve"> computational </w:t>
+      </w:r>
+      <w:r>
+        <w:rPr>
+          <w:rFonts w:ascii="Arial" w:hAnsi="Arial"/>
+          <w:sz w:val="24"/>
+          <w:szCs w:val="24"/>
+        </w:rPr>
+        <w:t>tool</w:t>
+      </w:r>
+      <w:r>
+        <w:rPr>
+          <w:rFonts w:ascii="Arial" w:hAnsi="Arial"/>
+          <w:sz w:val="24"/>
+          <w:szCs w:val="24"/>
+        </w:rPr>
+        <w:t xml:space="preserve"> long applied to bioacoustics datasets</w:t>
+      </w:r>
+      <w:r>
+        <w:rPr>
+          <w:rFonts w:ascii="Arial" w:hAnsi="Arial"/>
+          <w:sz w:val="24"/>
+          <w:szCs w:val="24"/>
+        </w:rPr>
+        <w:t>,</w:t>
+      </w:r>
+      <w:r>
+        <w:rPr>
+          <w:rFonts w:ascii="Arial" w:hAnsi="Arial"/>
+          <w:sz w:val="24"/>
+          <w:szCs w:val="24"/>
+        </w:rPr>
+        <w:t xml:space="preserve"> </w:t>
+      </w:r>
+      <w:r>
+        <w:rPr>
+          <w:rFonts w:ascii="Arial" w:hAnsi="Arial"/>
+          <w:sz w:val="24"/>
+          <w:szCs w:val="24"/>
+        </w:rPr>
+        <w:t>could be used to detect identity information in synthetic vocalizations</w:t>
       </w:r>
       <w:r>
         <w:rPr>
@@ -966,7 +1125,7 @@
           <w:sz w:val="24"/>
           <w:szCs w:val="24"/>
         </w:rPr>
-        <w:t>can</w:t>
+        <w:t>may</w:t>
       </w:r>
       <w:r>
         <w:rPr>
@@ -975,6 +1134,70 @@
           <w:szCs w:val="24"/>
         </w:rPr>
         <w:t xml:space="preserve"> influence the distinctiveness of identity information in empirical datasets.</w:t>
+      </w:r>
+      <w:r>
+        <w:rPr>
+          <w:rFonts w:ascii="Arial" w:hAnsi="Arial"/>
+          <w:sz w:val="24"/>
+          <w:szCs w:val="24"/>
+        </w:rPr>
+        <w:t xml:space="preserve"> </w:t>
+      </w:r>
+      <w:r>
+        <w:rPr>
+          <w:rFonts w:ascii="Arial" w:hAnsi="Arial"/>
+          <w:sz w:val="24"/>
+          <w:szCs w:val="24"/>
+        </w:rPr>
+        <w:t>Our simulation experiments demonstrate</w:t>
+      </w:r>
+      <w:r>
+        <w:rPr>
+          <w:rFonts w:ascii="Arial" w:hAnsi="Arial"/>
+          <w:sz w:val="24"/>
+          <w:szCs w:val="24"/>
+        </w:rPr>
+        <w:t xml:space="preserve"> that spectrographic cross-correlation can be used to</w:t>
+      </w:r>
+      <w:r>
+        <w:rPr>
+          <w:rFonts w:ascii="Arial" w:hAnsi="Arial"/>
+          <w:sz w:val="24"/>
+          <w:szCs w:val="24"/>
+        </w:rPr>
+        <w:t xml:space="preserve"> detect </w:t>
+      </w:r>
+      <w:r>
+        <w:rPr>
+          <w:rFonts w:ascii="Arial" w:hAnsi="Arial"/>
+          <w:sz w:val="24"/>
+          <w:szCs w:val="24"/>
+        </w:rPr>
+        <w:t>the social level with the most information originally encoded</w:t>
+      </w:r>
+      <w:r>
+        <w:rPr>
+          <w:rFonts w:ascii="Arial" w:hAnsi="Arial"/>
+          <w:sz w:val="24"/>
+          <w:szCs w:val="24"/>
+        </w:rPr>
+        <w:t xml:space="preserve">, even </w:t>
+      </w:r>
+      <w:r>
+        <w:rPr>
+          <w:rFonts w:ascii="Arial" w:hAnsi="Arial"/>
+          <w:sz w:val="24"/>
+          <w:szCs w:val="24"/>
+        </w:rPr>
+        <w:t>under</w:t>
+      </w:r>
+      <w:r>
+        <w:rPr>
+          <w:rFonts w:ascii="Arial" w:hAnsi="Arial"/>
+          <w:sz w:val="24"/>
+          <w:szCs w:val="24"/>
+        </w:rPr>
+        <w:t xml:space="preserve"> complex information encoding conditions and dense signaling environments.</w:t>
       </w:r>
       <w:r>
         <w:rPr>
@@ -988,67 +1211,205 @@
     <w:p>
       <w:pPr>
         <w:spacing w:after="200"/>
-        <w:rPr>
-          <w:rFonts w:ascii="Arial" w:hAnsi="Arial"/>
-          <w:sz w:val="24"/>
-          <w:szCs w:val="24"/>
-        </w:rPr>
-      </w:pPr>
-      <w:r>
-        <w:rPr>
-          <w:rFonts w:ascii="Arial" w:hAnsi="Arial"/>
-          <w:sz w:val="24"/>
-          <w:szCs w:val="24"/>
-        </w:rPr>
-        <w:t>Our simulation experiments demonstrate</w:t>
-      </w:r>
-      <w:r>
-        <w:rPr>
-          <w:rFonts w:ascii="Arial" w:hAnsi="Arial"/>
-          <w:sz w:val="24"/>
-          <w:szCs w:val="24"/>
-        </w:rPr>
-        <w:t xml:space="preserve"> that spectrographic cross-correlation can be used to</w:t>
-      </w:r>
-      <w:r>
-        <w:rPr>
-          <w:rFonts w:ascii="Arial" w:hAnsi="Arial"/>
-          <w:sz w:val="24"/>
-          <w:szCs w:val="24"/>
-        </w:rPr>
-        <w:t xml:space="preserve"> detect </w:t>
-      </w:r>
-      <w:r>
-        <w:rPr>
-          <w:rFonts w:ascii="Arial" w:hAnsi="Arial"/>
-          <w:sz w:val="24"/>
-          <w:szCs w:val="24"/>
-        </w:rPr>
-        <w:t>the social level with the most information originally encoded</w:t>
-      </w:r>
-      <w:r>
-        <w:rPr>
-          <w:rFonts w:ascii="Arial" w:hAnsi="Arial"/>
-          <w:sz w:val="24"/>
-          <w:szCs w:val="24"/>
-        </w:rPr>
-        <w:t xml:space="preserve">, even </w:t>
-      </w:r>
-      <w:r>
-        <w:rPr>
-          <w:rFonts w:ascii="Arial" w:hAnsi="Arial"/>
-          <w:sz w:val="24"/>
-          <w:szCs w:val="24"/>
-        </w:rPr>
-        <w:t>under</w:t>
-      </w:r>
-      <w:r>
-        <w:rPr>
-          <w:rFonts w:ascii="Arial" w:hAnsi="Arial"/>
-          <w:sz w:val="24"/>
-          <w:szCs w:val="24"/>
-        </w:rPr>
-        <w:t xml:space="preserve"> complex information encoding conditions and dense signaling environments.</w:t>
+        <w:jc w:val="both"/>
+        <w:rPr>
+          <w:rFonts w:ascii="Arial" w:hAnsi="Arial"/>
+          <w:sz w:val="24"/>
+          <w:szCs w:val="24"/>
+        </w:rPr>
+      </w:pPr>
+      <w:r>
+        <w:rPr>
+          <w:rFonts w:ascii="Arial" w:hAnsi="Arial"/>
+          <w:sz w:val="24"/>
+          <w:szCs w:val="24"/>
+        </w:rPr>
+        <w:lastRenderedPageBreak/>
+        <w:t>Our</w:t>
+      </w:r>
+      <w:r>
+        <w:rPr>
+          <w:rFonts w:ascii="Arial" w:hAnsi="Arial"/>
+          <w:sz w:val="24"/>
+          <w:szCs w:val="24"/>
+        </w:rPr>
+        <w:t xml:space="preserve"> work </w:t>
+      </w:r>
+      <w:r>
+        <w:rPr>
+          <w:rFonts w:ascii="Arial" w:hAnsi="Arial"/>
+          <w:sz w:val="24"/>
+          <w:szCs w:val="24"/>
+        </w:rPr>
+        <w:t>introduces</w:t>
+      </w:r>
+      <w:r>
+        <w:rPr>
+          <w:rFonts w:ascii="Arial" w:hAnsi="Arial"/>
+          <w:sz w:val="24"/>
+          <w:szCs w:val="24"/>
+        </w:rPr>
+        <w:t xml:space="preserve"> a new </w:t>
+      </w:r>
+      <w:r>
+        <w:rPr>
+          <w:rFonts w:ascii="Arial" w:hAnsi="Arial"/>
+          <w:sz w:val="24"/>
+          <w:szCs w:val="24"/>
+        </w:rPr>
+        <w:t xml:space="preserve">way </w:t>
+      </w:r>
+      <w:r>
+        <w:rPr>
+          <w:rFonts w:ascii="Arial" w:hAnsi="Arial"/>
+          <w:sz w:val="24"/>
+          <w:szCs w:val="24"/>
+        </w:rPr>
+        <w:t xml:space="preserve">of generating synthetic vocalizations through the sonification of character strings. </w:t>
+      </w:r>
+      <w:r>
+        <w:rPr>
+          <w:rFonts w:ascii="Arial" w:hAnsi="Arial"/>
+          <w:sz w:val="24"/>
+          <w:szCs w:val="24"/>
+        </w:rPr>
+        <w:t>This pipeline produces two representations of vocal identity signals: first as character strings, which can facilitate</w:t>
+      </w:r>
+      <w:r>
+        <w:rPr>
+          <w:rFonts w:ascii="Arial" w:hAnsi="Arial"/>
+          <w:sz w:val="24"/>
+          <w:szCs w:val="24"/>
+        </w:rPr>
+        <w:t xml:space="preserve"> computationally efficient</w:t>
+      </w:r>
+      <w:r>
+        <w:rPr>
+          <w:rFonts w:ascii="Arial" w:hAnsi="Arial"/>
+          <w:sz w:val="24"/>
+          <w:szCs w:val="24"/>
+        </w:rPr>
+        <w:t xml:space="preserve"> simulation</w:t>
+      </w:r>
+      <w:r>
+        <w:rPr>
+          <w:rFonts w:ascii="Arial" w:hAnsi="Arial"/>
+          <w:sz w:val="24"/>
+          <w:szCs w:val="24"/>
+        </w:rPr>
+        <w:t>-based research</w:t>
+      </w:r>
+      <w:r>
+        <w:rPr>
+          <w:rFonts w:ascii="Arial" w:hAnsi="Arial"/>
+          <w:sz w:val="24"/>
+          <w:szCs w:val="24"/>
+        </w:rPr>
+        <w:t>, as well as audio files, which can be used in</w:t>
+      </w:r>
+      <w:r>
+        <w:rPr>
+          <w:rFonts w:ascii="Arial" w:hAnsi="Arial"/>
+          <w:sz w:val="24"/>
+          <w:szCs w:val="24"/>
+        </w:rPr>
+        <w:t xml:space="preserve"> empirical </w:t>
+      </w:r>
+      <w:r>
+        <w:rPr>
+          <w:rFonts w:ascii="Arial" w:hAnsi="Arial"/>
+          <w:sz w:val="24"/>
+          <w:szCs w:val="24"/>
+        </w:rPr>
+        <w:t>experiments</w:t>
+      </w:r>
+      <w:r>
+        <w:rPr>
+          <w:rFonts w:ascii="Arial" w:hAnsi="Arial"/>
+          <w:sz w:val="24"/>
+          <w:szCs w:val="24"/>
+        </w:rPr>
+        <w:t xml:space="preserve"> with animals</w:t>
+      </w:r>
+      <w:r>
+        <w:rPr>
+          <w:rFonts w:ascii="Arial" w:hAnsi="Arial"/>
+          <w:sz w:val="24"/>
+          <w:szCs w:val="24"/>
+        </w:rPr>
+        <w:t xml:space="preserve">. </w:t>
+      </w:r>
+      <w:r>
+        <w:rPr>
+          <w:rFonts w:ascii="Arial" w:hAnsi="Arial"/>
+          <w:sz w:val="24"/>
+          <w:szCs w:val="24"/>
+        </w:rPr>
+        <w:t>Moreover, we</w:t>
+      </w:r>
+      <w:r>
+        <w:rPr>
+          <w:rFonts w:ascii="Arial" w:hAnsi="Arial"/>
+          <w:sz w:val="24"/>
+          <w:szCs w:val="24"/>
+        </w:rPr>
+        <w:t xml:space="preserve"> highlight how these synthetic vocalizations can be </w:t>
+      </w:r>
+      <w:r>
+        <w:rPr>
+          <w:rFonts w:ascii="Arial" w:hAnsi="Arial"/>
+          <w:sz w:val="24"/>
+          <w:szCs w:val="24"/>
+        </w:rPr>
+        <w:t xml:space="preserve">used </w:t>
+      </w:r>
+      <w:r>
+        <w:rPr>
+          <w:rFonts w:ascii="Arial" w:hAnsi="Arial"/>
+          <w:sz w:val="24"/>
+          <w:szCs w:val="24"/>
+        </w:rPr>
+        <w:t xml:space="preserve">to test the performance of </w:t>
+      </w:r>
+      <w:r>
+        <w:rPr>
+          <w:rFonts w:ascii="Arial" w:hAnsi="Arial"/>
+          <w:sz w:val="24"/>
+          <w:szCs w:val="24"/>
+        </w:rPr>
+        <w:t xml:space="preserve">a </w:t>
+      </w:r>
+      <w:r>
+        <w:rPr>
+          <w:rFonts w:ascii="Arial" w:hAnsi="Arial"/>
+          <w:sz w:val="24"/>
+          <w:szCs w:val="24"/>
+        </w:rPr>
+        <w:t xml:space="preserve">computational tool used widely in </w:t>
+      </w:r>
+      <w:r>
+        <w:rPr>
+          <w:rFonts w:ascii="Arial" w:hAnsi="Arial"/>
+          <w:sz w:val="24"/>
+          <w:szCs w:val="24"/>
+        </w:rPr>
+        <w:t>ecology and evolution</w:t>
+      </w:r>
+      <w:r>
+        <w:rPr>
+          <w:rFonts w:ascii="Arial" w:hAnsi="Arial"/>
+          <w:sz w:val="24"/>
+          <w:szCs w:val="24"/>
+        </w:rPr>
+        <w:t xml:space="preserve"> for decades</w:t>
+      </w:r>
+      <w:r>
+        <w:rPr>
+          <w:rFonts w:ascii="Arial" w:hAnsi="Arial"/>
+          <w:sz w:val="24"/>
+          <w:szCs w:val="24"/>
+        </w:rPr>
+        <w:t>.</w:t>
       </w:r>
       <w:r>
         <w:rPr>
@@ -1058,178 +1419,21 @@
         </w:rPr>
         <w:t xml:space="preserve"> </w:t>
       </w:r>
-      <w:ins w:id="0" w:author="Coppinger, Brittany" w:date="2025-08-21T11:50:00Z" w16du:dateUtc="2025-08-21T15:50:00Z">
-        <w:r>
-          <w:rPr>
-            <w:rFonts w:ascii="Arial" w:hAnsi="Arial"/>
-            <w:sz w:val="24"/>
-            <w:szCs w:val="24"/>
-          </w:rPr>
-          <w:t xml:space="preserve">This manuscript presents </w:t>
-        </w:r>
-        <w:r>
-          <w:rPr>
-            <w:rFonts w:ascii="Arial" w:hAnsi="Arial"/>
-            <w:sz w:val="24"/>
-            <w:szCs w:val="24"/>
-          </w:rPr>
-          <w:lastRenderedPageBreak/>
-          <w:t>several novel advances in the field. For one, our generative pipeline represents the first use of Parsons code to encode</w:t>
-        </w:r>
-      </w:ins>
-      <w:ins w:id="1" w:author="Coppinger, Brittany" w:date="2025-08-21T11:52:00Z" w16du:dateUtc="2025-08-21T15:52:00Z">
-        <w:r>
-          <w:rPr>
-            <w:rFonts w:ascii="Arial" w:hAnsi="Arial"/>
-            <w:sz w:val="24"/>
-            <w:szCs w:val="24"/>
-          </w:rPr>
-          <w:t xml:space="preserve"> </w:t>
-        </w:r>
-      </w:ins>
-      <w:ins w:id="2" w:author="Coppinger, Brittany" w:date="2025-08-21T11:51:00Z" w16du:dateUtc="2025-08-21T15:51:00Z">
-        <w:r>
-          <w:rPr>
-            <w:rFonts w:ascii="Arial" w:hAnsi="Arial"/>
-            <w:sz w:val="24"/>
-            <w:szCs w:val="24"/>
-          </w:rPr>
-          <w:t xml:space="preserve">information </w:t>
-        </w:r>
-      </w:ins>
-      <w:ins w:id="3" w:author="Coppinger, Brittany" w:date="2025-08-21T11:50:00Z" w16du:dateUtc="2025-08-21T15:50:00Z">
-        <w:r>
-          <w:rPr>
-            <w:rFonts w:ascii="Arial" w:hAnsi="Arial"/>
-            <w:sz w:val="24"/>
-            <w:szCs w:val="24"/>
-          </w:rPr>
-          <w:t xml:space="preserve">in </w:t>
-        </w:r>
-      </w:ins>
-      <w:ins w:id="4" w:author="Coppinger, Brittany" w:date="2025-08-21T11:52:00Z" w16du:dateUtc="2025-08-21T15:52:00Z">
-        <w:r>
-          <w:rPr>
-            <w:rFonts w:ascii="Arial" w:hAnsi="Arial"/>
-            <w:sz w:val="24"/>
-            <w:szCs w:val="24"/>
-          </w:rPr>
-          <w:t>acoustic structures that we know animals use to communicate information about their identities</w:t>
-        </w:r>
-      </w:ins>
-      <w:ins w:id="5" w:author="Coppinger, Brittany" w:date="2025-08-21T11:50:00Z" w16du:dateUtc="2025-08-21T15:50:00Z">
-        <w:r>
-          <w:rPr>
-            <w:rFonts w:ascii="Arial" w:hAnsi="Arial"/>
-            <w:sz w:val="24"/>
-            <w:szCs w:val="24"/>
-          </w:rPr>
-          <w:t>. Additionally,</w:t>
-        </w:r>
-      </w:ins>
-      <w:ins w:id="6" w:author="Coppinger, Brittany" w:date="2025-08-21T11:53:00Z" w16du:dateUtc="2025-08-21T15:53:00Z">
-        <w:r>
-          <w:rPr>
-            <w:rFonts w:ascii="Arial" w:hAnsi="Arial"/>
-            <w:sz w:val="24"/>
-            <w:szCs w:val="24"/>
-          </w:rPr>
-          <w:t xml:space="preserve"> this is the first time a step like this has been taken to leverage synthetic datasets to test the performance of computation</w:t>
-        </w:r>
-      </w:ins>
-      <w:ins w:id="7" w:author="Coppinger, Brittany" w:date="2025-08-21T11:54:00Z" w16du:dateUtc="2025-08-21T15:54:00Z">
-        <w:r>
-          <w:rPr>
-            <w:rFonts w:ascii="Arial" w:hAnsi="Arial"/>
-            <w:sz w:val="24"/>
-            <w:szCs w:val="24"/>
-          </w:rPr>
-          <w:t>al</w:t>
-        </w:r>
-      </w:ins>
-      <w:ins w:id="8" w:author="Coppinger, Brittany" w:date="2025-08-21T11:53:00Z" w16du:dateUtc="2025-08-21T15:53:00Z">
-        <w:r>
-          <w:rPr>
-            <w:rFonts w:ascii="Arial" w:hAnsi="Arial"/>
-            <w:sz w:val="24"/>
-            <w:szCs w:val="24"/>
-          </w:rPr>
-          <w:t xml:space="preserve"> tools that have been used widely in the f</w:t>
-        </w:r>
-      </w:ins>
-      <w:ins w:id="9" w:author="Coppinger, Brittany" w:date="2025-08-21T11:54:00Z" w16du:dateUtc="2025-08-21T15:54:00Z">
-        <w:r>
-          <w:rPr>
-            <w:rFonts w:ascii="Arial" w:hAnsi="Arial"/>
-            <w:sz w:val="24"/>
-            <w:szCs w:val="24"/>
-          </w:rPr>
-          <w:t>ield of bioacoustics for decades.</w:t>
-        </w:r>
-      </w:ins>
-      <w:ins w:id="10" w:author="Coppinger, Brittany" w:date="2025-08-21T11:51:00Z" w16du:dateUtc="2025-08-21T15:51:00Z">
-        <w:r>
-          <w:rPr>
-            <w:rFonts w:ascii="Arial" w:hAnsi="Arial"/>
-            <w:sz w:val="24"/>
-            <w:szCs w:val="24"/>
-          </w:rPr>
-          <w:t xml:space="preserve"> </w:t>
-        </w:r>
-      </w:ins>
-      <w:ins w:id="11" w:author="Coppinger, Brittany" w:date="2025-08-21T11:55:00Z" w16du:dateUtc="2025-08-21T15:55:00Z">
-        <w:r>
-          <w:rPr>
-            <w:rFonts w:ascii="Arial" w:hAnsi="Arial"/>
-            <w:sz w:val="24"/>
-            <w:szCs w:val="24"/>
-          </w:rPr>
-          <w:t xml:space="preserve">Through our work, we have developed a method for using computationally efficient representations of vocal signals that allows for advances in exciting new directions for empirical research with animals as well as </w:t>
-        </w:r>
-        <w:proofErr w:type="gramStart"/>
-        <w:r>
-          <w:rPr>
-            <w:rFonts w:ascii="Arial" w:hAnsi="Arial"/>
-            <w:sz w:val="24"/>
-            <w:szCs w:val="24"/>
-          </w:rPr>
-          <w:t>simulation based</w:t>
-        </w:r>
-        <w:proofErr w:type="gramEnd"/>
-        <w:r>
-          <w:rPr>
-            <w:rFonts w:ascii="Arial" w:hAnsi="Arial"/>
-            <w:sz w:val="24"/>
-            <w:szCs w:val="24"/>
-          </w:rPr>
-          <w:t xml:space="preserve"> research, including </w:t>
-        </w:r>
-        <w:proofErr w:type="gramStart"/>
-        <w:r>
-          <w:rPr>
-            <w:rFonts w:ascii="Arial" w:hAnsi="Arial"/>
-            <w:sz w:val="24"/>
-            <w:szCs w:val="24"/>
-          </w:rPr>
-          <w:t>agent based</w:t>
-        </w:r>
-        <w:proofErr w:type="gramEnd"/>
-        <w:r>
-          <w:rPr>
-            <w:rFonts w:ascii="Arial" w:hAnsi="Arial"/>
-            <w:sz w:val="24"/>
-            <w:szCs w:val="24"/>
-          </w:rPr>
-          <w:t xml:space="preserve"> modeling. </w:t>
-        </w:r>
-      </w:ins>
-      <w:r>
-        <w:rPr>
-          <w:rFonts w:ascii="Arial" w:hAnsi="Arial"/>
-          <w:sz w:val="24"/>
-          <w:szCs w:val="24"/>
-        </w:rPr>
-        <w:t xml:space="preserve">This </w:t>
+      <w:r>
+        <w:rPr>
+          <w:rFonts w:ascii="Arial" w:hAnsi="Arial"/>
+          <w:sz w:val="24"/>
+          <w:szCs w:val="24"/>
+        </w:rPr>
+        <w:t>We anticipate that this</w:t>
+      </w:r>
+      <w:r>
+        <w:rPr>
+          <w:rFonts w:ascii="Arial" w:hAnsi="Arial"/>
+          <w:sz w:val="24"/>
+          <w:szCs w:val="24"/>
+        </w:rPr>
+        <w:t xml:space="preserve"> </w:t>
       </w:r>
       <w:r>
         <w:rPr>
@@ -1261,7 +1465,7 @@
           <w:sz w:val="24"/>
           <w:szCs w:val="24"/>
         </w:rPr>
-        <w:t>apply computational approaches to</w:t>
+        <w:t>apply computational approaches</w:t>
       </w:r>
       <w:r>
         <w:rPr>
@@ -1277,7 +1481,7 @@
           <w:sz w:val="24"/>
           <w:szCs w:val="24"/>
         </w:rPr>
-        <w:t xml:space="preserve">bioacoustics datasets to address wide-ranging questions </w:t>
+        <w:t xml:space="preserve">to address wide-ranging questions </w:t>
       </w:r>
       <w:r>
         <w:rPr>
@@ -1293,7 +1497,23 @@
           <w:sz w:val="24"/>
           <w:szCs w:val="24"/>
         </w:rPr>
-        <w:t xml:space="preserve"> animal behavior and communication in ecology, evolution, and neuroscience</w:t>
+        <w:t xml:space="preserve"> animal behavior in ecology</w:t>
+      </w:r>
+      <w:r>
+        <w:rPr>
+          <w:rFonts w:ascii="Arial" w:hAnsi="Arial"/>
+          <w:sz w:val="24"/>
+          <w:szCs w:val="24"/>
+        </w:rPr>
+        <w:t xml:space="preserve"> and </w:t>
+      </w:r>
+      <w:r>
+        <w:rPr>
+          <w:rFonts w:ascii="Arial" w:hAnsi="Arial"/>
+          <w:sz w:val="24"/>
+          <w:szCs w:val="24"/>
+        </w:rPr>
+        <w:t>evolution</w:t>
       </w:r>
       <w:r>
         <w:rPr>
@@ -1388,12 +1608,19 @@
       <w:pPr>
         <w:spacing w:after="0"/>
         <w:rPr>
-          <w:del w:id="12" w:author="Coppinger, Brittany" w:date="2025-08-21T11:57:00Z" w16du:dateUtc="2025-08-21T15:57:00Z"/>
-          <w:rFonts w:ascii="Arial" w:hAnsi="Arial"/>
-          <w:sz w:val="24"/>
-          <w:szCs w:val="24"/>
-        </w:rPr>
-      </w:pPr>
+          <w:rFonts w:ascii="Arial" w:hAnsi="Arial"/>
+          <w:sz w:val="24"/>
+          <w:szCs w:val="24"/>
+        </w:rPr>
+      </w:pPr>
+      <w:r>
+        <w:rPr>
+          <w:rFonts w:ascii="Arial" w:hAnsi="Arial"/>
+          <w:sz w:val="24"/>
+          <w:szCs w:val="24"/>
+        </w:rPr>
+        <w:t>Grace Smith-Vidaurre</w:t>
+      </w:r>
     </w:p>
     <w:p>
       <w:pPr>
@@ -1404,14 +1631,6 @@
           <w:szCs w:val="24"/>
         </w:rPr>
       </w:pPr>
-      <w:r>
-        <w:rPr>
-          <w:rFonts w:ascii="Arial" w:hAnsi="Arial"/>
-          <w:sz w:val="24"/>
-          <w:szCs w:val="24"/>
-        </w:rPr>
-        <w:t>Grace Smith-Vidaurre</w:t>
-      </w:r>
     </w:p>
     <w:p>
       <w:pPr>
@@ -1422,6 +1641,14 @@
           <w:szCs w:val="24"/>
         </w:rPr>
       </w:pPr>
+      <w:r>
+        <w:rPr>
+          <w:rFonts w:ascii="Arial" w:hAnsi="Arial"/>
+          <w:sz w:val="24"/>
+          <w:szCs w:val="24"/>
+        </w:rPr>
+        <w:t>1855 Assistant Professor</w:t>
+      </w:r>
     </w:p>
     <w:p>
       <w:pPr>
@@ -1438,7 +1665,7 @@
           <w:sz w:val="24"/>
           <w:szCs w:val="24"/>
         </w:rPr>
-        <w:t>1855 Assistant Professor</w:t>
+        <w:t>Department of Integrative Biology</w:t>
       </w:r>
     </w:p>
     <w:p>
@@ -1456,7 +1683,7 @@
           <w:sz w:val="24"/>
           <w:szCs w:val="24"/>
         </w:rPr>
-        <w:t>Department of Integrative Biology</w:t>
+        <w:t>Department of Computational Mathematics, Science, and Engineering</w:t>
       </w:r>
     </w:p>
     <w:p>
@@ -1474,7 +1701,7 @@
           <w:sz w:val="24"/>
           <w:szCs w:val="24"/>
         </w:rPr>
-        <w:t>Department of Computational Mathematics, Science, and Engineering</w:t>
+        <w:t>Ecology, Evolution, and Behavior Program</w:t>
       </w:r>
     </w:p>
     <w:p>
@@ -1492,7 +1719,7 @@
           <w:sz w:val="24"/>
           <w:szCs w:val="24"/>
         </w:rPr>
-        <w:t>Ecology, Evolution, and Behavior Program</w:t>
+        <w:t>Michigan State University</w:t>
       </w:r>
     </w:p>
     <w:p>
@@ -1504,43 +1731,13 @@
           <w:szCs w:val="24"/>
         </w:rPr>
       </w:pPr>
-      <w:r>
-        <w:rPr>
-          <w:rFonts w:ascii="Arial" w:hAnsi="Arial"/>
-          <w:sz w:val="24"/>
-          <w:szCs w:val="24"/>
-        </w:rPr>
-        <w:t>Michigan State University</w:t>
-      </w:r>
     </w:p>
     <w:p>
       <w:pPr>
         <w:spacing w:after="0"/>
         <w:rPr>
           <w:rFonts w:ascii="Arial" w:hAnsi="Arial"/>
-          <w:sz w:val="24"/>
-          <w:szCs w:val="24"/>
-        </w:rPr>
-      </w:pPr>
-    </w:p>
-    <w:p>
-      <w:pPr>
-        <w:spacing w:after="0"/>
-        <w:rPr>
-          <w:del w:id="13" w:author="Coppinger, Brittany" w:date="2025-08-21T11:57:00Z" w16du:dateUtc="2025-08-21T15:57:00Z"/>
-          <w:rFonts w:ascii="Arial" w:hAnsi="Arial"/>
-          <w:sz w:val="24"/>
-          <w:szCs w:val="24"/>
-        </w:rPr>
-      </w:pPr>
-    </w:p>
-    <w:p>
-      <w:pPr>
-        <w:spacing w:after="0"/>
-        <w:rPr>
-          <w:rFonts w:ascii="Arial" w:hAnsi="Arial"/>
-          <w:sz w:val="24"/>
-          <w:szCs w:val="24"/>
+          <w:u w:val="single"/>
         </w:rPr>
       </w:pPr>
     </w:p>
@@ -1672,7 +1869,7 @@
     </w:p>
     <w:p>
       <w:pPr>
-        <w:spacing w:after="0"/>
+        <w:spacing w:after="160"/>
         <w:rPr>
           <w:rFonts w:ascii="Arial" w:hAnsi="Arial"/>
           <w:sz w:val="24"/>
@@ -1696,51 +1893,59 @@
         <w:spacing w:after="0"/>
         <w:rPr>
           <w:rFonts w:ascii="Arial" w:hAnsi="Arial"/>
-          <w:sz w:val="24"/>
-          <w:szCs w:val="24"/>
-        </w:rPr>
-      </w:pPr>
+          <w:b/>
+          <w:bCs/>
+          <w:sz w:val="24"/>
+          <w:szCs w:val="24"/>
+        </w:rPr>
+      </w:pPr>
+      <w:r>
+        <w:rPr>
+          <w:rFonts w:ascii="Arial" w:hAnsi="Arial"/>
+          <w:b/>
+          <w:bCs/>
+          <w:sz w:val="24"/>
+          <w:szCs w:val="24"/>
+        </w:rPr>
+        <w:t>A</w:t>
+      </w:r>
+      <w:r>
+        <w:rPr>
+          <w:rFonts w:ascii="Arial" w:hAnsi="Arial"/>
+          <w:b/>
+          <w:bCs/>
+          <w:sz w:val="24"/>
+          <w:szCs w:val="24"/>
+        </w:rPr>
+        <w:t>n</w:t>
+      </w:r>
+      <w:r>
+        <w:rPr>
+          <w:rFonts w:ascii="Arial" w:hAnsi="Arial"/>
+          <w:b/>
+          <w:bCs/>
+          <w:sz w:val="24"/>
+          <w:szCs w:val="24"/>
+        </w:rPr>
+        <w:t>drey Anikin</w:t>
+      </w:r>
     </w:p>
     <w:p>
       <w:pPr>
         <w:spacing w:after="0"/>
         <w:rPr>
           <w:rFonts w:ascii="Arial" w:hAnsi="Arial"/>
-          <w:b/>
-          <w:bCs/>
-          <w:sz w:val="24"/>
-          <w:szCs w:val="24"/>
-        </w:rPr>
-      </w:pPr>
-      <w:r>
-        <w:rPr>
-          <w:rFonts w:ascii="Arial" w:hAnsi="Arial"/>
-          <w:b/>
-          <w:bCs/>
-          <w:sz w:val="24"/>
-          <w:szCs w:val="24"/>
-        </w:rPr>
-        <w:t>A</w:t>
-      </w:r>
-      <w:r>
-        <w:rPr>
-          <w:rFonts w:ascii="Arial" w:hAnsi="Arial"/>
-          <w:b/>
-          <w:bCs/>
-          <w:sz w:val="24"/>
-          <w:szCs w:val="24"/>
-        </w:rPr>
-        <w:t>n</w:t>
-      </w:r>
-      <w:r>
-        <w:rPr>
-          <w:rFonts w:ascii="Arial" w:hAnsi="Arial"/>
-          <w:b/>
-          <w:bCs/>
-          <w:sz w:val="24"/>
-          <w:szCs w:val="24"/>
-        </w:rPr>
-        <w:t>drey Anikin</w:t>
+          <w:sz w:val="24"/>
+          <w:szCs w:val="24"/>
+        </w:rPr>
+      </w:pPr>
+      <w:r>
+        <w:rPr>
+          <w:rFonts w:ascii="Arial" w:hAnsi="Arial"/>
+          <w:sz w:val="24"/>
+          <w:szCs w:val="24"/>
+        </w:rPr>
+        <w:t>Associate Professor</w:t>
       </w:r>
     </w:p>
     <w:p>
@@ -1748,17 +1953,21 @@
         <w:spacing w:after="0"/>
         <w:rPr>
           <w:rFonts w:ascii="Arial" w:hAnsi="Arial"/>
-          <w:sz w:val="24"/>
-          <w:szCs w:val="24"/>
-        </w:rPr>
-      </w:pPr>
-      <w:r>
-        <w:rPr>
-          <w:rFonts w:ascii="Arial" w:hAnsi="Arial"/>
-          <w:sz w:val="24"/>
-          <w:szCs w:val="24"/>
-        </w:rPr>
-        <w:t>Associate Professor</w:t>
+          <w:color w:val="000000"/>
+          <w:sz w:val="24"/>
+          <w:szCs w:val="24"/>
+          <w:shd w:val="clear" w:color="auto" w:fill="FFFFFF"/>
+        </w:rPr>
+      </w:pPr>
+      <w:r>
+        <w:rPr>
+          <w:rFonts w:ascii="Arial" w:hAnsi="Arial"/>
+          <w:color w:val="000000"/>
+          <w:sz w:val="24"/>
+          <w:szCs w:val="24"/>
+          <w:shd w:val="clear" w:color="auto" w:fill="FFFFFF"/>
+        </w:rPr>
+        <w:t xml:space="preserve">Department of Philosophy </w:t>
       </w:r>
     </w:p>
     <w:p>
@@ -1780,7 +1989,7 @@
           <w:szCs w:val="24"/>
           <w:shd w:val="clear" w:color="auto" w:fill="FFFFFF"/>
         </w:rPr>
-        <w:t>Department of Philosophy</w:t>
+        <w:t>Lund University Cognitive Science</w:t>
       </w:r>
       <w:r>
         <w:rPr>
@@ -1790,80 +1999,46 @@
           <w:szCs w:val="24"/>
           <w:shd w:val="clear" w:color="auto" w:fill="FFFFFF"/>
         </w:rPr>
+        <w:t>,</w:t>
+      </w:r>
+      <w:r>
+        <w:rPr>
+          <w:rFonts w:ascii="Arial" w:hAnsi="Arial"/>
+          <w:color w:val="000000"/>
+          <w:sz w:val="24"/>
+          <w:szCs w:val="24"/>
+          <w:shd w:val="clear" w:color="auto" w:fill="FFFFFF"/>
+        </w:rPr>
         <w:t xml:space="preserve"> </w:t>
+      </w:r>
+      <w:r>
+        <w:rPr>
+          <w:rFonts w:ascii="Arial" w:hAnsi="Arial"/>
+          <w:color w:val="000000"/>
+          <w:sz w:val="24"/>
+          <w:szCs w:val="24"/>
+          <w:shd w:val="clear" w:color="auto" w:fill="FFFFFF"/>
+        </w:rPr>
+        <w:t xml:space="preserve">Lund, </w:t>
+      </w:r>
+      <w:r>
+        <w:rPr>
+          <w:rFonts w:ascii="Arial" w:hAnsi="Arial"/>
+          <w:color w:val="000000"/>
+          <w:sz w:val="24"/>
+          <w:szCs w:val="24"/>
+          <w:shd w:val="clear" w:color="auto" w:fill="FFFFFF"/>
+        </w:rPr>
+        <w:t>Sweden</w:t>
       </w:r>
     </w:p>
     <w:p>
       <w:pPr>
-        <w:spacing w:after="0"/>
-        <w:rPr>
-          <w:rFonts w:ascii="Arial" w:hAnsi="Arial"/>
-          <w:color w:val="000000"/>
-          <w:sz w:val="24"/>
-          <w:szCs w:val="24"/>
-          <w:shd w:val="clear" w:color="auto" w:fill="FFFFFF"/>
-        </w:rPr>
-      </w:pPr>
-      <w:r>
-        <w:rPr>
-          <w:rFonts w:ascii="Arial" w:hAnsi="Arial"/>
-          <w:color w:val="000000"/>
-          <w:sz w:val="24"/>
-          <w:szCs w:val="24"/>
-          <w:shd w:val="clear" w:color="auto" w:fill="FFFFFF"/>
-        </w:rPr>
-        <w:t>Lund University Cognitive Science</w:t>
-      </w:r>
-      <w:r>
-        <w:rPr>
-          <w:rFonts w:ascii="Arial" w:hAnsi="Arial"/>
-          <w:color w:val="000000"/>
-          <w:sz w:val="24"/>
-          <w:szCs w:val="24"/>
-          <w:shd w:val="clear" w:color="auto" w:fill="FFFFFF"/>
-        </w:rPr>
-        <w:t>,</w:t>
-      </w:r>
-      <w:r>
-        <w:rPr>
-          <w:rFonts w:ascii="Arial" w:hAnsi="Arial"/>
-          <w:color w:val="000000"/>
-          <w:sz w:val="24"/>
-          <w:szCs w:val="24"/>
-          <w:shd w:val="clear" w:color="auto" w:fill="FFFFFF"/>
-        </w:rPr>
-        <w:t xml:space="preserve"> </w:t>
-      </w:r>
-      <w:r>
-        <w:rPr>
-          <w:rFonts w:ascii="Arial" w:hAnsi="Arial"/>
-          <w:color w:val="000000"/>
-          <w:sz w:val="24"/>
-          <w:szCs w:val="24"/>
-          <w:shd w:val="clear" w:color="auto" w:fill="FFFFFF"/>
-        </w:rPr>
-        <w:t xml:space="preserve">Lund, </w:t>
-      </w:r>
-      <w:r>
-        <w:rPr>
-          <w:rFonts w:ascii="Arial" w:hAnsi="Arial"/>
-          <w:color w:val="000000"/>
-          <w:sz w:val="24"/>
-          <w:szCs w:val="24"/>
-          <w:shd w:val="clear" w:color="auto" w:fill="FFFFFF"/>
-        </w:rPr>
-        <w:t>Sweden</w:t>
-      </w:r>
-    </w:p>
-    <w:p>
-      <w:pPr>
-        <w:spacing w:after="0"/>
-        <w:rPr>
-          <w:rFonts w:ascii="Arial" w:hAnsi="Arial"/>
-          <w:color w:val="000000"/>
-          <w:sz w:val="24"/>
-          <w:szCs w:val="24"/>
-          <w:shd w:val="clear" w:color="auto" w:fill="FFFFFF"/>
+        <w:spacing w:after="160"/>
+        <w:rPr>
+          <w:rFonts w:ascii="Arial" w:hAnsi="Arial"/>
+          <w:sz w:val="24"/>
+          <w:szCs w:val="24"/>
         </w:rPr>
       </w:pPr>
       <w:hyperlink r:id="rId10" w:history="1">
@@ -1884,16 +2059,6 @@
         <w:spacing w:after="0"/>
         <w:rPr>
           <w:rFonts w:ascii="Arial" w:hAnsi="Arial"/>
-          <w:sz w:val="24"/>
-          <w:szCs w:val="24"/>
-        </w:rPr>
-      </w:pPr>
-    </w:p>
-    <w:p>
-      <w:pPr>
-        <w:spacing w:after="0"/>
-        <w:rPr>
-          <w:rFonts w:ascii="Arial" w:hAnsi="Arial"/>
           <w:b/>
           <w:bCs/>
           <w:sz w:val="24"/>
@@ -2001,16 +2166,6 @@
           <w:t>masonyoungblood@gmail.com</w:t>
         </w:r>
       </w:hyperlink>
-    </w:p>
-    <w:p>
-      <w:pPr>
-        <w:spacing w:after="0"/>
-        <w:rPr>
-          <w:rFonts w:ascii="Arial" w:hAnsi="Arial"/>
-          <w:sz w:val="24"/>
-          <w:szCs w:val="24"/>
-        </w:rPr>
-      </w:pPr>
     </w:p>
     <w:sectPr>
       <w:headerReference w:type="first" r:id="rId12"/>
@@ -2279,6 +2434,7 @@
                             <w:jc w:val="right"/>
                             <w:textAlignment w:val="center"/>
                             <w:rPr>
+                              <w:ins w:id="0" w:author="Smith Vidaurre, Grace" w:date="2025-08-25T12:01:00Z" w16du:dateUtc="2025-08-25T16:01:00Z"/>
                               <w:rFonts w:ascii="Arial" w:hAnsi="Arial"/>
                               <w:b/>
                               <w:bCs/>
@@ -2305,7 +2461,18 @@
                               <w:spacing w:val="1"/>
                             </w:rPr>
                             <w:br/>
-                            <w:t>Arts &amp; Letters</w:t>
+                          </w:r>
+                          <w:r>
+                            <w:rPr>
+                              <w:rFonts w:ascii="Arial" w:hAnsi="Arial"/>
+                              <w:b/>
+                              <w:bCs/>
+                              <w:color w:val="000000"/>
+                              <w:spacing w:val="1"/>
+                              <w:sz w:val="24"/>
+                              <w:szCs w:val="24"/>
+                            </w:rPr>
+                            <w:t>Natural Sciences</w:t>
                           </w:r>
                         </w:p>
                         <w:p>
@@ -2644,7 +2811,7 @@
               <v:stroke joinstyle="miter"/>
               <v:path gradientshapeok="t" o:connecttype="rect"/>
             </v:shapetype>
-            <v:shape id="Text Box 1" o:spid="_x0000_s1026" type="#_x0000_t202" style="position:absolute;margin-left:17.3pt;margin-top:462.25pt;width:90pt;height:237.35pt;z-index:251657728;visibility:visible;mso-wrap-style:square;mso-width-percent:0;mso-height-percent:0;mso-wrap-distance-left:9pt;mso-wrap-distance-top:0;mso-wrap-distance-right:9pt;mso-wrap-distance-bottom:0;mso-position-horizontal:absolute;mso-position-horizontal-relative:page;mso-position-vertical:absolute;mso-position-vertical-relative:page;mso-width-percent:0;mso-height-percent:0;mso-width-relative:page;mso-height-relative:page;v-text-anchor:top" o:gfxdata="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" o:allowoverlap="f" filled="f" stroked="f">
+            <v:shape id="Text Box 1" o:spid="_x0000_s1026" type="#_x0000_t202" style="position:absolute;margin-left:17.3pt;margin-top:462.25pt;width:90pt;height:237.35pt;z-index:251657728;visibility:visible;mso-wrap-style:square;mso-width-percent:0;mso-height-percent:0;mso-wrap-distance-left:9pt;mso-wrap-distance-top:0;mso-wrap-distance-right:9pt;mso-wrap-distance-bottom:0;mso-position-horizontal:absolute;mso-position-horizontal-relative:page;mso-position-vertical:absolute;mso-position-vertical-relative:page;mso-width-percent:0;mso-height-percent:0;mso-width-relative:page;mso-height-relative:page;v-text-anchor:top" o:gfxdata="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" o:allowoverlap="f" filled="f" stroked="f">
               <v:textbox inset="0,0,0,0">
                 <w:txbxContent>
                   <w:p>
@@ -2657,6 +2824,7 @@
                       <w:jc w:val="right"/>
                       <w:textAlignment w:val="center"/>
                       <w:rPr>
+                        <w:ins w:id="1" w:author="Smith Vidaurre, Grace" w:date="2025-08-25T12:01:00Z" w16du:dateUtc="2025-08-25T16:01:00Z"/>
                         <w:rFonts w:ascii="Arial" w:hAnsi="Arial"/>
                         <w:b/>
                         <w:bCs/>
@@ -2683,7 +2851,18 @@
                         <w:spacing w:val="1"/>
                       </w:rPr>
                       <w:br/>
-                      <w:t>Arts &amp; Letters</w:t>
+                    </w:r>
+                    <w:r>
+                      <w:rPr>
+                        <w:rFonts w:ascii="Arial" w:hAnsi="Arial"/>
+                        <w:b/>
+                        <w:bCs/>
+                        <w:color w:val="000000"/>
+                        <w:spacing w:val="1"/>
+                        <w:sz w:val="24"/>
+                        <w:szCs w:val="24"/>
+                      </w:rPr>
+                      <w:t>Natural Sciences</w:t>
                     </w:r>
                   </w:p>
                   <w:p>
@@ -2851,8 +3030,19 @@
                         <w:sz w:val="14"/>
                         <w:szCs w:val="14"/>
                       </w:rPr>
-                      <w:t>Natural Science Bldg</w:t>
+                      <w:t xml:space="preserve">Natural Science </w:t>
                     </w:r>
+                    <w:proofErr w:type="spellStart"/>
+                    <w:r>
+                      <w:rPr>
+                        <w:rFonts w:ascii="Arial" w:hAnsi="Arial"/>
+                        <w:color w:val="000000"/>
+                        <w:sz w:val="14"/>
+                        <w:szCs w:val="14"/>
+                      </w:rPr>
+                      <w:t>Bldg</w:t>
+                    </w:r>
+                    <w:proofErr w:type="spellEnd"/>
                   </w:p>
                   <w:p>
                     <w:pPr>
@@ -3424,8 +3614,8 @@
 
 <file path=word/people.xml><?xml version="1.0" encoding="utf-8"?>
 <w15:people xmlns:wpc="http://schemas.microsoft.com/office/word/2010/wordprocessingCanvas" xmlns:cx="http://schemas.microsoft.com/office/drawing/2014/chartex" xmlns:cx1="http://schemas.microsoft.com/office/drawing/2015/9/8/chartex" xmlns:cx2="http://schemas.microsoft.com/office/drawing/2015/10/21/chartex" xmlns:cx3="http://schemas.microsoft.com/office/drawing/2016/5/9/chartex" xmlns:cx4="http://schemas.microsoft.com/office/drawing/2016/5/10/chartex" xmlns:cx5="http://schemas.microsoft.com/office/drawing/2016/5/11/chartex" xmlns:cx6="http://schemas.microsoft.com/office/drawing/2016/5/12/chartex" xmlns:cx7="http://schemas.microsoft.com/office/drawing/2016/5/13/chartex" xmlns:cx8="http://schemas.microsoft.com/office/drawing/2016/5/14/chartex" xmlns:mc="http://schemas.openxmlformats.org/markup-compatibility/2006" xmlns:aink="http://schemas.microsoft.com/office/drawing/2016/ink" xmlns:am3d="http://schemas.microsoft.com/office/drawing/2017/model3d" xmlns:o="urn:schemas-microsoft-com:office:office" xmlns:oel="http://schemas.microsoft.com/office/2019/extlst" xmlns:r="http://schemas.openxmlformats.org/officeDocument/2006/relationships" xmlns:m="http://schemas.openxmlformats.org/officeDocument/2006/math" xmlns:v="urn:schemas-microsoft-com:vml" xmlns:wp14="http://schemas.microsoft.com/office/word/2010/wordprocessingDrawing" xmlns:wp="http://schemas.openxmlformats.org/drawingml/2006/wordprocessingDrawing" xmlns:w10="urn:schemas-microsoft-com:office:word" xmlns:w="http://schemas.openxmlformats.org/wordprocessingml/2006/main" xmlns:w14="http://schemas.microsoft.com/office/word/2010/wordml" xmlns:w15="http://schemas.microsoft.com/office/word/2012/wordml" xmlns:w16cex="http://schemas.microsoft.com/office/word/2018/wordml/cex" xmlns:w16cid="http://schemas.microsoft.com/office/word/2016/wordml/cid" xmlns:w16="http://schemas.microsoft.com/office/word/2018/wordml" xmlns:w16du="http://schemas.microsoft.com/office/word/2023/wordml/word16du" xmlns:w16sdtdh="http://schemas.microsoft.com/office/word/2020/wordml/sdtdatahash" xmlns:w16sdtfl="http://schemas.microsoft.com/office/word/2024/wordml/sdtformatlock" xmlns:w16se="http://schemas.microsoft.com/office/word/2015/wordml/symex" xmlns:wpg="http://schemas.microsoft.com/office/word/2010/wordprocessingGroup" xmlns:wpi="http://schemas.microsoft.com/office/word/2010/wordprocessingInk" xmlns:wne="http://schemas.microsoft.com/office/word/2006/wordml" xmlns:wps="http://schemas.microsoft.com/office/word/2010/wordprocessingShape" mc:Ignorable="w14 w15 w16se w16cid w16 w16cex w16sdtdh w16sdtfl w16du wp14">
-  <w15:person w15:author="Coppinger, Brittany">
-    <w15:presenceInfo w15:providerId="AD" w15:userId="S::copping7@msu.edu::91362ca3-4f6d-449f-8348-5f9a1531276e"/>
+  <w15:person w15:author="Smith Vidaurre, Grace">
+    <w15:presenceInfo w15:providerId="AD" w15:userId="S::smithvid@msu.edu::b45b673c-2200-4042-a7e9-6ccf4d81cce7"/>
   </w15:person>
 </w15:people>
 </file>

</xml_diff>